<commit_message>
docs: section-specific test chapters linked to STD IDs
- Concurrency (chapter 7) and WebSocket (chapter 5) documents now explain that
  the STD holds the full catalog and list only the tests of their section,
  with the STD ID of each test case, a claim-to-test map and the manual test
- tools/docs/section-tests.py generates these chapters from STD.md
- STD references the topic documents

Co-Authored-By: Claude Opus 5.5 <noreply@anthropic.com>
</commit_message>
<xml_diff>
--- a/docs/testing/TA9-STD.docx
+++ b/docs/testing/TA9-STD.docx
@@ -9223,6 +9223,47 @@
         <w:t xml:space="preserve">7. Automated test case catalog</w:t>
       </w:r>
       <w:bookmarkEnd w:id="15"/>
+    </w:p>
+    <w:p>
+      <w:pPr>
+        <w:spacing w:after="120"/>
+      </w:pPr>
+      <w:r>
+        <w:rPr>
+          <w:rFonts w:ascii="Calibri" w:cs="Calibri" w:eastAsia="Calibri" w:hAnsi="Calibri"/>
+        </w:rPr>
+        <w:t xml:space="preserve">Section-specific subsets of this catalog, with the same IDs, appear in the topic documents: </w:t>
+      </w:r>
+      <w:r>
+        <w:rPr>
+          <w:rFonts w:ascii="Consolas" w:cs="Consolas" w:eastAsia="Consolas" w:hAnsi="Consolas"/>
+          <w:color w:val="5B2C6F"/>
+          <w:sz w:val="19"/>
+          <w:szCs w:val="19"/>
+        </w:rPr>
+        <w:t xml:space="preserve">docs/concurrency/TA9-Concurrency-Performance.docx</w:t>
+      </w:r>
+      <w:r>
+        <w:rPr>
+          <w:rFonts w:ascii="Calibri" w:cs="Calibri" w:eastAsia="Calibri" w:hAnsi="Calibri"/>
+        </w:rPr>
+        <w:t xml:space="preserve"> (§4 Concurrency &amp; Performance, chapter 7) and </w:t>
+      </w:r>
+      <w:r>
+        <w:rPr>
+          <w:rFonts w:ascii="Consolas" w:cs="Consolas" w:eastAsia="Consolas" w:hAnsi="Consolas"/>
+          <w:color w:val="5B2C6F"/>
+          <w:sz w:val="19"/>
+          <w:szCs w:val="19"/>
+        </w:rPr>
+        <w:t xml:space="preserve">docs/websocket/TA9-WebSocket-Behavior.docx</w:t>
+      </w:r>
+      <w:r>
+        <w:rPr>
+          <w:rFonts w:ascii="Calibri" w:cs="Calibri" w:eastAsia="Calibri" w:hAnsi="Calibri"/>
+        </w:rPr>
+        <w:t xml:space="preserve"> (WebSocket disconnect/reconnect, chapter 5).</w:t>
+      </w:r>
     </w:p>
     <w:p>
       <w:pPr>

</xml_diff>

<commit_message>
refactor(storage): storage-neutral StorageUnavailableException; in-memory audit store in Infrastructure
Mongo repositories translate driver timeout/connection errors (MongoGuard), so the API
no longer references MongoDB types. Adds MongoUnavailableTests (JS-143..145) and D25.

Co-Authored-By: Claude Opus 5.5 <noreply@anthropic.com>
</commit_message>
<xml_diff>
--- a/docs/testing/TA9-STD.docx
+++ b/docs/testing/TA9-STD.docx
@@ -282,7 +282,7 @@
                 <w:sz w:val="18"/>
                 <w:szCs w:val="18"/>
               </w:rPr>
-              <w:t xml:space="preserve">275 test methods → </w:t>
+              <w:t xml:space="preserve">278 test methods → </w:t>
             </w:r>
             <w:r>
               <w:rPr>
@@ -292,7 +292,7 @@
                 <w:sz w:val="18"/>
                 <w:szCs w:val="18"/>
               </w:rPr>
-              <w:t xml:space="preserve">404 executions</w:t>
+              <w:t xml:space="preserve">407 executions</w:t>
             </w:r>
             <w:r>
               <w:rPr>
@@ -1669,36 +1669,36 @@
         </w:p>
         <w:p>
           <w:pPr>
+            <w:pStyle w:val="TOC3"/>
+            <w:tabs>
+              <w:tab w:val="right" w:pos="9638" w:leader="dot"/>
+            </w:tabs>
+          </w:pPr>
+          <w:hyperlink w:history="1" w:anchor="_Toc57">
+            <w:r>
+              <w:t xml:space="preserve">MongoUnavailableTests</w:t>
+            </w:r>
+            <w:r>
+              <w:tab/>
+            </w:r>
+            <w:r>
+              <w:fldChar w:fldCharType="begin" w:dirty="true"/>
+              <w:instrText xml:space="preserve">PAGEREF _Toc57 \h</w:instrText>
+              <w:fldChar w:fldCharType="separate"/>
+              <w:fldChar w:fldCharType="end"/>
+            </w:r>
+          </w:hyperlink>
+        </w:p>
+        <w:p>
+          <w:pPr>
             <w:pStyle w:val="TOC2"/>
             <w:tabs>
               <w:tab w:val="right" w:pos="9638" w:leader="dot"/>
             </w:tabs>
           </w:pPr>
-          <w:hyperlink w:history="1" w:anchor="_Toc57">
+          <w:hyperlink w:history="1" w:anchor="_Toc58">
             <w:r>
               <w:t xml:space="preserve">7.4 Audit Service (Ta9.AuditService.Tests)</w:t>
-            </w:r>
-            <w:r>
-              <w:tab/>
-            </w:r>
-            <w:r>
-              <w:fldChar w:fldCharType="begin" w:dirty="true"/>
-              <w:instrText xml:space="preserve">PAGEREF _Toc57 \h</w:instrText>
-              <w:fldChar w:fldCharType="separate"/>
-              <w:fldChar w:fldCharType="end"/>
-            </w:r>
-          </w:hyperlink>
-        </w:p>
-        <w:p>
-          <w:pPr>
-            <w:pStyle w:val="TOC3"/>
-            <w:tabs>
-              <w:tab w:val="right" w:pos="9638" w:leader="dot"/>
-            </w:tabs>
-          </w:pPr>
-          <w:hyperlink w:history="1" w:anchor="_Toc58">
-            <w:r>
-              <w:t xml:space="preserve">AuditApiTests</w:t>
             </w:r>
             <w:r>
               <w:tab/>
@@ -1720,7 +1720,7 @@
           </w:pPr>
           <w:hyperlink w:history="1" w:anchor="_Toc59">
             <w:r>
-              <w:t xml:space="preserve">JobAuditRequestValidatorTests</w:t>
+              <w:t xml:space="preserve">AuditApiTests</w:t>
             </w:r>
             <w:r>
               <w:tab/>
@@ -1742,7 +1742,7 @@
           </w:pPr>
           <w:hyperlink w:history="1" w:anchor="_Toc60">
             <w:r>
-              <w:t xml:space="preserve">AuditRepositoryContract</w:t>
+              <w:t xml:space="preserve">JobAuditRequestValidatorTests</w:t>
             </w:r>
             <w:r>
               <w:tab/>
@@ -1750,6 +1750,28 @@
             <w:r>
               <w:fldChar w:fldCharType="begin" w:dirty="true"/>
               <w:instrText xml:space="preserve">PAGEREF _Toc60 \h</w:instrText>
+              <w:fldChar w:fldCharType="separate"/>
+              <w:fldChar w:fldCharType="end"/>
+            </w:r>
+          </w:hyperlink>
+        </w:p>
+        <w:p>
+          <w:pPr>
+            <w:pStyle w:val="TOC3"/>
+            <w:tabs>
+              <w:tab w:val="right" w:pos="9638" w:leader="dot"/>
+            </w:tabs>
+          </w:pPr>
+          <w:hyperlink w:history="1" w:anchor="_Toc61">
+            <w:r>
+              <w:t xml:space="preserve">AuditRepositoryContract</w:t>
+            </w:r>
+            <w:r>
+              <w:tab/>
+            </w:r>
+            <w:r>
+              <w:fldChar w:fldCharType="begin" w:dirty="true"/>
+              <w:instrText xml:space="preserve">PAGEREF _Toc61 \h</w:instrText>
               <w:fldChar w:fldCharType="separate"/>
               <w:fldChar w:fldCharType="end"/>
             </w:r>
@@ -1762,7 +1784,7 @@
               <w:tab w:val="right" w:pos="9638" w:leader="dot"/>
             </w:tabs>
           </w:pPr>
-          <w:hyperlink w:history="1" w:anchor="_Toc61">
+          <w:hyperlink w:history="1" w:anchor="_Toc62">
             <w:r>
               <w:t xml:space="preserve">7.5 Cross-service integration (Ta9.IntegrationTests)</w:t>
             </w:r>
@@ -1771,7 +1793,7 @@
             </w:r>
             <w:r>
               <w:fldChar w:fldCharType="begin" w:dirty="true"/>
-              <w:instrText xml:space="preserve">PAGEREF _Toc61 \h</w:instrText>
+              <w:instrText xml:space="preserve">PAGEREF _Toc62 \h</w:instrText>
               <w:fldChar w:fldCharType="separate"/>
               <w:fldChar w:fldCharType="end"/>
             </w:r>
@@ -1784,31 +1806,9 @@
               <w:tab w:val="right" w:pos="9638" w:leader="dot"/>
             </w:tabs>
           </w:pPr>
-          <w:hyperlink w:history="1" w:anchor="_Toc62">
+          <w:hyperlink w:history="1" w:anchor="_Toc63">
             <w:r>
               <w:t xml:space="preserve">EndToEndTests</w:t>
-            </w:r>
-            <w:r>
-              <w:tab/>
-            </w:r>
-            <w:r>
-              <w:fldChar w:fldCharType="begin" w:dirty="true"/>
-              <w:instrText xml:space="preserve">PAGEREF _Toc62 \h</w:instrText>
-              <w:fldChar w:fldCharType="separate"/>
-              <w:fldChar w:fldCharType="end"/>
-            </w:r>
-          </w:hyperlink>
-        </w:p>
-        <w:p>
-          <w:pPr>
-            <w:pStyle w:val="TOC1"/>
-            <w:tabs>
-              <w:tab w:val="right" w:pos="9638" w:leader="dot"/>
-            </w:tabs>
-          </w:pPr>
-          <w:hyperlink w:history="1" w:anchor="_Toc63">
-            <w:r>
-              <w:t xml:space="preserve">8. Manual and system test procedures</w:t>
             </w:r>
             <w:r>
               <w:tab/>
@@ -1830,7 +1830,7 @@
           </w:pPr>
           <w:hyperlink w:history="1" w:anchor="_Toc64">
             <w:r>
-              <w:t xml:space="preserve">9. Defects found by testing</w:t>
+              <w:t xml:space="preserve">8. Manual and system test procedures</w:t>
             </w:r>
             <w:r>
               <w:tab/>
@@ -1852,7 +1852,7 @@
           </w:pPr>
           <w:hyperlink w:history="1" w:anchor="_Toc65">
             <w:r>
-              <w:t xml:space="preserve">10. Risks and limitations of the test approach</w:t>
+              <w:t xml:space="preserve">9. Defects found by testing</w:t>
             </w:r>
             <w:r>
               <w:tab/>
@@ -1860,6 +1860,28 @@
             <w:r>
               <w:fldChar w:fldCharType="begin" w:dirty="true"/>
               <w:instrText xml:space="preserve">PAGEREF _Toc65 \h</w:instrText>
+              <w:fldChar w:fldCharType="separate"/>
+              <w:fldChar w:fldCharType="end"/>
+            </w:r>
+          </w:hyperlink>
+        </w:p>
+        <w:p>
+          <w:pPr>
+            <w:pStyle w:val="TOC1"/>
+            <w:tabs>
+              <w:tab w:val="right" w:pos="9638" w:leader="dot"/>
+            </w:tabs>
+          </w:pPr>
+          <w:hyperlink w:history="1" w:anchor="_Toc66">
+            <w:r>
+              <w:t xml:space="preserve">10. Risks and limitations of the test approach</w:t>
+            </w:r>
+            <w:r>
+              <w:tab/>
+            </w:r>
+            <w:r>
+              <w:fldChar w:fldCharType="begin" w:dirty="true"/>
+              <w:instrText xml:space="preserve">PAGEREF _Toc66 \h</w:instrText>
               <w:fldChar w:fldCharType="separate"/>
               <w:fldChar w:fldCharType="end"/>
             </w:r>
@@ -5222,7 +5244,7 @@
                 <w:sz w:val="18"/>
                 <w:szCs w:val="18"/>
               </w:rPr>
-              <w:t xml:space="preserve">19</w:t>
+              <w:t xml:space="preserve">20</w:t>
             </w:r>
           </w:p>
         </w:tc>
@@ -5249,7 +5271,7 @@
                 <w:sz w:val="18"/>
                 <w:szCs w:val="18"/>
               </w:rPr>
-              <w:t xml:space="preserve">142</w:t>
+              <w:t xml:space="preserve">145</w:t>
             </w:r>
           </w:p>
         </w:tc>
@@ -5276,7 +5298,7 @@
                 <w:sz w:val="18"/>
                 <w:szCs w:val="18"/>
               </w:rPr>
-              <w:t xml:space="preserve">231</w:t>
+              <w:t xml:space="preserve">234</w:t>
             </w:r>
           </w:p>
         </w:tc>
@@ -5556,7 +5578,7 @@
                 <w:sz w:val="18"/>
                 <w:szCs w:val="18"/>
               </w:rPr>
-              <w:t xml:space="preserve">42</w:t>
+              <w:t xml:space="preserve">43</w:t>
             </w:r>
           </w:p>
         </w:tc>
@@ -5585,7 +5607,7 @@
                 <w:sz w:val="18"/>
                 <w:szCs w:val="18"/>
               </w:rPr>
-              <w:t xml:space="preserve">275</w:t>
+              <w:t xml:space="preserve">278</w:t>
             </w:r>
           </w:p>
         </w:tc>
@@ -5614,7 +5636,7 @@
                 <w:sz w:val="18"/>
                 <w:szCs w:val="18"/>
               </w:rPr>
-              <w:t xml:space="preserve">404</w:t>
+              <w:t xml:space="preserve">407</w:t>
             </w:r>
           </w:p>
         </w:tc>
@@ -5797,7 +5819,24 @@
                 <w:sz w:val="18"/>
                 <w:szCs w:val="18"/>
               </w:rPr>
-              <w:t xml:space="preserve"> (≈ 34 s)</w:t>
+              <w:t xml:space="preserve"> (≈ 34 s) — before the 3 </w:t>
+            </w:r>
+            <w:r>
+              <w:rPr>
+                <w:rFonts w:ascii="Consolas" w:cs="Consolas" w:eastAsia="Consolas" w:hAnsi="Consolas"/>
+                <w:color w:val="5B2C6F"/>
+                <w:sz w:val="16"/>
+                <w:szCs w:val="16"/>
+              </w:rPr>
+              <w:t xml:space="preserve">MongoUnavailableTests</w:t>
+            </w:r>
+            <w:r>
+              <w:rPr>
+                <w:rFonts w:ascii="Calibri" w:cs="Calibri" w:eastAsia="Calibri" w:hAnsi="Calibri"/>
+                <w:sz w:val="18"/>
+                <w:szCs w:val="18"/>
+              </w:rPr>
+              <w:t xml:space="preserve"> were added; re-run pending</w:t>
             </w:r>
           </w:p>
         </w:tc>
@@ -36741,7 +36780,22 @@
         <w:rPr>
           <w:rFonts w:ascii="Calibri" w:cs="Calibri" w:eastAsia="Calibri" w:hAnsi="Calibri"/>
         </w:rPr>
-        <w:t xml:space="preserve">Storage timeout surfaces as a retryable 503 ProblemDetails.</w:t>
+        <w:t xml:space="preserve">A storage-neutral </w:t>
+      </w:r>
+      <w:r>
+        <w:rPr>
+          <w:rFonts w:ascii="Consolas" w:cs="Consolas" w:eastAsia="Consolas" w:hAnsi="Consolas"/>
+          <w:color w:val="5B2C6F"/>
+          <w:sz w:val="19"/>
+          <w:szCs w:val="19"/>
+        </w:rPr>
+        <w:t xml:space="preserve">StorageUnavailableException</w:t>
+      </w:r>
+      <w:r>
+        <w:rPr>
+          <w:rFonts w:ascii="Calibri" w:cs="Calibri" w:eastAsia="Calibri" w:hAnsi="Calibri"/>
+        </w:rPr>
+        <w:t xml:space="preserve"> surfaces as a retryable 503 ProblemDetails (the API does not reference MongoDB types).</w:t>
       </w:r>
     </w:p>
     <w:tbl>
@@ -37620,29 +37674,468 @@
     </w:p>
     <w:p>
       <w:pPr>
-        <w:pStyle w:val="Heading2"/>
+        <w:pStyle w:val="Heading3"/>
       </w:pPr>
       <w:bookmarkStart w:name="_Toc57" w:id="57"/>
       <w:r>
         <w:rPr>
           <w:rFonts w:ascii="Calibri" w:cs="Calibri" w:eastAsia="Calibri" w:hAnsi="Calibri"/>
         </w:rPr>
-        <w:t xml:space="preserve">7.4 Audit Service (Ta9.AuditService.Tests)</w:t>
+        <w:t xml:space="preserve">MongoUnavailableTests</w:t>
       </w:r>
       <w:bookmarkEnd w:id="57"/>
     </w:p>
     <w:p>
       <w:pPr>
-        <w:pStyle w:val="Heading3"/>
+        <w:spacing w:after="120"/>
+      </w:pPr>
+      <w:r>
+        <w:rPr>
+          <w:rFonts w:ascii="Calibri" w:cs="Calibri" w:eastAsia="Calibri" w:hAnsi="Calibri"/>
+          <w:b/>
+          <w:bCs/>
+        </w:rPr>
+        <w:t xml:space="preserve">Level:</w:t>
+      </w:r>
+      <w:r>
+        <w:rPr>
+          <w:rFonts w:ascii="Calibri" w:cs="Calibri" w:eastAsia="Calibri" w:hAnsi="Calibri"/>
+        </w:rPr>
+        <w:t xml:space="preserve"> Unit · </w:t>
+      </w:r>
+      <w:r>
+        <w:rPr>
+          <w:rFonts w:ascii="Calibri" w:cs="Calibri" w:eastAsia="Calibri" w:hAnsi="Calibri"/>
+          <w:b/>
+          <w:bCs/>
+        </w:rPr>
+        <w:t xml:space="preserve">Under test:</w:t>
+      </w:r>
+      <w:r>
+        <w:rPr>
+          <w:rFonts w:ascii="Calibri" w:cs="Calibri" w:eastAsia="Calibri" w:hAnsi="Calibri"/>
+        </w:rPr>
+        <w:t xml:space="preserve"> MongoJobRepository, MongoJobDocumentRepository (MongoGuard)</w:t>
+      </w:r>
+    </w:p>
+    <w:p>
+      <w:pPr>
+        <w:spacing w:after="120"/>
+      </w:pPr>
+      <w:r>
+        <w:rPr>
+          <w:rFonts w:ascii="Calibri" w:cs="Calibri" w:eastAsia="Calibri" w:hAnsi="Calibri"/>
+        </w:rPr>
+        <w:t xml:space="preserve">An unreachable MongoDB (closed port, 300 ms server-selection timeout, no Docker) is translated to </w:t>
+      </w:r>
+      <w:r>
+        <w:rPr>
+          <w:rFonts w:ascii="Consolas" w:cs="Consolas" w:eastAsia="Consolas" w:hAnsi="Consolas"/>
+          <w:color w:val="5B2C6F"/>
+          <w:sz w:val="19"/>
+          <w:szCs w:val="19"/>
+        </w:rPr>
+        <w:t xml:space="preserve">StorageUnavailableException</w:t>
+      </w:r>
+      <w:r>
+        <w:rPr>
+          <w:rFonts w:ascii="Calibri" w:cs="Calibri" w:eastAsia="Calibri" w:hAnsi="Calibri"/>
+        </w:rPr>
+        <w:t xml:space="preserve">.</w:t>
+      </w:r>
+    </w:p>
+    <w:tbl>
+      <w:tblPr>
+        <w:tblW w:type="dxa" w:w="9638"/>
+        <w:tblBorders>
+          <w:top w:val="single" w:color="auto" w:sz="4"/>
+          <w:left w:val="single" w:color="auto" w:sz="4"/>
+          <w:bottom w:val="single" w:color="auto" w:sz="4"/>
+          <w:right w:val="single" w:color="auto" w:sz="4"/>
+          <w:insideH w:val="single" w:color="auto" w:sz="4"/>
+          <w:insideV w:val="single" w:color="auto" w:sz="4"/>
+        </w:tblBorders>
+      </w:tblPr>
+      <w:tblGrid>
+        <w:gridCol w:w="1606"/>
+        <w:gridCol w:w="6425"/>
+        <w:gridCol w:w="1607"/>
+      </w:tblGrid>
+      <w:tr>
+        <w:trPr>
+          <w:tblHeader/>
+        </w:trPr>
+        <w:tc>
+          <w:tcPr>
+            <w:tcW w:type="dxa" w:w="1606"/>
+            <w:tcBorders>
+              <w:top w:val="single" w:color="BFBFBF" w:sz="4"/>
+              <w:left w:val="single" w:color="BFBFBF" w:sz="4"/>
+              <w:bottom w:val="single" w:color="BFBFBF" w:sz="4"/>
+              <w:right w:val="single" w:color="BFBFBF" w:sz="4"/>
+            </w:tcBorders>
+            <w:shd w:fill="DCE6F2" w:color="auto" w:val="clear"/>
+            <w:tcMar>
+              <w:top w:type="dxa" w:w="60"/>
+              <w:left w:type="dxa" w:w="100"/>
+              <w:bottom w:type="dxa" w:w="60"/>
+              <w:right w:type="dxa" w:w="100"/>
+            </w:tcMar>
+          </w:tcPr>
+          <w:p>
+            <w:r>
+              <w:rPr>
+                <w:rFonts w:ascii="Calibri" w:cs="Calibri" w:eastAsia="Calibri" w:hAnsi="Calibri"/>
+                <w:b/>
+                <w:bCs/>
+                <w:sz w:val="18"/>
+                <w:szCs w:val="18"/>
+              </w:rPr>
+              <w:t xml:space="preserve">ID</w:t>
+            </w:r>
+          </w:p>
+        </w:tc>
+        <w:tc>
+          <w:tcPr>
+            <w:tcW w:type="dxa" w:w="6425"/>
+            <w:tcBorders>
+              <w:top w:val="single" w:color="BFBFBF" w:sz="4"/>
+              <w:left w:val="single" w:color="BFBFBF" w:sz="4"/>
+              <w:bottom w:val="single" w:color="BFBFBF" w:sz="4"/>
+              <w:right w:val="single" w:color="BFBFBF" w:sz="4"/>
+            </w:tcBorders>
+            <w:shd w:fill="DCE6F2" w:color="auto" w:val="clear"/>
+            <w:tcMar>
+              <w:top w:type="dxa" w:w="60"/>
+              <w:left w:type="dxa" w:w="100"/>
+              <w:bottom w:type="dxa" w:w="60"/>
+              <w:right w:type="dxa" w:w="100"/>
+            </w:tcMar>
+          </w:tcPr>
+          <w:p>
+            <w:r>
+              <w:rPr>
+                <w:rFonts w:ascii="Calibri" w:cs="Calibri" w:eastAsia="Calibri" w:hAnsi="Calibri"/>
+                <w:b/>
+                <w:bCs/>
+                <w:sz w:val="18"/>
+                <w:szCs w:val="18"/>
+              </w:rPr>
+              <w:t xml:space="preserve">Test case</w:t>
+            </w:r>
+          </w:p>
+        </w:tc>
+        <w:tc>
+          <w:tcPr>
+            <w:tcW w:type="dxa" w:w="1607"/>
+            <w:tcBorders>
+              <w:top w:val="single" w:color="BFBFBF" w:sz="4"/>
+              <w:left w:val="single" w:color="BFBFBF" w:sz="4"/>
+              <w:bottom w:val="single" w:color="BFBFBF" w:sz="4"/>
+              <w:right w:val="single" w:color="BFBFBF" w:sz="4"/>
+            </w:tcBorders>
+            <w:shd w:fill="DCE6F2" w:color="auto" w:val="clear"/>
+            <w:tcMar>
+              <w:top w:type="dxa" w:w="60"/>
+              <w:left w:type="dxa" w:w="100"/>
+              <w:bottom w:type="dxa" w:w="60"/>
+              <w:right w:type="dxa" w:w="100"/>
+            </w:tcMar>
+          </w:tcPr>
+          <w:p>
+            <w:r>
+              <w:rPr>
+                <w:rFonts w:ascii="Calibri" w:cs="Calibri" w:eastAsia="Calibri" w:hAnsi="Calibri"/>
+                <w:b/>
+                <w:bCs/>
+                <w:sz w:val="18"/>
+                <w:szCs w:val="18"/>
+              </w:rPr>
+              <w:t xml:space="preserve">Kind</w:t>
+            </w:r>
+          </w:p>
+        </w:tc>
+      </w:tr>
+      <w:tr>
+        <w:tc>
+          <w:tcPr>
+            <w:tcW w:type="dxa" w:w="1606"/>
+            <w:tcBorders>
+              <w:top w:val="single" w:color="BFBFBF" w:sz="4"/>
+              <w:left w:val="single" w:color="BFBFBF" w:sz="4"/>
+              <w:bottom w:val="single" w:color="BFBFBF" w:sz="4"/>
+              <w:right w:val="single" w:color="BFBFBF" w:sz="4"/>
+            </w:tcBorders>
+            <w:tcMar>
+              <w:top w:type="dxa" w:w="60"/>
+              <w:left w:type="dxa" w:w="100"/>
+              <w:bottom w:type="dxa" w:w="60"/>
+              <w:right w:type="dxa" w:w="100"/>
+            </w:tcMar>
+          </w:tcPr>
+          <w:p>
+            <w:r>
+              <w:rPr>
+                <w:rFonts w:ascii="Calibri" w:cs="Calibri" w:eastAsia="Calibri" w:hAnsi="Calibri"/>
+                <w:sz w:val="18"/>
+                <w:szCs w:val="18"/>
+              </w:rPr>
+              <w:t xml:space="preserve">JS-143</w:t>
+            </w:r>
+          </w:p>
+        </w:tc>
+        <w:tc>
+          <w:tcPr>
+            <w:tcW w:type="dxa" w:w="6425"/>
+            <w:tcBorders>
+              <w:top w:val="single" w:color="BFBFBF" w:sz="4"/>
+              <w:left w:val="single" w:color="BFBFBF" w:sz="4"/>
+              <w:bottom w:val="single" w:color="BFBFBF" w:sz="4"/>
+              <w:right w:val="single" w:color="BFBFBF" w:sz="4"/>
+            </w:tcBorders>
+            <w:tcMar>
+              <w:top w:type="dxa" w:w="60"/>
+              <w:left w:type="dxa" w:w="100"/>
+              <w:bottom w:type="dxa" w:w="60"/>
+              <w:right w:type="dxa" w:w="100"/>
+            </w:tcMar>
+          </w:tcPr>
+          <w:p>
+            <w:r>
+              <w:rPr>
+                <w:rFonts w:ascii="Calibri" w:cs="Calibri" w:eastAsia="Calibri" w:hAnsi="Calibri"/>
+                <w:sz w:val="18"/>
+                <w:szCs w:val="18"/>
+              </w:rPr>
+              <w:t xml:space="preserve">Job repository reads and writes report storage unavailable</w:t>
+            </w:r>
+          </w:p>
+        </w:tc>
+        <w:tc>
+          <w:tcPr>
+            <w:tcW w:type="dxa" w:w="1607"/>
+            <w:tcBorders>
+              <w:top w:val="single" w:color="BFBFBF" w:sz="4"/>
+              <w:left w:val="single" w:color="BFBFBF" w:sz="4"/>
+              <w:bottom w:val="single" w:color="BFBFBF" w:sz="4"/>
+              <w:right w:val="single" w:color="BFBFBF" w:sz="4"/>
+            </w:tcBorders>
+            <w:tcMar>
+              <w:top w:type="dxa" w:w="60"/>
+              <w:left w:type="dxa" w:w="100"/>
+              <w:bottom w:type="dxa" w:w="60"/>
+              <w:right w:type="dxa" w:w="100"/>
+            </w:tcMar>
+          </w:tcPr>
+          <w:p>
+            <w:r>
+              <w:rPr>
+                <w:rFonts w:ascii="Calibri" w:cs="Calibri" w:eastAsia="Calibri" w:hAnsi="Calibri"/>
+                <w:sz w:val="18"/>
+                <w:szCs w:val="18"/>
+              </w:rPr>
+              <w:t xml:space="preserve">Fact</w:t>
+            </w:r>
+          </w:p>
+        </w:tc>
+      </w:tr>
+      <w:tr>
+        <w:tc>
+          <w:tcPr>
+            <w:tcW w:type="dxa" w:w="1606"/>
+            <w:tcBorders>
+              <w:top w:val="single" w:color="BFBFBF" w:sz="4"/>
+              <w:left w:val="single" w:color="BFBFBF" w:sz="4"/>
+              <w:bottom w:val="single" w:color="BFBFBF" w:sz="4"/>
+              <w:right w:val="single" w:color="BFBFBF" w:sz="4"/>
+            </w:tcBorders>
+            <w:tcMar>
+              <w:top w:type="dxa" w:w="60"/>
+              <w:left w:type="dxa" w:w="100"/>
+              <w:bottom w:type="dxa" w:w="60"/>
+              <w:right w:type="dxa" w:w="100"/>
+            </w:tcMar>
+          </w:tcPr>
+          <w:p>
+            <w:r>
+              <w:rPr>
+                <w:rFonts w:ascii="Calibri" w:cs="Calibri" w:eastAsia="Calibri" w:hAnsi="Calibri"/>
+                <w:sz w:val="18"/>
+                <w:szCs w:val="18"/>
+              </w:rPr>
+              <w:t xml:space="preserve">JS-144</w:t>
+            </w:r>
+          </w:p>
+        </w:tc>
+        <w:tc>
+          <w:tcPr>
+            <w:tcW w:type="dxa" w:w="6425"/>
+            <w:tcBorders>
+              <w:top w:val="single" w:color="BFBFBF" w:sz="4"/>
+              <w:left w:val="single" w:color="BFBFBF" w:sz="4"/>
+              <w:bottom w:val="single" w:color="BFBFBF" w:sz="4"/>
+              <w:right w:val="single" w:color="BFBFBF" w:sz="4"/>
+            </w:tcBorders>
+            <w:tcMar>
+              <w:top w:type="dxa" w:w="60"/>
+              <w:left w:type="dxa" w:w="100"/>
+              <w:bottom w:type="dxa" w:w="60"/>
+              <w:right w:type="dxa" w:w="100"/>
+            </w:tcMar>
+          </w:tcPr>
+          <w:p>
+            <w:r>
+              <w:rPr>
+                <w:rFonts w:ascii="Calibri" w:cs="Calibri" w:eastAsia="Calibri" w:hAnsi="Calibri"/>
+                <w:sz w:val="18"/>
+                <w:szCs w:val="18"/>
+              </w:rPr>
+              <w:t xml:space="preserve">Failed update keeps the version token unchanged</w:t>
+            </w:r>
+          </w:p>
+        </w:tc>
+        <w:tc>
+          <w:tcPr>
+            <w:tcW w:type="dxa" w:w="1607"/>
+            <w:tcBorders>
+              <w:top w:val="single" w:color="BFBFBF" w:sz="4"/>
+              <w:left w:val="single" w:color="BFBFBF" w:sz="4"/>
+              <w:bottom w:val="single" w:color="BFBFBF" w:sz="4"/>
+              <w:right w:val="single" w:color="BFBFBF" w:sz="4"/>
+            </w:tcBorders>
+            <w:tcMar>
+              <w:top w:type="dxa" w:w="60"/>
+              <w:left w:type="dxa" w:w="100"/>
+              <w:bottom w:type="dxa" w:w="60"/>
+              <w:right w:type="dxa" w:w="100"/>
+            </w:tcMar>
+          </w:tcPr>
+          <w:p>
+            <w:r>
+              <w:rPr>
+                <w:rFonts w:ascii="Calibri" w:cs="Calibri" w:eastAsia="Calibri" w:hAnsi="Calibri"/>
+                <w:sz w:val="18"/>
+                <w:szCs w:val="18"/>
+              </w:rPr>
+              <w:t xml:space="preserve">Fact</w:t>
+            </w:r>
+          </w:p>
+        </w:tc>
+      </w:tr>
+      <w:tr>
+        <w:tc>
+          <w:tcPr>
+            <w:tcW w:type="dxa" w:w="1606"/>
+            <w:tcBorders>
+              <w:top w:val="single" w:color="BFBFBF" w:sz="4"/>
+              <w:left w:val="single" w:color="BFBFBF" w:sz="4"/>
+              <w:bottom w:val="single" w:color="BFBFBF" w:sz="4"/>
+              <w:right w:val="single" w:color="BFBFBF" w:sz="4"/>
+            </w:tcBorders>
+            <w:tcMar>
+              <w:top w:type="dxa" w:w="60"/>
+              <w:left w:type="dxa" w:w="100"/>
+              <w:bottom w:type="dxa" w:w="60"/>
+              <w:right w:type="dxa" w:w="100"/>
+            </w:tcMar>
+          </w:tcPr>
+          <w:p>
+            <w:r>
+              <w:rPr>
+                <w:rFonts w:ascii="Calibri" w:cs="Calibri" w:eastAsia="Calibri" w:hAnsi="Calibri"/>
+                <w:sz w:val="18"/>
+                <w:szCs w:val="18"/>
+              </w:rPr>
+              <w:t xml:space="preserve">JS-145</w:t>
+            </w:r>
+          </w:p>
+        </w:tc>
+        <w:tc>
+          <w:tcPr>
+            <w:tcW w:type="dxa" w:w="6425"/>
+            <w:tcBorders>
+              <w:top w:val="single" w:color="BFBFBF" w:sz="4"/>
+              <w:left w:val="single" w:color="BFBFBF" w:sz="4"/>
+              <w:bottom w:val="single" w:color="BFBFBF" w:sz="4"/>
+              <w:right w:val="single" w:color="BFBFBF" w:sz="4"/>
+            </w:tcBorders>
+            <w:tcMar>
+              <w:top w:type="dxa" w:w="60"/>
+              <w:left w:type="dxa" w:w="100"/>
+              <w:bottom w:type="dxa" w:w="60"/>
+              <w:right w:type="dxa" w:w="100"/>
+            </w:tcMar>
+          </w:tcPr>
+          <w:p>
+            <w:r>
+              <w:rPr>
+                <w:rFonts w:ascii="Calibri" w:cs="Calibri" w:eastAsia="Calibri" w:hAnsi="Calibri"/>
+                <w:sz w:val="18"/>
+                <w:szCs w:val="18"/>
+              </w:rPr>
+              <w:t xml:space="preserve">Document repository reports storage unavailable</w:t>
+            </w:r>
+          </w:p>
+        </w:tc>
+        <w:tc>
+          <w:tcPr>
+            <w:tcW w:type="dxa" w:w="1607"/>
+            <w:tcBorders>
+              <w:top w:val="single" w:color="BFBFBF" w:sz="4"/>
+              <w:left w:val="single" w:color="BFBFBF" w:sz="4"/>
+              <w:bottom w:val="single" w:color="BFBFBF" w:sz="4"/>
+              <w:right w:val="single" w:color="BFBFBF" w:sz="4"/>
+            </w:tcBorders>
+            <w:tcMar>
+              <w:top w:type="dxa" w:w="60"/>
+              <w:left w:type="dxa" w:w="100"/>
+              <w:bottom w:type="dxa" w:w="60"/>
+              <w:right w:type="dxa" w:w="100"/>
+            </w:tcMar>
+          </w:tcPr>
+          <w:p>
+            <w:r>
+              <w:rPr>
+                <w:rFonts w:ascii="Calibri" w:cs="Calibri" w:eastAsia="Calibri" w:hAnsi="Calibri"/>
+                <w:sz w:val="18"/>
+                <w:szCs w:val="18"/>
+              </w:rPr>
+              <w:t xml:space="preserve">Fact</w:t>
+            </w:r>
+          </w:p>
+        </w:tc>
+      </w:tr>
+    </w:tbl>
+    <w:p>
+      <w:pPr>
+        <w:spacing w:after="120"/>
+      </w:pPr>
+    </w:p>
+    <w:p>
+      <w:pPr>
+        <w:pStyle w:val="Heading2"/>
       </w:pPr>
       <w:bookmarkStart w:name="_Toc58" w:id="58"/>
       <w:r>
         <w:rPr>
           <w:rFonts w:ascii="Calibri" w:cs="Calibri" w:eastAsia="Calibri" w:hAnsi="Calibri"/>
         </w:rPr>
+        <w:t xml:space="preserve">7.4 Audit Service (Ta9.AuditService.Tests)</w:t>
+      </w:r>
+      <w:bookmarkEnd w:id="58"/>
+    </w:p>
+    <w:p>
+      <w:pPr>
+        <w:pStyle w:val="Heading3"/>
+      </w:pPr>
+      <w:bookmarkStart w:name="_Toc59" w:id="59"/>
+      <w:r>
+        <w:rPr>
+          <w:rFonts w:ascii="Calibri" w:cs="Calibri" w:eastAsia="Calibri" w:hAnsi="Calibri"/>
+        </w:rPr>
         <w:t xml:space="preserve">AuditApiTests</w:t>
       </w:r>
-      <w:bookmarkEnd w:id="58"/>
+      <w:bookmarkEnd w:id="59"/>
     </w:p>
     <w:p>
       <w:pPr>
@@ -38225,14 +38718,14 @@
       <w:pPr>
         <w:pStyle w:val="Heading3"/>
       </w:pPr>
-      <w:bookmarkStart w:name="_Toc59" w:id="59"/>
+      <w:bookmarkStart w:name="_Toc60" w:id="60"/>
       <w:r>
         <w:rPr>
           <w:rFonts w:ascii="Calibri" w:cs="Calibri" w:eastAsia="Calibri" w:hAnsi="Calibri"/>
         </w:rPr>
         <w:t xml:space="preserve">JobAuditRequestValidatorTests</w:t>
       </w:r>
-      <w:bookmarkEnd w:id="59"/>
+      <w:bookmarkEnd w:id="60"/>
     </w:p>
     <w:p>
       <w:pPr>
@@ -38732,14 +39225,14 @@
       <w:pPr>
         <w:pStyle w:val="Heading3"/>
       </w:pPr>
-      <w:bookmarkStart w:name="_Toc60" w:id="60"/>
+      <w:bookmarkStart w:name="_Toc61" w:id="61"/>
       <w:r>
         <w:rPr>
           <w:rFonts w:ascii="Calibri" w:cs="Calibri" w:eastAsia="Calibri" w:hAnsi="Calibri"/>
         </w:rPr>
         <w:t xml:space="preserve">AuditRepositoryContract</w:t>
       </w:r>
-      <w:bookmarkEnd w:id="60"/>
+      <w:bookmarkEnd w:id="61"/>
     </w:p>
     <w:p>
       <w:pPr>
@@ -39102,27 +39595,27 @@
       <w:pPr>
         <w:pStyle w:val="Heading2"/>
       </w:pPr>
-      <w:bookmarkStart w:name="_Toc61" w:id="61"/>
+      <w:bookmarkStart w:name="_Toc62" w:id="62"/>
       <w:r>
         <w:rPr>
           <w:rFonts w:ascii="Calibri" w:cs="Calibri" w:eastAsia="Calibri" w:hAnsi="Calibri"/>
         </w:rPr>
         <w:t xml:space="preserve">7.5 Cross-service integration (Ta9.IntegrationTests)</w:t>
       </w:r>
-      <w:bookmarkEnd w:id="61"/>
+      <w:bookmarkEnd w:id="62"/>
     </w:p>
     <w:p>
       <w:pPr>
         <w:pStyle w:val="Heading3"/>
       </w:pPr>
-      <w:bookmarkStart w:name="_Toc62" w:id="62"/>
+      <w:bookmarkStart w:name="_Toc63" w:id="63"/>
       <w:r>
         <w:rPr>
           <w:rFonts w:ascii="Calibri" w:cs="Calibri" w:eastAsia="Calibri" w:hAnsi="Calibri"/>
         </w:rPr>
         <w:t xml:space="preserve">EndToEndTests</w:t>
       </w:r>
-      <w:bookmarkEnd w:id="62"/>
+      <w:bookmarkEnd w:id="63"/>
     </w:p>
     <w:p>
       <w:pPr>
@@ -39720,14 +40213,14 @@
       <w:pPr>
         <w:pStyle w:val="Heading1"/>
       </w:pPr>
-      <w:bookmarkStart w:name="_Toc63" w:id="63"/>
+      <w:bookmarkStart w:name="_Toc64" w:id="64"/>
       <w:r>
         <w:rPr>
           <w:rFonts w:ascii="Calibri" w:cs="Calibri" w:eastAsia="Calibri" w:hAnsi="Calibri"/>
         </w:rPr>
         <w:t xml:space="preserve">8. Manual and system test procedures</w:t>
       </w:r>
-      <w:bookmarkEnd w:id="63"/>
+      <w:bookmarkEnd w:id="64"/>
     </w:p>
     <w:p>
       <w:pPr>
@@ -42027,14 +42520,14 @@
       <w:pPr>
         <w:pStyle w:val="Heading1"/>
       </w:pPr>
-      <w:bookmarkStart w:name="_Toc64" w:id="64"/>
+      <w:bookmarkStart w:name="_Toc65" w:id="65"/>
       <w:r>
         <w:rPr>
           <w:rFonts w:ascii="Calibri" w:cs="Calibri" w:eastAsia="Calibri" w:hAnsi="Calibri"/>
         </w:rPr>
         <w:t xml:space="preserve">9. Defects found by testing</w:t>
       </w:r>
-      <w:bookmarkEnd w:id="64"/>
+      <w:bookmarkEnd w:id="65"/>
     </w:p>
     <w:p>
       <w:pPr>
@@ -43156,14 +43649,14 @@
       <w:pPr>
         <w:pStyle w:val="Heading1"/>
       </w:pPr>
-      <w:bookmarkStart w:name="_Toc65" w:id="65"/>
+      <w:bookmarkStart w:name="_Toc66" w:id="66"/>
       <w:r>
         <w:rPr>
           <w:rFonts w:ascii="Calibri" w:cs="Calibri" w:eastAsia="Calibri" w:hAnsi="Calibri"/>
         </w:rPr>
         <w:t xml:space="preserve">10. Risks and limitations of the test approach</w:t>
       </w:r>
-      <w:bookmarkEnd w:id="65"/>
+      <w:bookmarkEnd w:id="66"/>
     </w:p>
     <w:p>
       <w:pPr>

</xml_diff>

<commit_message>
docs: Storage document (section 6) with diagram and STD-linked tests
Co-Authored-By: Claude Opus 5.5 <noreply@anthropic.com>
</commit_message>
<xml_diff>
--- a/docs/testing/TA9-STD.docx
+++ b/docs/testing/TA9-STD.docx
@@ -8453,6 +8453,23 @@
                 <w:sz w:val="16"/>
                 <w:szCs w:val="16"/>
               </w:rPr>
+              <w:t xml:space="preserve">MongoUnavailableTests</w:t>
+            </w:r>
+            <w:r>
+              <w:rPr>
+                <w:rFonts w:ascii="Calibri" w:cs="Calibri" w:eastAsia="Calibri" w:hAnsi="Calibri"/>
+                <w:sz w:val="18"/>
+                <w:szCs w:val="18"/>
+              </w:rPr>
+              <w:t xml:space="preserve">, </w:t>
+            </w:r>
+            <w:r>
+              <w:rPr>
+                <w:rFonts w:ascii="Consolas" w:cs="Consolas" w:eastAsia="Consolas" w:hAnsi="Consolas"/>
+                <w:color w:val="5B2C6F"/>
+                <w:sz w:val="16"/>
+                <w:szCs w:val="16"/>
+              </w:rPr>
               <w:t xml:space="preserve">ProcessorEventsEndpointTests</w:t>
             </w:r>
             <w:r>
@@ -9286,7 +9303,7 @@
         <w:rPr>
           <w:rFonts w:ascii="Calibri" w:cs="Calibri" w:eastAsia="Calibri" w:hAnsi="Calibri"/>
         </w:rPr>
-        <w:t xml:space="preserve"> (§4 Concurrency &amp; Performance, chapter 7) and </w:t>
+        <w:t xml:space="preserve"> (§4 Concurrency &amp; Performance, chapter 7) </w:t>
       </w:r>
       <w:r>
         <w:rPr>
@@ -9301,7 +9318,22 @@
         <w:rPr>
           <w:rFonts w:ascii="Calibri" w:cs="Calibri" w:eastAsia="Calibri" w:hAnsi="Calibri"/>
         </w:rPr>
-        <w:t xml:space="preserve"> (WebSocket disconnect/reconnect, chapter 5).</w:t>
+        <w:t xml:space="preserve"> (WebSocket disconnect/reconnect, chapter 5) and </w:t>
+      </w:r>
+      <w:r>
+        <w:rPr>
+          <w:rFonts w:ascii="Consolas" w:cs="Consolas" w:eastAsia="Consolas" w:hAnsi="Consolas"/>
+          <w:color w:val="5B2C6F"/>
+          <w:sz w:val="19"/>
+          <w:szCs w:val="19"/>
+        </w:rPr>
+        <w:t xml:space="preserve">docs/storage/TA9-Storage.docx</w:t>
+      </w:r>
+      <w:r>
+        <w:rPr>
+          <w:rFonts w:ascii="Calibri" w:cs="Calibri" w:eastAsia="Calibri" w:hAnsi="Calibri"/>
+        </w:rPr>
+        <w:t xml:space="preserve"> (§6 Storage, chapter 7).</w:t>
       </w:r>
     </w:p>
     <w:p>

</xml_diff>

<commit_message>
test: manual MT-05, MT-06, MT-10 passed; Swagger screenshots in the User Guide
MT-06 expected result now describes the processor-side race (cancel is best effort there; the Job
Service and the audit entry stay Cancelled).

Co-Authored-By: Claude Opus 5.5 <noreply@anthropic.com>
</commit_message>
<xml_diff>
--- a/docs/testing/TA9-STD.docx
+++ b/docs/testing/TA9-STD.docx
@@ -48646,12 +48646,12 @@
         </w:tblBorders>
       </w:tblPr>
       <w:tblGrid>
-        <w:gridCol w:w="512"/>
-        <w:gridCol w:w="1999"/>
-        <w:gridCol w:w="2050"/>
-        <w:gridCol w:w="2050"/>
-        <w:gridCol w:w="2050"/>
-        <w:gridCol w:w="977"/>
+        <w:gridCol w:w="461"/>
+        <w:gridCol w:w="1798"/>
+        <w:gridCol w:w="1844"/>
+        <w:gridCol w:w="1844"/>
+        <w:gridCol w:w="1844"/>
+        <w:gridCol w:w="1847"/>
       </w:tblGrid>
       <w:tr>
         <w:trPr>
@@ -48659,7 +48659,7 @@
         </w:trPr>
         <w:tc>
           <w:tcPr>
-            <w:tcW w:type="dxa" w:w="512"/>
+            <w:tcW w:type="dxa" w:w="461"/>
             <w:tcBorders>
               <w:top w:val="single" w:color="BFBFBF" w:sz="4"/>
               <w:left w:val="single" w:color="BFBFBF" w:sz="4"/>
@@ -48689,7 +48689,7 @@
         </w:tc>
         <w:tc>
           <w:tcPr>
-            <w:tcW w:type="dxa" w:w="1999"/>
+            <w:tcW w:type="dxa" w:w="1798"/>
             <w:tcBorders>
               <w:top w:val="single" w:color="BFBFBF" w:sz="4"/>
               <w:left w:val="single" w:color="BFBFBF" w:sz="4"/>
@@ -48719,7 +48719,7 @@
         </w:tc>
         <w:tc>
           <w:tcPr>
-            <w:tcW w:type="dxa" w:w="2050"/>
+            <w:tcW w:type="dxa" w:w="1844"/>
             <w:tcBorders>
               <w:top w:val="single" w:color="BFBFBF" w:sz="4"/>
               <w:left w:val="single" w:color="BFBFBF" w:sz="4"/>
@@ -48749,7 +48749,7 @@
         </w:tc>
         <w:tc>
           <w:tcPr>
-            <w:tcW w:type="dxa" w:w="2050"/>
+            <w:tcW w:type="dxa" w:w="1844"/>
             <w:tcBorders>
               <w:top w:val="single" w:color="BFBFBF" w:sz="4"/>
               <w:left w:val="single" w:color="BFBFBF" w:sz="4"/>
@@ -48779,7 +48779,7 @@
         </w:tc>
         <w:tc>
           <w:tcPr>
-            <w:tcW w:type="dxa" w:w="2050"/>
+            <w:tcW w:type="dxa" w:w="1844"/>
             <w:tcBorders>
               <w:top w:val="single" w:color="BFBFBF" w:sz="4"/>
               <w:left w:val="single" w:color="BFBFBF" w:sz="4"/>
@@ -48809,7 +48809,7 @@
         </w:tc>
         <w:tc>
           <w:tcPr>
-            <w:tcW w:type="dxa" w:w="977"/>
+            <w:tcW w:type="dxa" w:w="1847"/>
             <w:tcBorders>
               <w:top w:val="single" w:color="BFBFBF" w:sz="4"/>
               <w:left w:val="single" w:color="BFBFBF" w:sz="4"/>
@@ -48841,7 +48841,7 @@
       <w:tr>
         <w:tc>
           <w:tcPr>
-            <w:tcW w:type="dxa" w:w="512"/>
+            <w:tcW w:type="dxa" w:w="461"/>
             <w:tcBorders>
               <w:top w:val="single" w:color="BFBFBF" w:sz="4"/>
               <w:left w:val="single" w:color="BFBFBF" w:sz="4"/>
@@ -48868,7 +48868,7 @@
         </w:tc>
         <w:tc>
           <w:tcPr>
-            <w:tcW w:type="dxa" w:w="1999"/>
+            <w:tcW w:type="dxa" w:w="1798"/>
             <w:tcBorders>
               <w:top w:val="single" w:color="BFBFBF" w:sz="4"/>
               <w:left w:val="single" w:color="BFBFBF" w:sz="4"/>
@@ -48895,7 +48895,7 @@
         </w:tc>
         <w:tc>
           <w:tcPr>
-            <w:tcW w:type="dxa" w:w="2050"/>
+            <w:tcW w:type="dxa" w:w="1844"/>
             <w:tcBorders>
               <w:top w:val="single" w:color="BFBFBF" w:sz="4"/>
               <w:left w:val="single" w:color="BFBFBF" w:sz="4"/>
@@ -48922,7 +48922,7 @@
         </w:tc>
         <w:tc>
           <w:tcPr>
-            <w:tcW w:type="dxa" w:w="2050"/>
+            <w:tcW w:type="dxa" w:w="1844"/>
             <w:tcBorders>
               <w:top w:val="single" w:color="BFBFBF" w:sz="4"/>
               <w:left w:val="single" w:color="BFBFBF" w:sz="4"/>
@@ -49000,7 +49000,7 @@
         </w:tc>
         <w:tc>
           <w:tcPr>
-            <w:tcW w:type="dxa" w:w="2050"/>
+            <w:tcW w:type="dxa" w:w="1844"/>
             <w:tcBorders>
               <w:top w:val="single" w:color="BFBFBF" w:sz="4"/>
               <w:left w:val="single" w:color="BFBFBF" w:sz="4"/>
@@ -49054,7 +49054,7 @@
         </w:tc>
         <w:tc>
           <w:tcPr>
-            <w:tcW w:type="dxa" w:w="977"/>
+            <w:tcW w:type="dxa" w:w="1847"/>
             <w:tcBorders>
               <w:top w:val="single" w:color="BFBFBF" w:sz="4"/>
               <w:left w:val="single" w:color="BFBFBF" w:sz="4"/>
@@ -49083,7 +49083,7 @@
       <w:tr>
         <w:tc>
           <w:tcPr>
-            <w:tcW w:type="dxa" w:w="512"/>
+            <w:tcW w:type="dxa" w:w="461"/>
             <w:tcBorders>
               <w:top w:val="single" w:color="BFBFBF" w:sz="4"/>
               <w:left w:val="single" w:color="BFBFBF" w:sz="4"/>
@@ -49110,7 +49110,7 @@
         </w:tc>
         <w:tc>
           <w:tcPr>
-            <w:tcW w:type="dxa" w:w="1999"/>
+            <w:tcW w:type="dxa" w:w="1798"/>
             <w:tcBorders>
               <w:top w:val="single" w:color="BFBFBF" w:sz="4"/>
               <w:left w:val="single" w:color="BFBFBF" w:sz="4"/>
@@ -49137,7 +49137,7 @@
         </w:tc>
         <w:tc>
           <w:tcPr>
-            <w:tcW w:type="dxa" w:w="2050"/>
+            <w:tcW w:type="dxa" w:w="1844"/>
             <w:tcBorders>
               <w:top w:val="single" w:color="BFBFBF" w:sz="4"/>
               <w:left w:val="single" w:color="BFBFBF" w:sz="4"/>
@@ -49164,7 +49164,7 @@
         </w:tc>
         <w:tc>
           <w:tcPr>
-            <w:tcW w:type="dxa" w:w="2050"/>
+            <w:tcW w:type="dxa" w:w="1844"/>
             <w:tcBorders>
               <w:top w:val="single" w:color="BFBFBF" w:sz="4"/>
               <w:left w:val="single" w:color="BFBFBF" w:sz="4"/>
@@ -49200,7 +49200,7 @@
         </w:tc>
         <w:tc>
           <w:tcPr>
-            <w:tcW w:type="dxa" w:w="2050"/>
+            <w:tcW w:type="dxa" w:w="1844"/>
             <w:tcBorders>
               <w:top w:val="single" w:color="BFBFBF" w:sz="4"/>
               <w:left w:val="single" w:color="BFBFBF" w:sz="4"/>
@@ -49236,7 +49236,7 @@
         </w:tc>
         <w:tc>
           <w:tcPr>
-            <w:tcW w:type="dxa" w:w="977"/>
+            <w:tcW w:type="dxa" w:w="1847"/>
             <w:tcBorders>
               <w:top w:val="single" w:color="BFBFBF" w:sz="4"/>
               <w:left w:val="single" w:color="BFBFBF" w:sz="4"/>
@@ -49265,7 +49265,7 @@
       <w:tr>
         <w:tc>
           <w:tcPr>
-            <w:tcW w:type="dxa" w:w="512"/>
+            <w:tcW w:type="dxa" w:w="461"/>
             <w:tcBorders>
               <w:top w:val="single" w:color="BFBFBF" w:sz="4"/>
               <w:left w:val="single" w:color="BFBFBF" w:sz="4"/>
@@ -49292,7 +49292,7 @@
         </w:tc>
         <w:tc>
           <w:tcPr>
-            <w:tcW w:type="dxa" w:w="1999"/>
+            <w:tcW w:type="dxa" w:w="1798"/>
             <w:tcBorders>
               <w:top w:val="single" w:color="BFBFBF" w:sz="4"/>
               <w:left w:val="single" w:color="BFBFBF" w:sz="4"/>
@@ -49319,7 +49319,7 @@
         </w:tc>
         <w:tc>
           <w:tcPr>
-            <w:tcW w:type="dxa" w:w="2050"/>
+            <w:tcW w:type="dxa" w:w="1844"/>
             <w:tcBorders>
               <w:top w:val="single" w:color="BFBFBF" w:sz="4"/>
               <w:left w:val="single" w:color="BFBFBF" w:sz="4"/>
@@ -49346,7 +49346,7 @@
         </w:tc>
         <w:tc>
           <w:tcPr>
-            <w:tcW w:type="dxa" w:w="2050"/>
+            <w:tcW w:type="dxa" w:w="1844"/>
             <w:tcBorders>
               <w:top w:val="single" w:color="BFBFBF" w:sz="4"/>
               <w:left w:val="single" w:color="BFBFBF" w:sz="4"/>
@@ -49382,7 +49382,7 @@
         </w:tc>
         <w:tc>
           <w:tcPr>
-            <w:tcW w:type="dxa" w:w="2050"/>
+            <w:tcW w:type="dxa" w:w="1844"/>
             <w:tcBorders>
               <w:top w:val="single" w:color="BFBFBF" w:sz="4"/>
               <w:left w:val="single" w:color="BFBFBF" w:sz="4"/>
@@ -49409,7 +49409,7 @@
         </w:tc>
         <w:tc>
           <w:tcPr>
-            <w:tcW w:type="dxa" w:w="977"/>
+            <w:tcW w:type="dxa" w:w="1847"/>
             <w:tcBorders>
               <w:top w:val="single" w:color="BFBFBF" w:sz="4"/>
               <w:left w:val="single" w:color="BFBFBF" w:sz="4"/>
@@ -49438,7 +49438,7 @@
       <w:tr>
         <w:tc>
           <w:tcPr>
-            <w:tcW w:type="dxa" w:w="512"/>
+            <w:tcW w:type="dxa" w:w="461"/>
             <w:tcBorders>
               <w:top w:val="single" w:color="BFBFBF" w:sz="4"/>
               <w:left w:val="single" w:color="BFBFBF" w:sz="4"/>
@@ -49465,7 +49465,7 @@
         </w:tc>
         <w:tc>
           <w:tcPr>
-            <w:tcW w:type="dxa" w:w="1999"/>
+            <w:tcW w:type="dxa" w:w="1798"/>
             <w:tcBorders>
               <w:top w:val="single" w:color="BFBFBF" w:sz="4"/>
               <w:left w:val="single" w:color="BFBFBF" w:sz="4"/>
@@ -49492,7 +49492,7 @@
         </w:tc>
         <w:tc>
           <w:tcPr>
-            <w:tcW w:type="dxa" w:w="2050"/>
+            <w:tcW w:type="dxa" w:w="1844"/>
             <w:tcBorders>
               <w:top w:val="single" w:color="BFBFBF" w:sz="4"/>
               <w:left w:val="single" w:color="BFBFBF" w:sz="4"/>
@@ -49519,7 +49519,7 @@
         </w:tc>
         <w:tc>
           <w:tcPr>
-            <w:tcW w:type="dxa" w:w="2050"/>
+            <w:tcW w:type="dxa" w:w="1844"/>
             <w:tcBorders>
               <w:top w:val="single" w:color="BFBFBF" w:sz="4"/>
               <w:left w:val="single" w:color="BFBFBF" w:sz="4"/>
@@ -49563,7 +49563,7 @@
         </w:tc>
         <w:tc>
           <w:tcPr>
-            <w:tcW w:type="dxa" w:w="2050"/>
+            <w:tcW w:type="dxa" w:w="1844"/>
             <w:tcBorders>
               <w:top w:val="single" w:color="BFBFBF" w:sz="4"/>
               <w:left w:val="single" w:color="BFBFBF" w:sz="4"/>
@@ -49590,7 +49590,7 @@
         </w:tc>
         <w:tc>
           <w:tcPr>
-            <w:tcW w:type="dxa" w:w="977"/>
+            <w:tcW w:type="dxa" w:w="1847"/>
             <w:tcBorders>
               <w:top w:val="single" w:color="BFBFBF" w:sz="4"/>
               <w:left w:val="single" w:color="BFBFBF" w:sz="4"/>
@@ -49619,7 +49619,7 @@
       <w:tr>
         <w:tc>
           <w:tcPr>
-            <w:tcW w:type="dxa" w:w="512"/>
+            <w:tcW w:type="dxa" w:w="461"/>
             <w:tcBorders>
               <w:top w:val="single" w:color="BFBFBF" w:sz="4"/>
               <w:left w:val="single" w:color="BFBFBF" w:sz="4"/>
@@ -49646,7 +49646,7 @@
         </w:tc>
         <w:tc>
           <w:tcPr>
-            <w:tcW w:type="dxa" w:w="1999"/>
+            <w:tcW w:type="dxa" w:w="1798"/>
             <w:tcBorders>
               <w:top w:val="single" w:color="BFBFBF" w:sz="4"/>
               <w:left w:val="single" w:color="BFBFBF" w:sz="4"/>
@@ -49673,7 +49673,7 @@
         </w:tc>
         <w:tc>
           <w:tcPr>
-            <w:tcW w:type="dxa" w:w="2050"/>
+            <w:tcW w:type="dxa" w:w="1844"/>
             <w:tcBorders>
               <w:top w:val="single" w:color="BFBFBF" w:sz="4"/>
               <w:left w:val="single" w:color="BFBFBF" w:sz="4"/>
@@ -49700,7 +49700,7 @@
         </w:tc>
         <w:tc>
           <w:tcPr>
-            <w:tcW w:type="dxa" w:w="2050"/>
+            <w:tcW w:type="dxa" w:w="1844"/>
             <w:tcBorders>
               <w:top w:val="single" w:color="BFBFBF" w:sz="4"/>
               <w:left w:val="single" w:color="BFBFBF" w:sz="4"/>
@@ -49778,7 +49778,7 @@
         </w:tc>
         <w:tc>
           <w:tcPr>
-            <w:tcW w:type="dxa" w:w="2050"/>
+            <w:tcW w:type="dxa" w:w="1844"/>
             <w:tcBorders>
               <w:top w:val="single" w:color="BFBFBF" w:sz="4"/>
               <w:left w:val="single" w:color="BFBFBF" w:sz="4"/>
@@ -49805,138 +49805,28 @@
         </w:tc>
         <w:tc>
           <w:tcPr>
-            <w:tcW w:type="dxa" w:w="977"/>
-            <w:tcBorders>
-              <w:top w:val="single" w:color="BFBFBF" w:sz="4"/>
-              <w:left w:val="single" w:color="BFBFBF" w:sz="4"/>
-              <w:bottom w:val="single" w:color="BFBFBF" w:sz="4"/>
-              <w:right w:val="single" w:color="BFBFBF" w:sz="4"/>
-            </w:tcBorders>
-            <w:tcMar>
-              <w:top w:type="dxa" w:w="60"/>
-              <w:left w:type="dxa" w:w="100"/>
-              <w:bottom w:type="dxa" w:w="60"/>
-              <w:right w:type="dxa" w:w="100"/>
-            </w:tcMar>
-          </w:tcPr>
-          <w:p>
-            <w:r>
-              <w:rPr>
-                <w:rFonts w:ascii="Calibri" w:cs="Calibri" w:eastAsia="Calibri" w:hAnsi="Calibri"/>
-                <w:sz w:val="18"/>
-                <w:szCs w:val="18"/>
-              </w:rPr>
-              <w:t xml:space="preserve">Not yet executed</w:t>
-            </w:r>
-          </w:p>
-        </w:tc>
-      </w:tr>
-      <w:tr>
-        <w:tc>
-          <w:tcPr>
-            <w:tcW w:type="dxa" w:w="512"/>
-            <w:tcBorders>
-              <w:top w:val="single" w:color="BFBFBF" w:sz="4"/>
-              <w:left w:val="single" w:color="BFBFBF" w:sz="4"/>
-              <w:bottom w:val="single" w:color="BFBFBF" w:sz="4"/>
-              <w:right w:val="single" w:color="BFBFBF" w:sz="4"/>
-            </w:tcBorders>
-            <w:tcMar>
-              <w:top w:type="dxa" w:w="60"/>
-              <w:left w:type="dxa" w:w="100"/>
-              <w:bottom w:type="dxa" w:w="60"/>
-              <w:right w:type="dxa" w:w="100"/>
-            </w:tcMar>
-          </w:tcPr>
-          <w:p>
-            <w:r>
-              <w:rPr>
-                <w:rFonts w:ascii="Calibri" w:cs="Calibri" w:eastAsia="Calibri" w:hAnsi="Calibri"/>
-                <w:sz w:val="18"/>
-                <w:szCs w:val="18"/>
-              </w:rPr>
-              <w:t xml:space="preserve">MT-06</w:t>
-            </w:r>
-          </w:p>
-        </w:tc>
-        <w:tc>
-          <w:tcPr>
-            <w:tcW w:type="dxa" w:w="1999"/>
-            <w:tcBorders>
-              <w:top w:val="single" w:color="BFBFBF" w:sz="4"/>
-              <w:left w:val="single" w:color="BFBFBF" w:sz="4"/>
-              <w:bottom w:val="single" w:color="BFBFBF" w:sz="4"/>
-              <w:right w:val="single" w:color="BFBFBF" w:sz="4"/>
-            </w:tcBorders>
-            <w:tcMar>
-              <w:top w:type="dxa" w:w="60"/>
-              <w:left w:type="dxa" w:w="100"/>
-              <w:bottom w:type="dxa" w:w="60"/>
-              <w:right w:type="dxa" w:w="100"/>
-            </w:tcMar>
-          </w:tcPr>
-          <w:p>
-            <w:r>
-              <w:rPr>
-                <w:rFonts w:ascii="Calibri" w:cs="Calibri" w:eastAsia="Calibri" w:hAnsi="Calibri"/>
-                <w:sz w:val="18"/>
-                <w:szCs w:val="18"/>
-              </w:rPr>
-              <w:t xml:space="preserve">Cancel a running job</w:t>
-            </w:r>
-          </w:p>
-        </w:tc>
-        <w:tc>
-          <w:tcPr>
-            <w:tcW w:type="dxa" w:w="2050"/>
-            <w:tcBorders>
-              <w:top w:val="single" w:color="BFBFBF" w:sz="4"/>
-              <w:left w:val="single" w:color="BFBFBF" w:sz="4"/>
-              <w:bottom w:val="single" w:color="BFBFBF" w:sz="4"/>
-              <w:right w:val="single" w:color="BFBFBF" w:sz="4"/>
-            </w:tcBorders>
-            <w:tcMar>
-              <w:top w:type="dxa" w:w="60"/>
-              <w:left w:type="dxa" w:w="100"/>
-              <w:bottom w:type="dxa" w:w="60"/>
-              <w:right w:type="dxa" w:w="100"/>
-            </w:tcMar>
-          </w:tcPr>
-          <w:p>
-            <w:r>
-              <w:rPr>
-                <w:rFonts w:ascii="Calibri" w:cs="Calibri" w:eastAsia="Calibri" w:hAnsi="Calibri"/>
-                <w:sz w:val="18"/>
-                <w:szCs w:val="18"/>
-              </w:rPr>
-              <w:t xml:space="preserve">MT-01 passed</w:t>
-            </w:r>
-          </w:p>
-        </w:tc>
-        <w:tc>
-          <w:tcPr>
-            <w:tcW w:type="dxa" w:w="2050"/>
-            <w:tcBorders>
-              <w:top w:val="single" w:color="BFBFBF" w:sz="4"/>
-              <w:left w:val="single" w:color="BFBFBF" w:sz="4"/>
-              <w:bottom w:val="single" w:color="BFBFBF" w:sz="4"/>
-              <w:right w:val="single" w:color="BFBFBF" w:sz="4"/>
-            </w:tcBorders>
-            <w:tcMar>
-              <w:top w:type="dxa" w:w="60"/>
-              <w:left w:type="dxa" w:w="100"/>
-              <w:bottom w:type="dxa" w:w="60"/>
-              <w:right w:type="dxa" w:w="100"/>
-            </w:tcMar>
-          </w:tcPr>
-          <w:p>
-            <w:r>
-              <w:rPr>
-                <w:rFonts w:ascii="Calibri" w:cs="Calibri" w:eastAsia="Calibri" w:hAnsi="Calibri"/>
-                <w:sz w:val="18"/>
-                <w:szCs w:val="18"/>
-              </w:rPr>
-              <w:t xml:space="preserve">1) Create a large job (Postman folder 2) 2) </w:t>
+            <w:tcW w:type="dxa" w:w="1847"/>
+            <w:tcBorders>
+              <w:top w:val="single" w:color="BFBFBF" w:sz="4"/>
+              <w:left w:val="single" w:color="BFBFBF" w:sz="4"/>
+              <w:bottom w:val="single" w:color="BFBFBF" w:sz="4"/>
+              <w:right w:val="single" w:color="BFBFBF" w:sz="4"/>
+            </w:tcBorders>
+            <w:tcMar>
+              <w:top w:type="dxa" w:w="60"/>
+              <w:left w:type="dxa" w:w="100"/>
+              <w:bottom w:type="dxa" w:w="60"/>
+              <w:right w:type="dxa" w:w="100"/>
+            </w:tcMar>
+          </w:tcPr>
+          <w:p>
+            <w:r>
+              <w:rPr>
+                <w:rFonts w:ascii="Calibri" w:cs="Calibri" w:eastAsia="Calibri" w:hAnsi="Calibri"/>
+                <w:sz w:val="18"/>
+                <w:szCs w:val="18"/>
+              </w:rPr>
+              <w:t xml:space="preserve">Passed (2026-10-27): 400 with </w:t>
             </w:r>
             <w:r>
               <w:rPr>
@@ -49945,15 +49835,15 @@
                 <w:sz w:val="16"/>
                 <w:szCs w:val="16"/>
               </w:rPr>
-              <w:t xml:space="preserve">POST /api/jobs/{id}/cancel</w:t>
-            </w:r>
-            <w:r>
-              <w:rPr>
-                <w:rFonts w:ascii="Calibri" w:cs="Calibri" w:eastAsia="Calibri" w:hAnsi="Calibri"/>
-                <w:sz w:val="18"/>
-                <w:szCs w:val="18"/>
-              </w:rPr>
-              <w:t xml:space="preserve"> immediately 3) </w:t>
+              <w:t xml:space="preserve">errors.documents</w:t>
+            </w:r>
+            <w:r>
+              <w:rPr>
+                <w:rFonts w:ascii="Calibri" w:cs="Calibri" w:eastAsia="Calibri" w:hAnsi="Calibri"/>
+                <w:sz w:val="18"/>
+                <w:szCs w:val="18"/>
+              </w:rPr>
+              <w:t xml:space="preserve">, </w:t>
             </w:r>
             <w:r>
               <w:rPr>
@@ -49962,15 +49852,15 @@
                 <w:sz w:val="16"/>
                 <w:szCs w:val="16"/>
               </w:rPr>
-              <w:t xml:space="preserve">GET /api/jobs/{id}</w:t>
-            </w:r>
-            <w:r>
-              <w:rPr>
-                <w:rFonts w:ascii="Calibri" w:cs="Calibri" w:eastAsia="Calibri" w:hAnsi="Calibri"/>
-                <w:sz w:val="18"/>
-                <w:szCs w:val="18"/>
-              </w:rPr>
-              <w:t xml:space="preserve"> and </w:t>
+              <w:t xml:space="preserve">errors["documents[0].content"]</w:t>
+            </w:r>
+            <w:r>
+              <w:rPr>
+                <w:rFonts w:ascii="Calibri" w:cs="Calibri" w:eastAsia="Calibri" w:hAnsi="Calibri"/>
+                <w:sz w:val="18"/>
+                <w:szCs w:val="18"/>
+              </w:rPr>
+              <w:t xml:space="preserve">, </w:t>
             </w:r>
             <w:r>
               <w:rPr>
@@ -49979,34 +49869,125 @@
                 <w:sz w:val="16"/>
                 <w:szCs w:val="16"/>
               </w:rPr>
-              <w:t xml:space="preserve">GET :5002/api/process/{id}</w:t>
-            </w:r>
-          </w:p>
-        </w:tc>
-        <w:tc>
-          <w:tcPr>
-            <w:tcW w:type="dxa" w:w="2050"/>
-            <w:tcBorders>
-              <w:top w:val="single" w:color="BFBFBF" w:sz="4"/>
-              <w:left w:val="single" w:color="BFBFBF" w:sz="4"/>
-              <w:bottom w:val="single" w:color="BFBFBF" w:sz="4"/>
-              <w:right w:val="single" w:color="BFBFBF" w:sz="4"/>
-            </w:tcBorders>
-            <w:tcMar>
-              <w:top w:type="dxa" w:w="60"/>
-              <w:left w:type="dxa" w:w="100"/>
-              <w:bottom w:type="dxa" w:w="60"/>
-              <w:right w:type="dxa" w:w="100"/>
-            </w:tcMar>
-          </w:tcPr>
-          <w:p>
-            <w:r>
-              <w:rPr>
-                <w:rFonts w:ascii="Calibri" w:cs="Calibri" w:eastAsia="Calibri" w:hAnsi="Calibri"/>
-                <w:sz w:val="18"/>
-                <w:szCs w:val="18"/>
-              </w:rPr>
-              <w:t xml:space="preserve">202; job </w:t>
+              <w:t xml:space="preserve">errors["documents[0].name"]</w:t>
+            </w:r>
+            <w:r>
+              <w:rPr>
+                <w:rFonts w:ascii="Calibri" w:cs="Calibri" w:eastAsia="Calibri" w:hAnsi="Calibri"/>
+                <w:sz w:val="18"/>
+                <w:szCs w:val="18"/>
+              </w:rPr>
+              <w:t xml:space="preserve">; an empty document → 201</w:t>
+            </w:r>
+          </w:p>
+        </w:tc>
+      </w:tr>
+      <w:tr>
+        <w:tc>
+          <w:tcPr>
+            <w:tcW w:type="dxa" w:w="461"/>
+            <w:tcBorders>
+              <w:top w:val="single" w:color="BFBFBF" w:sz="4"/>
+              <w:left w:val="single" w:color="BFBFBF" w:sz="4"/>
+              <w:bottom w:val="single" w:color="BFBFBF" w:sz="4"/>
+              <w:right w:val="single" w:color="BFBFBF" w:sz="4"/>
+            </w:tcBorders>
+            <w:tcMar>
+              <w:top w:type="dxa" w:w="60"/>
+              <w:left w:type="dxa" w:w="100"/>
+              <w:bottom w:type="dxa" w:w="60"/>
+              <w:right w:type="dxa" w:w="100"/>
+            </w:tcMar>
+          </w:tcPr>
+          <w:p>
+            <w:r>
+              <w:rPr>
+                <w:rFonts w:ascii="Calibri" w:cs="Calibri" w:eastAsia="Calibri" w:hAnsi="Calibri"/>
+                <w:sz w:val="18"/>
+                <w:szCs w:val="18"/>
+              </w:rPr>
+              <w:t xml:space="preserve">MT-06</w:t>
+            </w:r>
+          </w:p>
+        </w:tc>
+        <w:tc>
+          <w:tcPr>
+            <w:tcW w:type="dxa" w:w="1798"/>
+            <w:tcBorders>
+              <w:top w:val="single" w:color="BFBFBF" w:sz="4"/>
+              <w:left w:val="single" w:color="BFBFBF" w:sz="4"/>
+              <w:bottom w:val="single" w:color="BFBFBF" w:sz="4"/>
+              <w:right w:val="single" w:color="BFBFBF" w:sz="4"/>
+            </w:tcBorders>
+            <w:tcMar>
+              <w:top w:type="dxa" w:w="60"/>
+              <w:left w:type="dxa" w:w="100"/>
+              <w:bottom w:type="dxa" w:w="60"/>
+              <w:right w:type="dxa" w:w="100"/>
+            </w:tcMar>
+          </w:tcPr>
+          <w:p>
+            <w:r>
+              <w:rPr>
+                <w:rFonts w:ascii="Calibri" w:cs="Calibri" w:eastAsia="Calibri" w:hAnsi="Calibri"/>
+                <w:sz w:val="18"/>
+                <w:szCs w:val="18"/>
+              </w:rPr>
+              <w:t xml:space="preserve">Cancel a running job</w:t>
+            </w:r>
+          </w:p>
+        </w:tc>
+        <w:tc>
+          <w:tcPr>
+            <w:tcW w:type="dxa" w:w="1844"/>
+            <w:tcBorders>
+              <w:top w:val="single" w:color="BFBFBF" w:sz="4"/>
+              <w:left w:val="single" w:color="BFBFBF" w:sz="4"/>
+              <w:bottom w:val="single" w:color="BFBFBF" w:sz="4"/>
+              <w:right w:val="single" w:color="BFBFBF" w:sz="4"/>
+            </w:tcBorders>
+            <w:tcMar>
+              <w:top w:type="dxa" w:w="60"/>
+              <w:left w:type="dxa" w:w="100"/>
+              <w:bottom w:type="dxa" w:w="60"/>
+              <w:right w:type="dxa" w:w="100"/>
+            </w:tcMar>
+          </w:tcPr>
+          <w:p>
+            <w:r>
+              <w:rPr>
+                <w:rFonts w:ascii="Calibri" w:cs="Calibri" w:eastAsia="Calibri" w:hAnsi="Calibri"/>
+                <w:sz w:val="18"/>
+                <w:szCs w:val="18"/>
+              </w:rPr>
+              <w:t xml:space="preserve">MT-01 passed</w:t>
+            </w:r>
+          </w:p>
+        </w:tc>
+        <w:tc>
+          <w:tcPr>
+            <w:tcW w:type="dxa" w:w="1844"/>
+            <w:tcBorders>
+              <w:top w:val="single" w:color="BFBFBF" w:sz="4"/>
+              <w:left w:val="single" w:color="BFBFBF" w:sz="4"/>
+              <w:bottom w:val="single" w:color="BFBFBF" w:sz="4"/>
+              <w:right w:val="single" w:color="BFBFBF" w:sz="4"/>
+            </w:tcBorders>
+            <w:tcMar>
+              <w:top w:type="dxa" w:w="60"/>
+              <w:left w:type="dxa" w:w="100"/>
+              <w:bottom w:type="dxa" w:w="60"/>
+              <w:right w:type="dxa" w:w="100"/>
+            </w:tcMar>
+          </w:tcPr>
+          <w:p>
+            <w:r>
+              <w:rPr>
+                <w:rFonts w:ascii="Calibri" w:cs="Calibri" w:eastAsia="Calibri" w:hAnsi="Calibri"/>
+                <w:sz w:val="18"/>
+                <w:szCs w:val="18"/>
+              </w:rPr>
+              <w:t xml:space="preserve">1) Create a job of 1,000 documents 2) </w:t>
             </w:r>
             <w:r>
               <w:rPr>
@@ -50015,15 +49996,15 @@
                 <w:sz w:val="16"/>
                 <w:szCs w:val="16"/>
               </w:rPr>
-              <w:t xml:space="preserve">Cancelled</w:t>
-            </w:r>
-            <w:r>
-              <w:rPr>
-                <w:rFonts w:ascii="Calibri" w:cs="Calibri" w:eastAsia="Calibri" w:hAnsi="Calibri"/>
-                <w:sz w:val="18"/>
-                <w:szCs w:val="18"/>
-              </w:rPr>
-              <w:t xml:space="preserve"> in both services; audit entry </w:t>
+              <w:t xml:space="preserve">POST /api/jobs/{id}/cancel</w:t>
+            </w:r>
+            <w:r>
+              <w:rPr>
+                <w:rFonts w:ascii="Calibri" w:cs="Calibri" w:eastAsia="Calibri" w:hAnsi="Calibri"/>
+                <w:sz w:val="18"/>
+                <w:szCs w:val="18"/>
+              </w:rPr>
+              <w:t xml:space="preserve"> immediately 3) </w:t>
             </w:r>
             <w:r>
               <w:rPr>
@@ -50032,152 +50013,15 @@
                 <w:sz w:val="16"/>
                 <w:szCs w:val="16"/>
               </w:rPr>
-              <w:t xml:space="preserve">Cancelled</w:t>
-            </w:r>
-            <w:r>
-              <w:rPr>
-                <w:rFonts w:ascii="Calibri" w:cs="Calibri" w:eastAsia="Calibri" w:hAnsi="Calibri"/>
-                <w:sz w:val="18"/>
-                <w:szCs w:val="18"/>
-              </w:rPr>
-              <w:t xml:space="preserve">; no later status change</w:t>
-            </w:r>
-          </w:p>
-        </w:tc>
-        <w:tc>
-          <w:tcPr>
-            <w:tcW w:type="dxa" w:w="977"/>
-            <w:tcBorders>
-              <w:top w:val="single" w:color="BFBFBF" w:sz="4"/>
-              <w:left w:val="single" w:color="BFBFBF" w:sz="4"/>
-              <w:bottom w:val="single" w:color="BFBFBF" w:sz="4"/>
-              <w:right w:val="single" w:color="BFBFBF" w:sz="4"/>
-            </w:tcBorders>
-            <w:tcMar>
-              <w:top w:type="dxa" w:w="60"/>
-              <w:left w:type="dxa" w:w="100"/>
-              <w:bottom w:type="dxa" w:w="60"/>
-              <w:right w:type="dxa" w:w="100"/>
-            </w:tcMar>
-          </w:tcPr>
-          <w:p>
-            <w:r>
-              <w:rPr>
-                <w:rFonts w:ascii="Calibri" w:cs="Calibri" w:eastAsia="Calibri" w:hAnsi="Calibri"/>
-                <w:sz w:val="18"/>
-                <w:szCs w:val="18"/>
-              </w:rPr>
-              <w:t xml:space="preserve">Not yet executed</w:t>
-            </w:r>
-          </w:p>
-        </w:tc>
-      </w:tr>
-      <w:tr>
-        <w:tc>
-          <w:tcPr>
-            <w:tcW w:type="dxa" w:w="512"/>
-            <w:tcBorders>
-              <w:top w:val="single" w:color="BFBFBF" w:sz="4"/>
-              <w:left w:val="single" w:color="BFBFBF" w:sz="4"/>
-              <w:bottom w:val="single" w:color="BFBFBF" w:sz="4"/>
-              <w:right w:val="single" w:color="BFBFBF" w:sz="4"/>
-            </w:tcBorders>
-            <w:tcMar>
-              <w:top w:type="dxa" w:w="60"/>
-              <w:left w:type="dxa" w:w="100"/>
-              <w:bottom w:type="dxa" w:w="60"/>
-              <w:right w:type="dxa" w:w="100"/>
-            </w:tcMar>
-          </w:tcPr>
-          <w:p>
-            <w:r>
-              <w:rPr>
-                <w:rFonts w:ascii="Calibri" w:cs="Calibri" w:eastAsia="Calibri" w:hAnsi="Calibri"/>
-                <w:sz w:val="18"/>
-                <w:szCs w:val="18"/>
-              </w:rPr>
-              <w:t xml:space="preserve">MT-07</w:t>
-            </w:r>
-          </w:p>
-        </w:tc>
-        <w:tc>
-          <w:tcPr>
-            <w:tcW w:type="dxa" w:w="1999"/>
-            <w:tcBorders>
-              <w:top w:val="single" w:color="BFBFBF" w:sz="4"/>
-              <w:left w:val="single" w:color="BFBFBF" w:sz="4"/>
-              <w:bottom w:val="single" w:color="BFBFBF" w:sz="4"/>
-              <w:right w:val="single" w:color="BFBFBF" w:sz="4"/>
-            </w:tcBorders>
-            <w:tcMar>
-              <w:top w:type="dxa" w:w="60"/>
-              <w:left w:type="dxa" w:w="100"/>
-              <w:bottom w:type="dxa" w:w="60"/>
-              <w:right w:type="dxa" w:w="100"/>
-            </w:tcMar>
-          </w:tcPr>
-          <w:p>
-            <w:r>
-              <w:rPr>
-                <w:rFonts w:ascii="Calibri" w:cs="Calibri" w:eastAsia="Calibri" w:hAnsi="Calibri"/>
-                <w:sz w:val="18"/>
-                <w:szCs w:val="18"/>
-              </w:rPr>
-              <w:t xml:space="preserve">WebSocket reconnect and replay</w:t>
-            </w:r>
-          </w:p>
-        </w:tc>
-        <w:tc>
-          <w:tcPr>
-            <w:tcW w:type="dxa" w:w="2050"/>
-            <w:tcBorders>
-              <w:top w:val="single" w:color="BFBFBF" w:sz="4"/>
-              <w:left w:val="single" w:color="BFBFBF" w:sz="4"/>
-              <w:bottom w:val="single" w:color="BFBFBF" w:sz="4"/>
-              <w:right w:val="single" w:color="BFBFBF" w:sz="4"/>
-            </w:tcBorders>
-            <w:tcMar>
-              <w:top w:type="dxa" w:w="60"/>
-              <w:left w:type="dxa" w:w="100"/>
-              <w:bottom w:type="dxa" w:w="60"/>
-              <w:right w:type="dxa" w:w="100"/>
-            </w:tcMar>
-          </w:tcPr>
-          <w:p>
-            <w:r>
-              <w:rPr>
-                <w:rFonts w:ascii="Calibri" w:cs="Calibri" w:eastAsia="Calibri" w:hAnsi="Calibri"/>
-                <w:sz w:val="18"/>
-                <w:szCs w:val="18"/>
-              </w:rPr>
-              <w:t xml:space="preserve">MT-01 passed</w:t>
-            </w:r>
-          </w:p>
-        </w:tc>
-        <w:tc>
-          <w:tcPr>
-            <w:tcW w:type="dxa" w:w="2050"/>
-            <w:tcBorders>
-              <w:top w:val="single" w:color="BFBFBF" w:sz="4"/>
-              <w:left w:val="single" w:color="BFBFBF" w:sz="4"/>
-              <w:bottom w:val="single" w:color="BFBFBF" w:sz="4"/>
-              <w:right w:val="single" w:color="BFBFBF" w:sz="4"/>
-            </w:tcBorders>
-            <w:tcMar>
-              <w:top w:type="dxa" w:w="60"/>
-              <w:left w:type="dxa" w:w="100"/>
-              <w:bottom w:type="dxa" w:w="60"/>
-              <w:right w:type="dxa" w:w="100"/>
-            </w:tcMar>
-          </w:tcPr>
-          <w:p>
-            <w:r>
-              <w:rPr>
-                <w:rFonts w:ascii="Calibri" w:cs="Calibri" w:eastAsia="Calibri" w:hAnsi="Calibri"/>
-                <w:sz w:val="18"/>
-                <w:szCs w:val="18"/>
-              </w:rPr>
-              <w:t xml:space="preserve">1) Start a job 2) </w:t>
+              <w:t xml:space="preserve">GET /api/jobs/{id}</w:t>
+            </w:r>
+            <w:r>
+              <w:rPr>
+                <w:rFonts w:ascii="Calibri" w:cs="Calibri" w:eastAsia="Calibri" w:hAnsi="Calibri"/>
+                <w:sz w:val="18"/>
+                <w:szCs w:val="18"/>
+              </w:rPr>
+              <w:t xml:space="preserve">, </w:t>
             </w:r>
             <w:r>
               <w:rPr>
@@ -50186,15 +50030,15 @@
                 <w:sz w:val="16"/>
                 <w:szCs w:val="16"/>
               </w:rPr>
-              <w:t xml:space="preserve">docker compose restart job-service</w:t>
-            </w:r>
-            <w:r>
-              <w:rPr>
-                <w:rFonts w:ascii="Calibri" w:cs="Calibri" w:eastAsia="Calibri" w:hAnsi="Calibri"/>
-                <w:sz w:val="18"/>
-                <w:szCs w:val="18"/>
-              </w:rPr>
-              <w:t xml:space="preserve"> 3) </w:t>
+              <w:t xml:space="preserve">GET :5002/api/process/{id}</w:t>
+            </w:r>
+            <w:r>
+              <w:rPr>
+                <w:rFonts w:ascii="Calibri" w:cs="Calibri" w:eastAsia="Calibri" w:hAnsi="Calibri"/>
+                <w:sz w:val="18"/>
+                <w:szCs w:val="18"/>
+              </w:rPr>
+              <w:t xml:space="preserve">, </w:t>
             </w:r>
             <w:r>
               <w:rPr>
@@ -50203,34 +50047,88 @@
                 <w:sz w:val="16"/>
                 <w:szCs w:val="16"/>
               </w:rPr>
-              <w:t xml:space="preserve">docker compose logs -f processor-service</w:t>
-            </w:r>
-          </w:p>
-        </w:tc>
-        <w:tc>
-          <w:tcPr>
-            <w:tcW w:type="dxa" w:w="2050"/>
-            <w:tcBorders>
-              <w:top w:val="single" w:color="BFBFBF" w:sz="4"/>
-              <w:left w:val="single" w:color="BFBFBF" w:sz="4"/>
-              <w:bottom w:val="single" w:color="BFBFBF" w:sz="4"/>
-              <w:right w:val="single" w:color="BFBFBF" w:sz="4"/>
-            </w:tcBorders>
-            <w:tcMar>
-              <w:top w:type="dxa" w:w="60"/>
-              <w:left w:type="dxa" w:w="100"/>
-              <w:bottom w:type="dxa" w:w="60"/>
-              <w:right w:type="dxa" w:w="100"/>
-            </w:tcMar>
-          </w:tcPr>
-          <w:p>
-            <w:r>
-              <w:rPr>
-                <w:rFonts w:ascii="Calibri" w:cs="Calibri" w:eastAsia="Calibri" w:hAnsi="Calibri"/>
-                <w:sz w:val="18"/>
-                <w:szCs w:val="18"/>
-              </w:rPr>
-              <w:t xml:space="preserve">Processor logs </w:t>
+              <w:t xml:space="preserve">GET :5003/api/audit/{id}</w:t>
+            </w:r>
+          </w:p>
+        </w:tc>
+        <w:tc>
+          <w:tcPr>
+            <w:tcW w:type="dxa" w:w="1844"/>
+            <w:tcBorders>
+              <w:top w:val="single" w:color="BFBFBF" w:sz="4"/>
+              <w:left w:val="single" w:color="BFBFBF" w:sz="4"/>
+              <w:bottom w:val="single" w:color="BFBFBF" w:sz="4"/>
+              <w:right w:val="single" w:color="BFBFBF" w:sz="4"/>
+            </w:tcBorders>
+            <w:tcMar>
+              <w:top w:type="dxa" w:w="60"/>
+              <w:left w:type="dxa" w:w="100"/>
+              <w:bottom w:type="dxa" w:w="60"/>
+              <w:right w:type="dxa" w:w="100"/>
+            </w:tcMar>
+          </w:tcPr>
+          <w:p>
+            <w:r>
+              <w:rPr>
+                <w:rFonts w:ascii="Calibri" w:cs="Calibri" w:eastAsia="Calibri" w:hAnsi="Calibri"/>
+                <w:sz w:val="18"/>
+                <w:szCs w:val="18"/>
+              </w:rPr>
+              <w:t xml:space="preserve">202; job </w:t>
+            </w:r>
+            <w:r>
+              <w:rPr>
+                <w:rFonts w:ascii="Calibri" w:cs="Calibri" w:eastAsia="Calibri" w:hAnsi="Calibri"/>
+                <w:b/>
+                <w:bCs/>
+                <w:sz w:val="18"/>
+                <w:szCs w:val="18"/>
+              </w:rPr>
+              <w:t xml:space="preserve">Cancelled</w:t>
+            </w:r>
+            <w:r>
+              <w:rPr>
+                <w:rFonts w:ascii="Calibri" w:cs="Calibri" w:eastAsia="Calibri" w:hAnsi="Calibri"/>
+                <w:sz w:val="18"/>
+                <w:szCs w:val="18"/>
+              </w:rPr>
+              <w:t xml:space="preserve"> in the Job Service (the source of truth) and in the audit entry; it never changes afterwards. On the Processor the job is </w:t>
+            </w:r>
+            <w:r>
+              <w:rPr>
+                <w:rFonts w:ascii="Calibri" w:cs="Calibri" w:eastAsia="Calibri" w:hAnsi="Calibri"/>
+                <w:i/>
+                <w:iCs/>
+                <w:sz w:val="18"/>
+                <w:szCs w:val="18"/>
+              </w:rPr>
+              <w:t xml:space="preserve">Cancelled</w:t>
+            </w:r>
+            <w:r>
+              <w:rPr>
+                <w:rFonts w:ascii="Calibri" w:cs="Calibri" w:eastAsia="Calibri" w:hAnsi="Calibri"/>
+                <w:sz w:val="18"/>
+                <w:szCs w:val="18"/>
+              </w:rPr>
+              <w:t xml:space="preserve">, or </w:t>
+            </w:r>
+            <w:r>
+              <w:rPr>
+                <w:rFonts w:ascii="Calibri" w:cs="Calibri" w:eastAsia="Calibri" w:hAnsi="Calibri"/>
+                <w:i/>
+                <w:iCs/>
+                <w:sz w:val="18"/>
+                <w:szCs w:val="18"/>
+              </w:rPr>
+              <w:t xml:space="preserve">Completed</w:t>
+            </w:r>
+            <w:r>
+              <w:rPr>
+                <w:rFonts w:ascii="Calibri" w:cs="Calibri" w:eastAsia="Calibri" w:hAnsi="Calibri"/>
+                <w:sz w:val="18"/>
+                <w:szCs w:val="18"/>
+              </w:rPr>
+              <w:t xml:space="preserve"> if it finished before the cancel request arrived (cancel there is best effort; the late </w:t>
             </w:r>
             <w:r>
               <w:rPr>
@@ -50239,15 +50137,152 @@
                 <w:sz w:val="16"/>
                 <w:szCs w:val="16"/>
               </w:rPr>
-              <w:t xml:space="preserve">connection failed (attempt N)</w:t>
-            </w:r>
-            <w:r>
-              <w:rPr>
-                <w:rFonts w:ascii="Calibri" w:cs="Calibri" w:eastAsia="Calibri" w:hAnsi="Calibri"/>
-                <w:sz w:val="18"/>
-                <w:szCs w:val="18"/>
-              </w:rPr>
-              <w:t xml:space="preserve"> then </w:t>
+              <w:t xml:space="preserve">JobCompleted</w:t>
+            </w:r>
+            <w:r>
+              <w:rPr>
+                <w:rFonts w:ascii="Calibri" w:cs="Calibri" w:eastAsia="Calibri" w:hAnsi="Calibri"/>
+                <w:sz w:val="18"/>
+                <w:szCs w:val="18"/>
+              </w:rPr>
+              <w:t xml:space="preserve"> is ignored by the state machine)</w:t>
+            </w:r>
+          </w:p>
+        </w:tc>
+        <w:tc>
+          <w:tcPr>
+            <w:tcW w:type="dxa" w:w="1847"/>
+            <w:tcBorders>
+              <w:top w:val="single" w:color="BFBFBF" w:sz="4"/>
+              <w:left w:val="single" w:color="BFBFBF" w:sz="4"/>
+              <w:bottom w:val="single" w:color="BFBFBF" w:sz="4"/>
+              <w:right w:val="single" w:color="BFBFBF" w:sz="4"/>
+            </w:tcBorders>
+            <w:tcMar>
+              <w:top w:type="dxa" w:w="60"/>
+              <w:left w:type="dxa" w:w="100"/>
+              <w:bottom w:type="dxa" w:w="60"/>
+              <w:right w:type="dxa" w:w="100"/>
+            </w:tcMar>
+          </w:tcPr>
+          <w:p>
+            <w:r>
+              <w:rPr>
+                <w:rFonts w:ascii="Calibri" w:cs="Calibri" w:eastAsia="Calibri" w:hAnsi="Calibri"/>
+                <w:sz w:val="18"/>
+                <w:szCs w:val="18"/>
+              </w:rPr>
+              <w:t xml:space="preserve">Passed (2026-10-27): 202; Job Service Cancelled at 500 / 1,000; Processor Completed (the race above); audit Cancelled</w:t>
+            </w:r>
+          </w:p>
+        </w:tc>
+      </w:tr>
+      <w:tr>
+        <w:tc>
+          <w:tcPr>
+            <w:tcW w:type="dxa" w:w="461"/>
+            <w:tcBorders>
+              <w:top w:val="single" w:color="BFBFBF" w:sz="4"/>
+              <w:left w:val="single" w:color="BFBFBF" w:sz="4"/>
+              <w:bottom w:val="single" w:color="BFBFBF" w:sz="4"/>
+              <w:right w:val="single" w:color="BFBFBF" w:sz="4"/>
+            </w:tcBorders>
+            <w:tcMar>
+              <w:top w:type="dxa" w:w="60"/>
+              <w:left w:type="dxa" w:w="100"/>
+              <w:bottom w:type="dxa" w:w="60"/>
+              <w:right w:type="dxa" w:w="100"/>
+            </w:tcMar>
+          </w:tcPr>
+          <w:p>
+            <w:r>
+              <w:rPr>
+                <w:rFonts w:ascii="Calibri" w:cs="Calibri" w:eastAsia="Calibri" w:hAnsi="Calibri"/>
+                <w:sz w:val="18"/>
+                <w:szCs w:val="18"/>
+              </w:rPr>
+              <w:t xml:space="preserve">MT-07</w:t>
+            </w:r>
+          </w:p>
+        </w:tc>
+        <w:tc>
+          <w:tcPr>
+            <w:tcW w:type="dxa" w:w="1798"/>
+            <w:tcBorders>
+              <w:top w:val="single" w:color="BFBFBF" w:sz="4"/>
+              <w:left w:val="single" w:color="BFBFBF" w:sz="4"/>
+              <w:bottom w:val="single" w:color="BFBFBF" w:sz="4"/>
+              <w:right w:val="single" w:color="BFBFBF" w:sz="4"/>
+            </w:tcBorders>
+            <w:tcMar>
+              <w:top w:type="dxa" w:w="60"/>
+              <w:left w:type="dxa" w:w="100"/>
+              <w:bottom w:type="dxa" w:w="60"/>
+              <w:right w:type="dxa" w:w="100"/>
+            </w:tcMar>
+          </w:tcPr>
+          <w:p>
+            <w:r>
+              <w:rPr>
+                <w:rFonts w:ascii="Calibri" w:cs="Calibri" w:eastAsia="Calibri" w:hAnsi="Calibri"/>
+                <w:sz w:val="18"/>
+                <w:szCs w:val="18"/>
+              </w:rPr>
+              <w:t xml:space="preserve">WebSocket reconnect and replay</w:t>
+            </w:r>
+          </w:p>
+        </w:tc>
+        <w:tc>
+          <w:tcPr>
+            <w:tcW w:type="dxa" w:w="1844"/>
+            <w:tcBorders>
+              <w:top w:val="single" w:color="BFBFBF" w:sz="4"/>
+              <w:left w:val="single" w:color="BFBFBF" w:sz="4"/>
+              <w:bottom w:val="single" w:color="BFBFBF" w:sz="4"/>
+              <w:right w:val="single" w:color="BFBFBF" w:sz="4"/>
+            </w:tcBorders>
+            <w:tcMar>
+              <w:top w:type="dxa" w:w="60"/>
+              <w:left w:type="dxa" w:w="100"/>
+              <w:bottom w:type="dxa" w:w="60"/>
+              <w:right w:type="dxa" w:w="100"/>
+            </w:tcMar>
+          </w:tcPr>
+          <w:p>
+            <w:r>
+              <w:rPr>
+                <w:rFonts w:ascii="Calibri" w:cs="Calibri" w:eastAsia="Calibri" w:hAnsi="Calibri"/>
+                <w:sz w:val="18"/>
+                <w:szCs w:val="18"/>
+              </w:rPr>
+              <w:t xml:space="preserve">MT-01 passed</w:t>
+            </w:r>
+          </w:p>
+        </w:tc>
+        <w:tc>
+          <w:tcPr>
+            <w:tcW w:type="dxa" w:w="1844"/>
+            <w:tcBorders>
+              <w:top w:val="single" w:color="BFBFBF" w:sz="4"/>
+              <w:left w:val="single" w:color="BFBFBF" w:sz="4"/>
+              <w:bottom w:val="single" w:color="BFBFBF" w:sz="4"/>
+              <w:right w:val="single" w:color="BFBFBF" w:sz="4"/>
+            </w:tcBorders>
+            <w:tcMar>
+              <w:top w:type="dxa" w:w="60"/>
+              <w:left w:type="dxa" w:w="100"/>
+              <w:bottom w:type="dxa" w:w="60"/>
+              <w:right w:type="dxa" w:w="100"/>
+            </w:tcMar>
+          </w:tcPr>
+          <w:p>
+            <w:r>
+              <w:rPr>
+                <w:rFonts w:ascii="Calibri" w:cs="Calibri" w:eastAsia="Calibri" w:hAnsi="Calibri"/>
+                <w:sz w:val="18"/>
+                <w:szCs w:val="18"/>
+              </w:rPr>
+              <w:t xml:space="preserve">1) Start a job 2) </w:t>
             </w:r>
             <w:r>
               <w:rPr>
@@ -50256,152 +50291,15 @@
                 <w:sz w:val="16"/>
                 <w:szCs w:val="16"/>
               </w:rPr>
-              <w:t xml:space="preserve">Connected … N events pending</w:t>
-            </w:r>
-            <w:r>
-              <w:rPr>
-                <w:rFonts w:ascii="Calibri" w:cs="Calibri" w:eastAsia="Calibri" w:hAnsi="Calibri"/>
-                <w:sz w:val="18"/>
-                <w:szCs w:val="18"/>
-              </w:rPr>
-              <w:t xml:space="preserve">; job ends Completed; no event lost</w:t>
-            </w:r>
-          </w:p>
-        </w:tc>
-        <w:tc>
-          <w:tcPr>
-            <w:tcW w:type="dxa" w:w="977"/>
-            <w:tcBorders>
-              <w:top w:val="single" w:color="BFBFBF" w:sz="4"/>
-              <w:left w:val="single" w:color="BFBFBF" w:sz="4"/>
-              <w:bottom w:val="single" w:color="BFBFBF" w:sz="4"/>
-              <w:right w:val="single" w:color="BFBFBF" w:sz="4"/>
-            </w:tcBorders>
-            <w:tcMar>
-              <w:top w:type="dxa" w:w="60"/>
-              <w:left w:type="dxa" w:w="100"/>
-              <w:bottom w:type="dxa" w:w="60"/>
-              <w:right w:type="dxa" w:w="100"/>
-            </w:tcMar>
-          </w:tcPr>
-          <w:p>
-            <w:r>
-              <w:rPr>
-                <w:rFonts w:ascii="Calibri" w:cs="Calibri" w:eastAsia="Calibri" w:hAnsi="Calibri"/>
-                <w:sz w:val="18"/>
-                <w:szCs w:val="18"/>
-              </w:rPr>
-              <w:t xml:space="preserve">Not yet executed</w:t>
-            </w:r>
-          </w:p>
-        </w:tc>
-      </w:tr>
-      <w:tr>
-        <w:tc>
-          <w:tcPr>
-            <w:tcW w:type="dxa" w:w="512"/>
-            <w:tcBorders>
-              <w:top w:val="single" w:color="BFBFBF" w:sz="4"/>
-              <w:left w:val="single" w:color="BFBFBF" w:sz="4"/>
-              <w:bottom w:val="single" w:color="BFBFBF" w:sz="4"/>
-              <w:right w:val="single" w:color="BFBFBF" w:sz="4"/>
-            </w:tcBorders>
-            <w:tcMar>
-              <w:top w:type="dxa" w:w="60"/>
-              <w:left w:type="dxa" w:w="100"/>
-              <w:bottom w:type="dxa" w:w="60"/>
-              <w:right w:type="dxa" w:w="100"/>
-            </w:tcMar>
-          </w:tcPr>
-          <w:p>
-            <w:r>
-              <w:rPr>
-                <w:rFonts w:ascii="Calibri" w:cs="Calibri" w:eastAsia="Calibri" w:hAnsi="Calibri"/>
-                <w:sz w:val="18"/>
-                <w:szCs w:val="18"/>
-              </w:rPr>
-              <w:t xml:space="preserve">MT-08</w:t>
-            </w:r>
-          </w:p>
-        </w:tc>
-        <w:tc>
-          <w:tcPr>
-            <w:tcW w:type="dxa" w:w="1999"/>
-            <w:tcBorders>
-              <w:top w:val="single" w:color="BFBFBF" w:sz="4"/>
-              <w:left w:val="single" w:color="BFBFBF" w:sz="4"/>
-              <w:bottom w:val="single" w:color="BFBFBF" w:sz="4"/>
-              <w:right w:val="single" w:color="BFBFBF" w:sz="4"/>
-            </w:tcBorders>
-            <w:tcMar>
-              <w:top w:type="dxa" w:w="60"/>
-              <w:left w:type="dxa" w:w="100"/>
-              <w:bottom w:type="dxa" w:w="60"/>
-              <w:right w:type="dxa" w:w="100"/>
-            </w:tcMar>
-          </w:tcPr>
-          <w:p>
-            <w:r>
-              <w:rPr>
-                <w:rFonts w:ascii="Calibri" w:cs="Calibri" w:eastAsia="Calibri" w:hAnsi="Calibri"/>
-                <w:sz w:val="18"/>
-                <w:szCs w:val="18"/>
-              </w:rPr>
-              <w:t xml:space="preserve">Processor restart mid-job</w:t>
-            </w:r>
-          </w:p>
-        </w:tc>
-        <w:tc>
-          <w:tcPr>
-            <w:tcW w:type="dxa" w:w="2050"/>
-            <w:tcBorders>
-              <w:top w:val="single" w:color="BFBFBF" w:sz="4"/>
-              <w:left w:val="single" w:color="BFBFBF" w:sz="4"/>
-              <w:bottom w:val="single" w:color="BFBFBF" w:sz="4"/>
-              <w:right w:val="single" w:color="BFBFBF" w:sz="4"/>
-            </w:tcBorders>
-            <w:tcMar>
-              <w:top w:type="dxa" w:w="60"/>
-              <w:left w:type="dxa" w:w="100"/>
-              <w:bottom w:type="dxa" w:w="60"/>
-              <w:right w:type="dxa" w:w="100"/>
-            </w:tcMar>
-          </w:tcPr>
-          <w:p>
-            <w:r>
-              <w:rPr>
-                <w:rFonts w:ascii="Calibri" w:cs="Calibri" w:eastAsia="Calibri" w:hAnsi="Calibri"/>
-                <w:sz w:val="18"/>
-                <w:szCs w:val="18"/>
-              </w:rPr>
-              <w:t xml:space="preserve">MT-01 passed</w:t>
-            </w:r>
-          </w:p>
-        </w:tc>
-        <w:tc>
-          <w:tcPr>
-            <w:tcW w:type="dxa" w:w="2050"/>
-            <w:tcBorders>
-              <w:top w:val="single" w:color="BFBFBF" w:sz="4"/>
-              <w:left w:val="single" w:color="BFBFBF" w:sz="4"/>
-              <w:bottom w:val="single" w:color="BFBFBF" w:sz="4"/>
-              <w:right w:val="single" w:color="BFBFBF" w:sz="4"/>
-            </w:tcBorders>
-            <w:tcMar>
-              <w:top w:type="dxa" w:w="60"/>
-              <w:left w:type="dxa" w:w="100"/>
-              <w:bottom w:type="dxa" w:w="60"/>
-              <w:right w:type="dxa" w:w="100"/>
-            </w:tcMar>
-          </w:tcPr>
-          <w:p>
-            <w:r>
-              <w:rPr>
-                <w:rFonts w:ascii="Calibri" w:cs="Calibri" w:eastAsia="Calibri" w:hAnsi="Calibri"/>
-                <w:sz w:val="18"/>
-                <w:szCs w:val="18"/>
-              </w:rPr>
-              <w:t xml:space="preserve">1) Start the 10 × 1,000 load 2) </w:t>
+              <w:t xml:space="preserve">docker compose restart job-service</w:t>
+            </w:r>
+            <w:r>
+              <w:rPr>
+                <w:rFonts w:ascii="Calibri" w:cs="Calibri" w:eastAsia="Calibri" w:hAnsi="Calibri"/>
+                <w:sz w:val="18"/>
+                <w:szCs w:val="18"/>
+              </w:rPr>
+              <w:t xml:space="preserve"> 3) </w:t>
             </w:r>
             <w:r>
               <w:rPr>
@@ -50410,15 +50308,34 @@
                 <w:sz w:val="16"/>
                 <w:szCs w:val="16"/>
               </w:rPr>
-              <w:t xml:space="preserve">docker compose restart processor-service</w:t>
-            </w:r>
-            <w:r>
-              <w:rPr>
-                <w:rFonts w:ascii="Calibri" w:cs="Calibri" w:eastAsia="Calibri" w:hAnsi="Calibri"/>
-                <w:sz w:val="18"/>
-                <w:szCs w:val="18"/>
-              </w:rPr>
-              <w:t xml:space="preserve"> while jobs are Processing 3) Watch </w:t>
+              <w:t xml:space="preserve">docker compose logs -f processor-service</w:t>
+            </w:r>
+          </w:p>
+        </w:tc>
+        <w:tc>
+          <w:tcPr>
+            <w:tcW w:type="dxa" w:w="1844"/>
+            <w:tcBorders>
+              <w:top w:val="single" w:color="BFBFBF" w:sz="4"/>
+              <w:left w:val="single" w:color="BFBFBF" w:sz="4"/>
+              <w:bottom w:val="single" w:color="BFBFBF" w:sz="4"/>
+              <w:right w:val="single" w:color="BFBFBF" w:sz="4"/>
+            </w:tcBorders>
+            <w:tcMar>
+              <w:top w:type="dxa" w:w="60"/>
+              <w:left w:type="dxa" w:w="100"/>
+              <w:bottom w:type="dxa" w:w="60"/>
+              <w:right w:type="dxa" w:w="100"/>
+            </w:tcMar>
+          </w:tcPr>
+          <w:p>
+            <w:r>
+              <w:rPr>
+                <w:rFonts w:ascii="Calibri" w:cs="Calibri" w:eastAsia="Calibri" w:hAnsi="Calibri"/>
+                <w:sz w:val="18"/>
+                <w:szCs w:val="18"/>
+              </w:rPr>
+              <w:t xml:space="preserve">Processor logs </w:t>
             </w:r>
             <w:r>
               <w:rPr>
@@ -50427,171 +50344,15 @@
                 <w:sz w:val="16"/>
                 <w:szCs w:val="16"/>
               </w:rPr>
-              <w:t xml:space="preserve">GET /api/jobs?status=Processing</w:t>
-            </w:r>
-          </w:p>
-        </w:tc>
-        <w:tc>
-          <w:tcPr>
-            <w:tcW w:type="dxa" w:w="2050"/>
-            <w:tcBorders>
-              <w:top w:val="single" w:color="BFBFBF" w:sz="4"/>
-              <w:left w:val="single" w:color="BFBFBF" w:sz="4"/>
-              <w:bottom w:val="single" w:color="BFBFBF" w:sz="4"/>
-              <w:right w:val="single" w:color="BFBFBF" w:sz="4"/>
-            </w:tcBorders>
-            <w:tcMar>
-              <w:top w:type="dxa" w:w="60"/>
-              <w:left w:type="dxa" w:w="100"/>
-              <w:bottom w:type="dxa" w:w="60"/>
-              <w:right w:type="dxa" w:w="100"/>
-            </w:tcMar>
-          </w:tcPr>
-          <w:p>
-            <w:r>
-              <w:rPr>
-                <w:rFonts w:ascii="Calibri" w:cs="Calibri" w:eastAsia="Calibri" w:hAnsi="Calibri"/>
-                <w:sz w:val="18"/>
-                <w:szCs w:val="18"/>
-              </w:rPr>
-              <w:t xml:space="preserve">Within ~60–90 s the reconciler redispatches lost jobs; all jobs end Completed</w:t>
-            </w:r>
-          </w:p>
-        </w:tc>
-        <w:tc>
-          <w:tcPr>
-            <w:tcW w:type="dxa" w:w="977"/>
-            <w:tcBorders>
-              <w:top w:val="single" w:color="BFBFBF" w:sz="4"/>
-              <w:left w:val="single" w:color="BFBFBF" w:sz="4"/>
-              <w:bottom w:val="single" w:color="BFBFBF" w:sz="4"/>
-              <w:right w:val="single" w:color="BFBFBF" w:sz="4"/>
-            </w:tcBorders>
-            <w:tcMar>
-              <w:top w:type="dxa" w:w="60"/>
-              <w:left w:type="dxa" w:w="100"/>
-              <w:bottom w:type="dxa" w:w="60"/>
-              <w:right w:type="dxa" w:w="100"/>
-            </w:tcMar>
-          </w:tcPr>
-          <w:p>
-            <w:r>
-              <w:rPr>
-                <w:rFonts w:ascii="Calibri" w:cs="Calibri" w:eastAsia="Calibri" w:hAnsi="Calibri"/>
-                <w:sz w:val="18"/>
-                <w:szCs w:val="18"/>
-              </w:rPr>
-              <w:t xml:space="preserve">Not yet executed</w:t>
-            </w:r>
-          </w:p>
-        </w:tc>
-      </w:tr>
-      <w:tr>
-        <w:tc>
-          <w:tcPr>
-            <w:tcW w:type="dxa" w:w="512"/>
-            <w:tcBorders>
-              <w:top w:val="single" w:color="BFBFBF" w:sz="4"/>
-              <w:left w:val="single" w:color="BFBFBF" w:sz="4"/>
-              <w:bottom w:val="single" w:color="BFBFBF" w:sz="4"/>
-              <w:right w:val="single" w:color="BFBFBF" w:sz="4"/>
-            </w:tcBorders>
-            <w:tcMar>
-              <w:top w:type="dxa" w:w="60"/>
-              <w:left w:type="dxa" w:w="100"/>
-              <w:bottom w:type="dxa" w:w="60"/>
-              <w:right w:type="dxa" w:w="100"/>
-            </w:tcMar>
-          </w:tcPr>
-          <w:p>
-            <w:r>
-              <w:rPr>
-                <w:rFonts w:ascii="Calibri" w:cs="Calibri" w:eastAsia="Calibri" w:hAnsi="Calibri"/>
-                <w:sz w:val="18"/>
-                <w:szCs w:val="18"/>
-              </w:rPr>
-              <w:t xml:space="preserve">MT-09</w:t>
-            </w:r>
-          </w:p>
-        </w:tc>
-        <w:tc>
-          <w:tcPr>
-            <w:tcW w:type="dxa" w:w="1999"/>
-            <w:tcBorders>
-              <w:top w:val="single" w:color="BFBFBF" w:sz="4"/>
-              <w:left w:val="single" w:color="BFBFBF" w:sz="4"/>
-              <w:bottom w:val="single" w:color="BFBFBF" w:sz="4"/>
-              <w:right w:val="single" w:color="BFBFBF" w:sz="4"/>
-            </w:tcBorders>
-            <w:tcMar>
-              <w:top w:type="dxa" w:w="60"/>
-              <w:left w:type="dxa" w:w="100"/>
-              <w:bottom w:type="dxa" w:w="60"/>
-              <w:right w:type="dxa" w:w="100"/>
-            </w:tcMar>
-          </w:tcPr>
-          <w:p>
-            <w:r>
-              <w:rPr>
-                <w:rFonts w:ascii="Calibri" w:cs="Calibri" w:eastAsia="Calibri" w:hAnsi="Calibri"/>
-                <w:sz w:val="18"/>
-                <w:szCs w:val="18"/>
-              </w:rPr>
-              <w:t xml:space="preserve">Storage outage</w:t>
-            </w:r>
-          </w:p>
-        </w:tc>
-        <w:tc>
-          <w:tcPr>
-            <w:tcW w:type="dxa" w:w="2050"/>
-            <w:tcBorders>
-              <w:top w:val="single" w:color="BFBFBF" w:sz="4"/>
-              <w:left w:val="single" w:color="BFBFBF" w:sz="4"/>
-              <w:bottom w:val="single" w:color="BFBFBF" w:sz="4"/>
-              <w:right w:val="single" w:color="BFBFBF" w:sz="4"/>
-            </w:tcBorders>
-            <w:tcMar>
-              <w:top w:type="dxa" w:w="60"/>
-              <w:left w:type="dxa" w:w="100"/>
-              <w:bottom w:type="dxa" w:w="60"/>
-              <w:right w:type="dxa" w:w="100"/>
-            </w:tcMar>
-          </w:tcPr>
-          <w:p>
-            <w:r>
-              <w:rPr>
-                <w:rFonts w:ascii="Calibri" w:cs="Calibri" w:eastAsia="Calibri" w:hAnsi="Calibri"/>
-                <w:sz w:val="18"/>
-                <w:szCs w:val="18"/>
-              </w:rPr>
-              <w:t xml:space="preserve">MT-01 passed</w:t>
-            </w:r>
-          </w:p>
-        </w:tc>
-        <w:tc>
-          <w:tcPr>
-            <w:tcW w:type="dxa" w:w="2050"/>
-            <w:tcBorders>
-              <w:top w:val="single" w:color="BFBFBF" w:sz="4"/>
-              <w:left w:val="single" w:color="BFBFBF" w:sz="4"/>
-              <w:bottom w:val="single" w:color="BFBFBF" w:sz="4"/>
-              <w:right w:val="single" w:color="BFBFBF" w:sz="4"/>
-            </w:tcBorders>
-            <w:tcMar>
-              <w:top w:type="dxa" w:w="60"/>
-              <w:left w:type="dxa" w:w="100"/>
-              <w:bottom w:type="dxa" w:w="60"/>
-              <w:right w:type="dxa" w:w="100"/>
-            </w:tcMar>
-          </w:tcPr>
-          <w:p>
-            <w:r>
-              <w:rPr>
-                <w:rFonts w:ascii="Calibri" w:cs="Calibri" w:eastAsia="Calibri" w:hAnsi="Calibri"/>
-                <w:sz w:val="18"/>
-                <w:szCs w:val="18"/>
-              </w:rPr>
-              <w:t xml:space="preserve">1) </w:t>
+              <w:t xml:space="preserve">connection failed (attempt N)</w:t>
+            </w:r>
+            <w:r>
+              <w:rPr>
+                <w:rFonts w:ascii="Calibri" w:cs="Calibri" w:eastAsia="Calibri" w:hAnsi="Calibri"/>
+                <w:sz w:val="18"/>
+                <w:szCs w:val="18"/>
+              </w:rPr>
+              <w:t xml:space="preserve"> then </w:t>
             </w:r>
             <w:r>
               <w:rPr>
@@ -50600,15 +50361,152 @@
                 <w:sz w:val="16"/>
                 <w:szCs w:val="16"/>
               </w:rPr>
-              <w:t xml:space="preserve">docker compose stop mongo</w:t>
-            </w:r>
-            <w:r>
-              <w:rPr>
-                <w:rFonts w:ascii="Calibri" w:cs="Calibri" w:eastAsia="Calibri" w:hAnsi="Calibri"/>
-                <w:sz w:val="18"/>
-                <w:szCs w:val="18"/>
-              </w:rPr>
-              <w:t xml:space="preserve"> 2) </w:t>
+              <w:t xml:space="preserve">Connected … N events pending</w:t>
+            </w:r>
+            <w:r>
+              <w:rPr>
+                <w:rFonts w:ascii="Calibri" w:cs="Calibri" w:eastAsia="Calibri" w:hAnsi="Calibri"/>
+                <w:sz w:val="18"/>
+                <w:szCs w:val="18"/>
+              </w:rPr>
+              <w:t xml:space="preserve">; job ends Completed; no event lost</w:t>
+            </w:r>
+          </w:p>
+        </w:tc>
+        <w:tc>
+          <w:tcPr>
+            <w:tcW w:type="dxa" w:w="1847"/>
+            <w:tcBorders>
+              <w:top w:val="single" w:color="BFBFBF" w:sz="4"/>
+              <w:left w:val="single" w:color="BFBFBF" w:sz="4"/>
+              <w:bottom w:val="single" w:color="BFBFBF" w:sz="4"/>
+              <w:right w:val="single" w:color="BFBFBF" w:sz="4"/>
+            </w:tcBorders>
+            <w:tcMar>
+              <w:top w:type="dxa" w:w="60"/>
+              <w:left w:type="dxa" w:w="100"/>
+              <w:bottom w:type="dxa" w:w="60"/>
+              <w:right w:type="dxa" w:w="100"/>
+            </w:tcMar>
+          </w:tcPr>
+          <w:p>
+            <w:r>
+              <w:rPr>
+                <w:rFonts w:ascii="Calibri" w:cs="Calibri" w:eastAsia="Calibri" w:hAnsi="Calibri"/>
+                <w:sz w:val="18"/>
+                <w:szCs w:val="18"/>
+              </w:rPr>
+              <w:t xml:space="preserve">Not yet executed</w:t>
+            </w:r>
+          </w:p>
+        </w:tc>
+      </w:tr>
+      <w:tr>
+        <w:tc>
+          <w:tcPr>
+            <w:tcW w:type="dxa" w:w="461"/>
+            <w:tcBorders>
+              <w:top w:val="single" w:color="BFBFBF" w:sz="4"/>
+              <w:left w:val="single" w:color="BFBFBF" w:sz="4"/>
+              <w:bottom w:val="single" w:color="BFBFBF" w:sz="4"/>
+              <w:right w:val="single" w:color="BFBFBF" w:sz="4"/>
+            </w:tcBorders>
+            <w:tcMar>
+              <w:top w:type="dxa" w:w="60"/>
+              <w:left w:type="dxa" w:w="100"/>
+              <w:bottom w:type="dxa" w:w="60"/>
+              <w:right w:type="dxa" w:w="100"/>
+            </w:tcMar>
+          </w:tcPr>
+          <w:p>
+            <w:r>
+              <w:rPr>
+                <w:rFonts w:ascii="Calibri" w:cs="Calibri" w:eastAsia="Calibri" w:hAnsi="Calibri"/>
+                <w:sz w:val="18"/>
+                <w:szCs w:val="18"/>
+              </w:rPr>
+              <w:t xml:space="preserve">MT-08</w:t>
+            </w:r>
+          </w:p>
+        </w:tc>
+        <w:tc>
+          <w:tcPr>
+            <w:tcW w:type="dxa" w:w="1798"/>
+            <w:tcBorders>
+              <w:top w:val="single" w:color="BFBFBF" w:sz="4"/>
+              <w:left w:val="single" w:color="BFBFBF" w:sz="4"/>
+              <w:bottom w:val="single" w:color="BFBFBF" w:sz="4"/>
+              <w:right w:val="single" w:color="BFBFBF" w:sz="4"/>
+            </w:tcBorders>
+            <w:tcMar>
+              <w:top w:type="dxa" w:w="60"/>
+              <w:left w:type="dxa" w:w="100"/>
+              <w:bottom w:type="dxa" w:w="60"/>
+              <w:right w:type="dxa" w:w="100"/>
+            </w:tcMar>
+          </w:tcPr>
+          <w:p>
+            <w:r>
+              <w:rPr>
+                <w:rFonts w:ascii="Calibri" w:cs="Calibri" w:eastAsia="Calibri" w:hAnsi="Calibri"/>
+                <w:sz w:val="18"/>
+                <w:szCs w:val="18"/>
+              </w:rPr>
+              <w:t xml:space="preserve">Processor restart mid-job</w:t>
+            </w:r>
+          </w:p>
+        </w:tc>
+        <w:tc>
+          <w:tcPr>
+            <w:tcW w:type="dxa" w:w="1844"/>
+            <w:tcBorders>
+              <w:top w:val="single" w:color="BFBFBF" w:sz="4"/>
+              <w:left w:val="single" w:color="BFBFBF" w:sz="4"/>
+              <w:bottom w:val="single" w:color="BFBFBF" w:sz="4"/>
+              <w:right w:val="single" w:color="BFBFBF" w:sz="4"/>
+            </w:tcBorders>
+            <w:tcMar>
+              <w:top w:type="dxa" w:w="60"/>
+              <w:left w:type="dxa" w:w="100"/>
+              <w:bottom w:type="dxa" w:w="60"/>
+              <w:right w:type="dxa" w:w="100"/>
+            </w:tcMar>
+          </w:tcPr>
+          <w:p>
+            <w:r>
+              <w:rPr>
+                <w:rFonts w:ascii="Calibri" w:cs="Calibri" w:eastAsia="Calibri" w:hAnsi="Calibri"/>
+                <w:sz w:val="18"/>
+                <w:szCs w:val="18"/>
+              </w:rPr>
+              <w:t xml:space="preserve">MT-01 passed</w:t>
+            </w:r>
+          </w:p>
+        </w:tc>
+        <w:tc>
+          <w:tcPr>
+            <w:tcW w:type="dxa" w:w="1844"/>
+            <w:tcBorders>
+              <w:top w:val="single" w:color="BFBFBF" w:sz="4"/>
+              <w:left w:val="single" w:color="BFBFBF" w:sz="4"/>
+              <w:bottom w:val="single" w:color="BFBFBF" w:sz="4"/>
+              <w:right w:val="single" w:color="BFBFBF" w:sz="4"/>
+            </w:tcBorders>
+            <w:tcMar>
+              <w:top w:type="dxa" w:w="60"/>
+              <w:left w:type="dxa" w:w="100"/>
+              <w:bottom w:type="dxa" w:w="60"/>
+              <w:right w:type="dxa" w:w="100"/>
+            </w:tcMar>
+          </w:tcPr>
+          <w:p>
+            <w:r>
+              <w:rPr>
+                <w:rFonts w:ascii="Calibri" w:cs="Calibri" w:eastAsia="Calibri" w:hAnsi="Calibri"/>
+                <w:sz w:val="18"/>
+                <w:szCs w:val="18"/>
+              </w:rPr>
+              <w:t xml:space="preserve">1) Start the 10 × 1,000 load 2) </w:t>
             </w:r>
             <w:r>
               <w:rPr>
@@ -50617,15 +50515,15 @@
                 <w:sz w:val="16"/>
                 <w:szCs w:val="16"/>
               </w:rPr>
-              <w:t xml:space="preserve">GET /api/jobs</w:t>
-            </w:r>
-            <w:r>
-              <w:rPr>
-                <w:rFonts w:ascii="Calibri" w:cs="Calibri" w:eastAsia="Calibri" w:hAnsi="Calibri"/>
-                <w:sz w:val="18"/>
-                <w:szCs w:val="18"/>
-              </w:rPr>
-              <w:t xml:space="preserve"> and </w:t>
+              <w:t xml:space="preserve">docker compose restart processor-service</w:t>
+            </w:r>
+            <w:r>
+              <w:rPr>
+                <w:rFonts w:ascii="Calibri" w:cs="Calibri" w:eastAsia="Calibri" w:hAnsi="Calibri"/>
+                <w:sz w:val="18"/>
+                <w:szCs w:val="18"/>
+              </w:rPr>
+              <w:t xml:space="preserve"> while jobs are Processing 3) Watch </w:t>
             </w:r>
             <w:r>
               <w:rPr>
@@ -50634,15 +50532,171 @@
                 <w:sz w:val="16"/>
                 <w:szCs w:val="16"/>
               </w:rPr>
-              <w:t xml:space="preserve">/health/ready</w:t>
-            </w:r>
-            <w:r>
-              <w:rPr>
-                <w:rFonts w:ascii="Calibri" w:cs="Calibri" w:eastAsia="Calibri" w:hAnsi="Calibri"/>
-                <w:sz w:val="18"/>
-                <w:szCs w:val="18"/>
-              </w:rPr>
-              <w:t xml:space="preserve"> on :5001 3) </w:t>
+              <w:t xml:space="preserve">GET /api/jobs?status=Processing</w:t>
+            </w:r>
+          </w:p>
+        </w:tc>
+        <w:tc>
+          <w:tcPr>
+            <w:tcW w:type="dxa" w:w="1844"/>
+            <w:tcBorders>
+              <w:top w:val="single" w:color="BFBFBF" w:sz="4"/>
+              <w:left w:val="single" w:color="BFBFBF" w:sz="4"/>
+              <w:bottom w:val="single" w:color="BFBFBF" w:sz="4"/>
+              <w:right w:val="single" w:color="BFBFBF" w:sz="4"/>
+            </w:tcBorders>
+            <w:tcMar>
+              <w:top w:type="dxa" w:w="60"/>
+              <w:left w:type="dxa" w:w="100"/>
+              <w:bottom w:type="dxa" w:w="60"/>
+              <w:right w:type="dxa" w:w="100"/>
+            </w:tcMar>
+          </w:tcPr>
+          <w:p>
+            <w:r>
+              <w:rPr>
+                <w:rFonts w:ascii="Calibri" w:cs="Calibri" w:eastAsia="Calibri" w:hAnsi="Calibri"/>
+                <w:sz w:val="18"/>
+                <w:szCs w:val="18"/>
+              </w:rPr>
+              <w:t xml:space="preserve">Within ~60–90 s the reconciler redispatches lost jobs; all jobs end Completed</w:t>
+            </w:r>
+          </w:p>
+        </w:tc>
+        <w:tc>
+          <w:tcPr>
+            <w:tcW w:type="dxa" w:w="1847"/>
+            <w:tcBorders>
+              <w:top w:val="single" w:color="BFBFBF" w:sz="4"/>
+              <w:left w:val="single" w:color="BFBFBF" w:sz="4"/>
+              <w:bottom w:val="single" w:color="BFBFBF" w:sz="4"/>
+              <w:right w:val="single" w:color="BFBFBF" w:sz="4"/>
+            </w:tcBorders>
+            <w:tcMar>
+              <w:top w:type="dxa" w:w="60"/>
+              <w:left w:type="dxa" w:w="100"/>
+              <w:bottom w:type="dxa" w:w="60"/>
+              <w:right w:type="dxa" w:w="100"/>
+            </w:tcMar>
+          </w:tcPr>
+          <w:p>
+            <w:r>
+              <w:rPr>
+                <w:rFonts w:ascii="Calibri" w:cs="Calibri" w:eastAsia="Calibri" w:hAnsi="Calibri"/>
+                <w:sz w:val="18"/>
+                <w:szCs w:val="18"/>
+              </w:rPr>
+              <w:t xml:space="preserve">Not yet executed</w:t>
+            </w:r>
+          </w:p>
+        </w:tc>
+      </w:tr>
+      <w:tr>
+        <w:tc>
+          <w:tcPr>
+            <w:tcW w:type="dxa" w:w="461"/>
+            <w:tcBorders>
+              <w:top w:val="single" w:color="BFBFBF" w:sz="4"/>
+              <w:left w:val="single" w:color="BFBFBF" w:sz="4"/>
+              <w:bottom w:val="single" w:color="BFBFBF" w:sz="4"/>
+              <w:right w:val="single" w:color="BFBFBF" w:sz="4"/>
+            </w:tcBorders>
+            <w:tcMar>
+              <w:top w:type="dxa" w:w="60"/>
+              <w:left w:type="dxa" w:w="100"/>
+              <w:bottom w:type="dxa" w:w="60"/>
+              <w:right w:type="dxa" w:w="100"/>
+            </w:tcMar>
+          </w:tcPr>
+          <w:p>
+            <w:r>
+              <w:rPr>
+                <w:rFonts w:ascii="Calibri" w:cs="Calibri" w:eastAsia="Calibri" w:hAnsi="Calibri"/>
+                <w:sz w:val="18"/>
+                <w:szCs w:val="18"/>
+              </w:rPr>
+              <w:t xml:space="preserve">MT-09</w:t>
+            </w:r>
+          </w:p>
+        </w:tc>
+        <w:tc>
+          <w:tcPr>
+            <w:tcW w:type="dxa" w:w="1798"/>
+            <w:tcBorders>
+              <w:top w:val="single" w:color="BFBFBF" w:sz="4"/>
+              <w:left w:val="single" w:color="BFBFBF" w:sz="4"/>
+              <w:bottom w:val="single" w:color="BFBFBF" w:sz="4"/>
+              <w:right w:val="single" w:color="BFBFBF" w:sz="4"/>
+            </w:tcBorders>
+            <w:tcMar>
+              <w:top w:type="dxa" w:w="60"/>
+              <w:left w:type="dxa" w:w="100"/>
+              <w:bottom w:type="dxa" w:w="60"/>
+              <w:right w:type="dxa" w:w="100"/>
+            </w:tcMar>
+          </w:tcPr>
+          <w:p>
+            <w:r>
+              <w:rPr>
+                <w:rFonts w:ascii="Calibri" w:cs="Calibri" w:eastAsia="Calibri" w:hAnsi="Calibri"/>
+                <w:sz w:val="18"/>
+                <w:szCs w:val="18"/>
+              </w:rPr>
+              <w:t xml:space="preserve">Storage outage</w:t>
+            </w:r>
+          </w:p>
+        </w:tc>
+        <w:tc>
+          <w:tcPr>
+            <w:tcW w:type="dxa" w:w="1844"/>
+            <w:tcBorders>
+              <w:top w:val="single" w:color="BFBFBF" w:sz="4"/>
+              <w:left w:val="single" w:color="BFBFBF" w:sz="4"/>
+              <w:bottom w:val="single" w:color="BFBFBF" w:sz="4"/>
+              <w:right w:val="single" w:color="BFBFBF" w:sz="4"/>
+            </w:tcBorders>
+            <w:tcMar>
+              <w:top w:type="dxa" w:w="60"/>
+              <w:left w:type="dxa" w:w="100"/>
+              <w:bottom w:type="dxa" w:w="60"/>
+              <w:right w:type="dxa" w:w="100"/>
+            </w:tcMar>
+          </w:tcPr>
+          <w:p>
+            <w:r>
+              <w:rPr>
+                <w:rFonts w:ascii="Calibri" w:cs="Calibri" w:eastAsia="Calibri" w:hAnsi="Calibri"/>
+                <w:sz w:val="18"/>
+                <w:szCs w:val="18"/>
+              </w:rPr>
+              <w:t xml:space="preserve">MT-01 passed</w:t>
+            </w:r>
+          </w:p>
+        </w:tc>
+        <w:tc>
+          <w:tcPr>
+            <w:tcW w:type="dxa" w:w="1844"/>
+            <w:tcBorders>
+              <w:top w:val="single" w:color="BFBFBF" w:sz="4"/>
+              <w:left w:val="single" w:color="BFBFBF" w:sz="4"/>
+              <w:bottom w:val="single" w:color="BFBFBF" w:sz="4"/>
+              <w:right w:val="single" w:color="BFBFBF" w:sz="4"/>
+            </w:tcBorders>
+            <w:tcMar>
+              <w:top w:type="dxa" w:w="60"/>
+              <w:left w:type="dxa" w:w="100"/>
+              <w:bottom w:type="dxa" w:w="60"/>
+              <w:right w:type="dxa" w:w="100"/>
+            </w:tcMar>
+          </w:tcPr>
+          <w:p>
+            <w:r>
+              <w:rPr>
+                <w:rFonts w:ascii="Calibri" w:cs="Calibri" w:eastAsia="Calibri" w:hAnsi="Calibri"/>
+                <w:sz w:val="18"/>
+                <w:szCs w:val="18"/>
+              </w:rPr>
+              <w:t xml:space="preserve">1) </w:t>
             </w:r>
             <w:r>
               <w:rPr>
@@ -50651,189 +50705,15 @@
                 <w:sz w:val="16"/>
                 <w:szCs w:val="16"/>
               </w:rPr>
-              <w:t xml:space="preserve">docker compose start mongo</w:t>
-            </w:r>
-          </w:p>
-        </w:tc>
-        <w:tc>
-          <w:tcPr>
-            <w:tcW w:type="dxa" w:w="2050"/>
-            <w:tcBorders>
-              <w:top w:val="single" w:color="BFBFBF" w:sz="4"/>
-              <w:left w:val="single" w:color="BFBFBF" w:sz="4"/>
-              <w:bottom w:val="single" w:color="BFBFBF" w:sz="4"/>
-              <w:right w:val="single" w:color="BFBFBF" w:sz="4"/>
-            </w:tcBorders>
-            <w:tcMar>
-              <w:top w:type="dxa" w:w="60"/>
-              <w:left w:type="dxa" w:w="100"/>
-              <w:bottom w:type="dxa" w:w="60"/>
-              <w:right w:type="dxa" w:w="100"/>
-            </w:tcMar>
-          </w:tcPr>
-          <w:p>
-            <w:r>
-              <w:rPr>
-                <w:rFonts w:ascii="Calibri" w:cs="Calibri" w:eastAsia="Calibri" w:hAnsi="Calibri"/>
-                <w:sz w:val="18"/>
-                <w:szCs w:val="18"/>
-              </w:rPr>
-              <w:t xml:space="preserve">503 </w:t>
-            </w:r>
-            <w:r>
-              <w:rPr>
-                <w:rFonts w:ascii="Calibri" w:cs="Calibri" w:eastAsia="Calibri" w:hAnsi="Calibri"/>
-                <w:i/>
-                <w:iCs/>
-                <w:sz w:val="18"/>
-                <w:szCs w:val="18"/>
-              </w:rPr>
-              <w:t xml:space="preserve">Storage unavailable</w:t>
-            </w:r>
-            <w:r>
-              <w:rPr>
-                <w:rFonts w:ascii="Calibri" w:cs="Calibri" w:eastAsia="Calibri" w:hAnsi="Calibri"/>
-                <w:sz w:val="18"/>
-                <w:szCs w:val="18"/>
-              </w:rPr>
-              <w:t xml:space="preserve"> ProblemDetails within ~5 s; readiness Unhealthy; service recovers after Mongo starts</w:t>
-            </w:r>
-          </w:p>
-        </w:tc>
-        <w:tc>
-          <w:tcPr>
-            <w:tcW w:type="dxa" w:w="977"/>
-            <w:tcBorders>
-              <w:top w:val="single" w:color="BFBFBF" w:sz="4"/>
-              <w:left w:val="single" w:color="BFBFBF" w:sz="4"/>
-              <w:bottom w:val="single" w:color="BFBFBF" w:sz="4"/>
-              <w:right w:val="single" w:color="BFBFBF" w:sz="4"/>
-            </w:tcBorders>
-            <w:tcMar>
-              <w:top w:type="dxa" w:w="60"/>
-              <w:left w:type="dxa" w:w="100"/>
-              <w:bottom w:type="dxa" w:w="60"/>
-              <w:right w:type="dxa" w:w="100"/>
-            </w:tcMar>
-          </w:tcPr>
-          <w:p>
-            <w:r>
-              <w:rPr>
-                <w:rFonts w:ascii="Calibri" w:cs="Calibri" w:eastAsia="Calibri" w:hAnsi="Calibri"/>
-                <w:sz w:val="18"/>
-                <w:szCs w:val="18"/>
-              </w:rPr>
-              <w:t xml:space="preserve">Not yet executed</w:t>
-            </w:r>
-          </w:p>
-        </w:tc>
-      </w:tr>
-      <w:tr>
-        <w:tc>
-          <w:tcPr>
-            <w:tcW w:type="dxa" w:w="512"/>
-            <w:tcBorders>
-              <w:top w:val="single" w:color="BFBFBF" w:sz="4"/>
-              <w:left w:val="single" w:color="BFBFBF" w:sz="4"/>
-              <w:bottom w:val="single" w:color="BFBFBF" w:sz="4"/>
-              <w:right w:val="single" w:color="BFBFBF" w:sz="4"/>
-            </w:tcBorders>
-            <w:tcMar>
-              <w:top w:type="dxa" w:w="60"/>
-              <w:left w:type="dxa" w:w="100"/>
-              <w:bottom w:type="dxa" w:w="60"/>
-              <w:right w:type="dxa" w:w="100"/>
-            </w:tcMar>
-          </w:tcPr>
-          <w:p>
-            <w:r>
-              <w:rPr>
-                <w:rFonts w:ascii="Calibri" w:cs="Calibri" w:eastAsia="Calibri" w:hAnsi="Calibri"/>
-                <w:sz w:val="18"/>
-                <w:szCs w:val="18"/>
-              </w:rPr>
-              <w:t xml:space="preserve">MT-10</w:t>
-            </w:r>
-          </w:p>
-        </w:tc>
-        <w:tc>
-          <w:tcPr>
-            <w:tcW w:type="dxa" w:w="1999"/>
-            <w:tcBorders>
-              <w:top w:val="single" w:color="BFBFBF" w:sz="4"/>
-              <w:left w:val="single" w:color="BFBFBF" w:sz="4"/>
-              <w:bottom w:val="single" w:color="BFBFBF" w:sz="4"/>
-              <w:right w:val="single" w:color="BFBFBF" w:sz="4"/>
-            </w:tcBorders>
-            <w:tcMar>
-              <w:top w:type="dxa" w:w="60"/>
-              <w:left w:type="dxa" w:w="100"/>
-              <w:bottom w:type="dxa" w:w="60"/>
-              <w:right w:type="dxa" w:w="100"/>
-            </w:tcMar>
-          </w:tcPr>
-          <w:p>
-            <w:r>
-              <w:rPr>
-                <w:rFonts w:ascii="Calibri" w:cs="Calibri" w:eastAsia="Calibri" w:hAnsi="Calibri"/>
-                <w:sz w:val="18"/>
-                <w:szCs w:val="18"/>
-              </w:rPr>
-              <w:t xml:space="preserve">Live status stream (SSE)</w:t>
-            </w:r>
-          </w:p>
-        </w:tc>
-        <w:tc>
-          <w:tcPr>
-            <w:tcW w:type="dxa" w:w="2050"/>
-            <w:tcBorders>
-              <w:top w:val="single" w:color="BFBFBF" w:sz="4"/>
-              <w:left w:val="single" w:color="BFBFBF" w:sz="4"/>
-              <w:bottom w:val="single" w:color="BFBFBF" w:sz="4"/>
-              <w:right w:val="single" w:color="BFBFBF" w:sz="4"/>
-            </w:tcBorders>
-            <w:tcMar>
-              <w:top w:type="dxa" w:w="60"/>
-              <w:left w:type="dxa" w:w="100"/>
-              <w:bottom w:type="dxa" w:w="60"/>
-              <w:right w:type="dxa" w:w="100"/>
-            </w:tcMar>
-          </w:tcPr>
-          <w:p>
-            <w:r>
-              <w:rPr>
-                <w:rFonts w:ascii="Calibri" w:cs="Calibri" w:eastAsia="Calibri" w:hAnsi="Calibri"/>
-                <w:sz w:val="18"/>
-                <w:szCs w:val="18"/>
-              </w:rPr>
-              <w:t xml:space="preserve">MT-01 passed</w:t>
-            </w:r>
-          </w:p>
-        </w:tc>
-        <w:tc>
-          <w:tcPr>
-            <w:tcW w:type="dxa" w:w="2050"/>
-            <w:tcBorders>
-              <w:top w:val="single" w:color="BFBFBF" w:sz="4"/>
-              <w:left w:val="single" w:color="BFBFBF" w:sz="4"/>
-              <w:bottom w:val="single" w:color="BFBFBF" w:sz="4"/>
-              <w:right w:val="single" w:color="BFBFBF" w:sz="4"/>
-            </w:tcBorders>
-            <w:tcMar>
-              <w:top w:type="dxa" w:w="60"/>
-              <w:left w:type="dxa" w:w="100"/>
-              <w:bottom w:type="dxa" w:w="60"/>
-              <w:right w:type="dxa" w:w="100"/>
-            </w:tcMar>
-          </w:tcPr>
-          <w:p>
-            <w:r>
-              <w:rPr>
-                <w:rFonts w:ascii="Calibri" w:cs="Calibri" w:eastAsia="Calibri" w:hAnsi="Calibri"/>
-                <w:sz w:val="18"/>
-                <w:szCs w:val="18"/>
-              </w:rPr>
-              <w:t xml:space="preserve">1) Create a job 2) </w:t>
+              <w:t xml:space="preserve">docker compose stop mongo</w:t>
+            </w:r>
+            <w:r>
+              <w:rPr>
+                <w:rFonts w:ascii="Calibri" w:cs="Calibri" w:eastAsia="Calibri" w:hAnsi="Calibri"/>
+                <w:sz w:val="18"/>
+                <w:szCs w:val="18"/>
+              </w:rPr>
+              <w:t xml:space="preserve"> 2) </w:t>
             </w:r>
             <w:r>
               <w:rPr>
@@ -50842,27 +50722,16 @@
                 <w:sz w:val="16"/>
                 <w:szCs w:val="16"/>
               </w:rPr>
-              <w:t xml:space="preserve">curl.exe -N http://localhost:5001/api/jobs/&lt;id&gt;/events</w:t>
-            </w:r>
-          </w:p>
-        </w:tc>
-        <w:tc>
-          <w:tcPr>
-            <w:tcW w:type="dxa" w:w="2050"/>
-            <w:tcBorders>
-              <w:top w:val="single" w:color="BFBFBF" w:sz="4"/>
-              <w:left w:val="single" w:color="BFBFBF" w:sz="4"/>
-              <w:bottom w:val="single" w:color="BFBFBF" w:sz="4"/>
-              <w:right w:val="single" w:color="BFBFBF" w:sz="4"/>
-            </w:tcBorders>
-            <w:tcMar>
-              <w:top w:type="dxa" w:w="60"/>
-              <w:left w:type="dxa" w:w="100"/>
-              <w:bottom w:type="dxa" w:w="60"/>
-              <w:right w:type="dxa" w:w="100"/>
-            </w:tcMar>
-          </w:tcPr>
-          <w:p>
+              <w:t xml:space="preserve">GET /api/jobs</w:t>
+            </w:r>
+            <w:r>
+              <w:rPr>
+                <w:rFonts w:ascii="Calibri" w:cs="Calibri" w:eastAsia="Calibri" w:hAnsi="Calibri"/>
+                <w:sz w:val="18"/>
+                <w:szCs w:val="18"/>
+              </w:rPr>
+              <w:t xml:space="preserve"> and </w:t>
+            </w:r>
             <w:r>
               <w:rPr>
                 <w:rFonts w:ascii="Consolas" w:cs="Consolas" w:eastAsia="Consolas" w:hAnsi="Consolas"/>
@@ -50870,152 +50739,15 @@
                 <w:sz w:val="16"/>
                 <w:szCs w:val="16"/>
               </w:rPr>
-              <w:t xml:space="preserve">event: status</w:t>
-            </w:r>
-            <w:r>
-              <w:rPr>
-                <w:rFonts w:ascii="Calibri" w:cs="Calibri" w:eastAsia="Calibri" w:hAnsi="Calibri"/>
-                <w:sz w:val="18"/>
-                <w:szCs w:val="18"/>
-              </w:rPr>
-              <w:t xml:space="preserve"> lines: snapshot, then Processing with progress, then Completed; stream closes</w:t>
-            </w:r>
-          </w:p>
-        </w:tc>
-        <w:tc>
-          <w:tcPr>
-            <w:tcW w:type="dxa" w:w="977"/>
-            <w:tcBorders>
-              <w:top w:val="single" w:color="BFBFBF" w:sz="4"/>
-              <w:left w:val="single" w:color="BFBFBF" w:sz="4"/>
-              <w:bottom w:val="single" w:color="BFBFBF" w:sz="4"/>
-              <w:right w:val="single" w:color="BFBFBF" w:sz="4"/>
-            </w:tcBorders>
-            <w:tcMar>
-              <w:top w:type="dxa" w:w="60"/>
-              <w:left w:type="dxa" w:w="100"/>
-              <w:bottom w:type="dxa" w:w="60"/>
-              <w:right w:type="dxa" w:w="100"/>
-            </w:tcMar>
-          </w:tcPr>
-          <w:p>
-            <w:r>
-              <w:rPr>
-                <w:rFonts w:ascii="Calibri" w:cs="Calibri" w:eastAsia="Calibri" w:hAnsi="Calibri"/>
-                <w:sz w:val="18"/>
-                <w:szCs w:val="18"/>
-              </w:rPr>
-              <w:t xml:space="preserve">Not yet executed</w:t>
-            </w:r>
-          </w:p>
-        </w:tc>
-      </w:tr>
-      <w:tr>
-        <w:tc>
-          <w:tcPr>
-            <w:tcW w:type="dxa" w:w="512"/>
-            <w:tcBorders>
-              <w:top w:val="single" w:color="BFBFBF" w:sz="4"/>
-              <w:left w:val="single" w:color="BFBFBF" w:sz="4"/>
-              <w:bottom w:val="single" w:color="BFBFBF" w:sz="4"/>
-              <w:right w:val="single" w:color="BFBFBF" w:sz="4"/>
-            </w:tcBorders>
-            <w:tcMar>
-              <w:top w:type="dxa" w:w="60"/>
-              <w:left w:type="dxa" w:w="100"/>
-              <w:bottom w:type="dxa" w:w="60"/>
-              <w:right w:type="dxa" w:w="100"/>
-            </w:tcMar>
-          </w:tcPr>
-          <w:p>
-            <w:r>
-              <w:rPr>
-                <w:rFonts w:ascii="Calibri" w:cs="Calibri" w:eastAsia="Calibri" w:hAnsi="Calibri"/>
-                <w:sz w:val="18"/>
-                <w:szCs w:val="18"/>
-              </w:rPr>
-              <w:t xml:space="preserve">MT-11</w:t>
-            </w:r>
-          </w:p>
-        </w:tc>
-        <w:tc>
-          <w:tcPr>
-            <w:tcW w:type="dxa" w:w="1999"/>
-            <w:tcBorders>
-              <w:top w:val="single" w:color="BFBFBF" w:sz="4"/>
-              <w:left w:val="single" w:color="BFBFBF" w:sz="4"/>
-              <w:bottom w:val="single" w:color="BFBFBF" w:sz="4"/>
-              <w:right w:val="single" w:color="BFBFBF" w:sz="4"/>
-            </w:tcBorders>
-            <w:tcMar>
-              <w:top w:type="dxa" w:w="60"/>
-              <w:left w:type="dxa" w:w="100"/>
-              <w:bottom w:type="dxa" w:w="60"/>
-              <w:right w:type="dxa" w:w="100"/>
-            </w:tcMar>
-          </w:tcPr>
-          <w:p>
-            <w:r>
-              <w:rPr>
-                <w:rFonts w:ascii="Calibri" w:cs="Calibri" w:eastAsia="Calibri" w:hAnsi="Calibri"/>
-                <w:sz w:val="18"/>
-                <w:szCs w:val="18"/>
-              </w:rPr>
-              <w:t xml:space="preserve">Logs in console and MongoDB</w:t>
-            </w:r>
-          </w:p>
-        </w:tc>
-        <w:tc>
-          <w:tcPr>
-            <w:tcW w:type="dxa" w:w="2050"/>
-            <w:tcBorders>
-              <w:top w:val="single" w:color="BFBFBF" w:sz="4"/>
-              <w:left w:val="single" w:color="BFBFBF" w:sz="4"/>
-              <w:bottom w:val="single" w:color="BFBFBF" w:sz="4"/>
-              <w:right w:val="single" w:color="BFBFBF" w:sz="4"/>
-            </w:tcBorders>
-            <w:tcMar>
-              <w:top w:type="dxa" w:w="60"/>
-              <w:left w:type="dxa" w:w="100"/>
-              <w:bottom w:type="dxa" w:w="60"/>
-              <w:right w:type="dxa" w:w="100"/>
-            </w:tcMar>
-          </w:tcPr>
-          <w:p>
-            <w:r>
-              <w:rPr>
-                <w:rFonts w:ascii="Calibri" w:cs="Calibri" w:eastAsia="Calibri" w:hAnsi="Calibri"/>
-                <w:sz w:val="18"/>
-                <w:szCs w:val="18"/>
-              </w:rPr>
-              <w:t xml:space="preserve">MT-02 passed</w:t>
-            </w:r>
-          </w:p>
-        </w:tc>
-        <w:tc>
-          <w:tcPr>
-            <w:tcW w:type="dxa" w:w="2050"/>
-            <w:tcBorders>
-              <w:top w:val="single" w:color="BFBFBF" w:sz="4"/>
-              <w:left w:val="single" w:color="BFBFBF" w:sz="4"/>
-              <w:bottom w:val="single" w:color="BFBFBF" w:sz="4"/>
-              <w:right w:val="single" w:color="BFBFBF" w:sz="4"/>
-            </w:tcBorders>
-            <w:tcMar>
-              <w:top w:type="dxa" w:w="60"/>
-              <w:left w:type="dxa" w:w="100"/>
-              <w:bottom w:type="dxa" w:w="60"/>
-              <w:right w:type="dxa" w:w="100"/>
-            </w:tcMar>
-          </w:tcPr>
-          <w:p>
-            <w:r>
-              <w:rPr>
-                <w:rFonts w:ascii="Calibri" w:cs="Calibri" w:eastAsia="Calibri" w:hAnsi="Calibri"/>
-                <w:sz w:val="18"/>
-                <w:szCs w:val="18"/>
-              </w:rPr>
-              <w:t xml:space="preserve">1) </w:t>
+              <w:t xml:space="preserve">/health/ready</w:t>
+            </w:r>
+            <w:r>
+              <w:rPr>
+                <w:rFonts w:ascii="Calibri" w:cs="Calibri" w:eastAsia="Calibri" w:hAnsi="Calibri"/>
+                <w:sz w:val="18"/>
+                <w:szCs w:val="18"/>
+              </w:rPr>
+              <w:t xml:space="preserve"> on :5001 3) </w:t>
             </w:r>
             <w:r>
               <w:rPr>
@@ -51024,15 +50756,189 @@
                 <w:sz w:val="16"/>
                 <w:szCs w:val="16"/>
               </w:rPr>
-              <w:t xml:space="preserve">docker compose logs --tail 50 job-service processor-service</w:t>
-            </w:r>
-            <w:r>
-              <w:rPr>
-                <w:rFonts w:ascii="Calibri" w:cs="Calibri" w:eastAsia="Calibri" w:hAnsi="Calibri"/>
-                <w:sz w:val="18"/>
-                <w:szCs w:val="18"/>
-              </w:rPr>
-              <w:t xml:space="preserve"> 2) </w:t>
+              <w:t xml:space="preserve">docker compose start mongo</w:t>
+            </w:r>
+          </w:p>
+        </w:tc>
+        <w:tc>
+          <w:tcPr>
+            <w:tcW w:type="dxa" w:w="1844"/>
+            <w:tcBorders>
+              <w:top w:val="single" w:color="BFBFBF" w:sz="4"/>
+              <w:left w:val="single" w:color="BFBFBF" w:sz="4"/>
+              <w:bottom w:val="single" w:color="BFBFBF" w:sz="4"/>
+              <w:right w:val="single" w:color="BFBFBF" w:sz="4"/>
+            </w:tcBorders>
+            <w:tcMar>
+              <w:top w:type="dxa" w:w="60"/>
+              <w:left w:type="dxa" w:w="100"/>
+              <w:bottom w:type="dxa" w:w="60"/>
+              <w:right w:type="dxa" w:w="100"/>
+            </w:tcMar>
+          </w:tcPr>
+          <w:p>
+            <w:r>
+              <w:rPr>
+                <w:rFonts w:ascii="Calibri" w:cs="Calibri" w:eastAsia="Calibri" w:hAnsi="Calibri"/>
+                <w:sz w:val="18"/>
+                <w:szCs w:val="18"/>
+              </w:rPr>
+              <w:t xml:space="preserve">503 </w:t>
+            </w:r>
+            <w:r>
+              <w:rPr>
+                <w:rFonts w:ascii="Calibri" w:cs="Calibri" w:eastAsia="Calibri" w:hAnsi="Calibri"/>
+                <w:i/>
+                <w:iCs/>
+                <w:sz w:val="18"/>
+                <w:szCs w:val="18"/>
+              </w:rPr>
+              <w:t xml:space="preserve">Storage unavailable</w:t>
+            </w:r>
+            <w:r>
+              <w:rPr>
+                <w:rFonts w:ascii="Calibri" w:cs="Calibri" w:eastAsia="Calibri" w:hAnsi="Calibri"/>
+                <w:sz w:val="18"/>
+                <w:szCs w:val="18"/>
+              </w:rPr>
+              <w:t xml:space="preserve"> ProblemDetails within ~5 s; readiness Unhealthy; service recovers after Mongo starts</w:t>
+            </w:r>
+          </w:p>
+        </w:tc>
+        <w:tc>
+          <w:tcPr>
+            <w:tcW w:type="dxa" w:w="1847"/>
+            <w:tcBorders>
+              <w:top w:val="single" w:color="BFBFBF" w:sz="4"/>
+              <w:left w:val="single" w:color="BFBFBF" w:sz="4"/>
+              <w:bottom w:val="single" w:color="BFBFBF" w:sz="4"/>
+              <w:right w:val="single" w:color="BFBFBF" w:sz="4"/>
+            </w:tcBorders>
+            <w:tcMar>
+              <w:top w:type="dxa" w:w="60"/>
+              <w:left w:type="dxa" w:w="100"/>
+              <w:bottom w:type="dxa" w:w="60"/>
+              <w:right w:type="dxa" w:w="100"/>
+            </w:tcMar>
+          </w:tcPr>
+          <w:p>
+            <w:r>
+              <w:rPr>
+                <w:rFonts w:ascii="Calibri" w:cs="Calibri" w:eastAsia="Calibri" w:hAnsi="Calibri"/>
+                <w:sz w:val="18"/>
+                <w:szCs w:val="18"/>
+              </w:rPr>
+              <w:t xml:space="preserve">Not yet executed</w:t>
+            </w:r>
+          </w:p>
+        </w:tc>
+      </w:tr>
+      <w:tr>
+        <w:tc>
+          <w:tcPr>
+            <w:tcW w:type="dxa" w:w="461"/>
+            <w:tcBorders>
+              <w:top w:val="single" w:color="BFBFBF" w:sz="4"/>
+              <w:left w:val="single" w:color="BFBFBF" w:sz="4"/>
+              <w:bottom w:val="single" w:color="BFBFBF" w:sz="4"/>
+              <w:right w:val="single" w:color="BFBFBF" w:sz="4"/>
+            </w:tcBorders>
+            <w:tcMar>
+              <w:top w:type="dxa" w:w="60"/>
+              <w:left w:type="dxa" w:w="100"/>
+              <w:bottom w:type="dxa" w:w="60"/>
+              <w:right w:type="dxa" w:w="100"/>
+            </w:tcMar>
+          </w:tcPr>
+          <w:p>
+            <w:r>
+              <w:rPr>
+                <w:rFonts w:ascii="Calibri" w:cs="Calibri" w:eastAsia="Calibri" w:hAnsi="Calibri"/>
+                <w:sz w:val="18"/>
+                <w:szCs w:val="18"/>
+              </w:rPr>
+              <w:t xml:space="preserve">MT-10</w:t>
+            </w:r>
+          </w:p>
+        </w:tc>
+        <w:tc>
+          <w:tcPr>
+            <w:tcW w:type="dxa" w:w="1798"/>
+            <w:tcBorders>
+              <w:top w:val="single" w:color="BFBFBF" w:sz="4"/>
+              <w:left w:val="single" w:color="BFBFBF" w:sz="4"/>
+              <w:bottom w:val="single" w:color="BFBFBF" w:sz="4"/>
+              <w:right w:val="single" w:color="BFBFBF" w:sz="4"/>
+            </w:tcBorders>
+            <w:tcMar>
+              <w:top w:type="dxa" w:w="60"/>
+              <w:left w:type="dxa" w:w="100"/>
+              <w:bottom w:type="dxa" w:w="60"/>
+              <w:right w:type="dxa" w:w="100"/>
+            </w:tcMar>
+          </w:tcPr>
+          <w:p>
+            <w:r>
+              <w:rPr>
+                <w:rFonts w:ascii="Calibri" w:cs="Calibri" w:eastAsia="Calibri" w:hAnsi="Calibri"/>
+                <w:sz w:val="18"/>
+                <w:szCs w:val="18"/>
+              </w:rPr>
+              <w:t xml:space="preserve">Live status stream (SSE)</w:t>
+            </w:r>
+          </w:p>
+        </w:tc>
+        <w:tc>
+          <w:tcPr>
+            <w:tcW w:type="dxa" w:w="1844"/>
+            <w:tcBorders>
+              <w:top w:val="single" w:color="BFBFBF" w:sz="4"/>
+              <w:left w:val="single" w:color="BFBFBF" w:sz="4"/>
+              <w:bottom w:val="single" w:color="BFBFBF" w:sz="4"/>
+              <w:right w:val="single" w:color="BFBFBF" w:sz="4"/>
+            </w:tcBorders>
+            <w:tcMar>
+              <w:top w:type="dxa" w:w="60"/>
+              <w:left w:type="dxa" w:w="100"/>
+              <w:bottom w:type="dxa" w:w="60"/>
+              <w:right w:type="dxa" w:w="100"/>
+            </w:tcMar>
+          </w:tcPr>
+          <w:p>
+            <w:r>
+              <w:rPr>
+                <w:rFonts w:ascii="Calibri" w:cs="Calibri" w:eastAsia="Calibri" w:hAnsi="Calibri"/>
+                <w:sz w:val="18"/>
+                <w:szCs w:val="18"/>
+              </w:rPr>
+              <w:t xml:space="preserve">MT-01 passed</w:t>
+            </w:r>
+          </w:p>
+        </w:tc>
+        <w:tc>
+          <w:tcPr>
+            <w:tcW w:type="dxa" w:w="1844"/>
+            <w:tcBorders>
+              <w:top w:val="single" w:color="BFBFBF" w:sz="4"/>
+              <w:left w:val="single" w:color="BFBFBF" w:sz="4"/>
+              <w:bottom w:val="single" w:color="BFBFBF" w:sz="4"/>
+              <w:right w:val="single" w:color="BFBFBF" w:sz="4"/>
+            </w:tcBorders>
+            <w:tcMar>
+              <w:top w:type="dxa" w:w="60"/>
+              <w:left w:type="dxa" w:w="100"/>
+              <w:bottom w:type="dxa" w:w="60"/>
+              <w:right w:type="dxa" w:w="100"/>
+            </w:tcMar>
+          </w:tcPr>
+          <w:p>
+            <w:r>
+              <w:rPr>
+                <w:rFonts w:ascii="Calibri" w:cs="Calibri" w:eastAsia="Calibri" w:hAnsi="Calibri"/>
+                <w:sz w:val="18"/>
+                <w:szCs w:val="18"/>
+              </w:rPr>
+              <w:t xml:space="preserve">1) Create a job 2) </w:t>
             </w:r>
             <w:r>
               <w:rPr>
@@ -51041,16 +50947,27 @@
                 <w:sz w:val="16"/>
                 <w:szCs w:val="16"/>
               </w:rPr>
-              <w:t xml:space="preserve">docker exec -it ta9-mongo-1 mongosh ta9_logs --eval "db.logs.find({jobId:'&lt;id&gt;'}).sort({timestamp:1})"</w:t>
-            </w:r>
-            <w:r>
-              <w:rPr>
-                <w:rFonts w:ascii="Calibri" w:cs="Calibri" w:eastAsia="Calibri" w:hAnsi="Calibri"/>
-                <w:sz w:val="18"/>
-                <w:szCs w:val="18"/>
-              </w:rPr>
-              <w:t xml:space="preserve"> with the job id from MT-02 3) </w:t>
-            </w:r>
+              <w:t xml:space="preserve">curl.exe -N http://localhost:5001/api/jobs/&lt;id&gt;/events</w:t>
+            </w:r>
+          </w:p>
+        </w:tc>
+        <w:tc>
+          <w:tcPr>
+            <w:tcW w:type="dxa" w:w="1844"/>
+            <w:tcBorders>
+              <w:top w:val="single" w:color="BFBFBF" w:sz="4"/>
+              <w:left w:val="single" w:color="BFBFBF" w:sz="4"/>
+              <w:bottom w:val="single" w:color="BFBFBF" w:sz="4"/>
+              <w:right w:val="single" w:color="BFBFBF" w:sz="4"/>
+            </w:tcBorders>
+            <w:tcMar>
+              <w:top w:type="dxa" w:w="60"/>
+              <w:left w:type="dxa" w:w="100"/>
+              <w:bottom w:type="dxa" w:w="60"/>
+              <w:right w:type="dxa" w:w="100"/>
+            </w:tcMar>
+          </w:tcPr>
+          <w:p>
             <w:r>
               <w:rPr>
                 <w:rFonts w:ascii="Consolas" w:cs="Consolas" w:eastAsia="Consolas" w:hAnsi="Consolas"/>
@@ -51058,34 +50975,152 @@
                 <w:sz w:val="16"/>
                 <w:szCs w:val="16"/>
               </w:rPr>
-              <w:t xml:space="preserve">db.logs.find({level:'Error'})</w:t>
-            </w:r>
-          </w:p>
-        </w:tc>
-        <w:tc>
-          <w:tcPr>
-            <w:tcW w:type="dxa" w:w="2050"/>
-            <w:tcBorders>
-              <w:top w:val="single" w:color="BFBFBF" w:sz="4"/>
-              <w:left w:val="single" w:color="BFBFBF" w:sz="4"/>
-              <w:bottom w:val="single" w:color="BFBFBF" w:sz="4"/>
-              <w:right w:val="single" w:color="BFBFBF" w:sz="4"/>
-            </w:tcBorders>
-            <w:tcMar>
-              <w:top w:type="dxa" w:w="60"/>
-              <w:left w:type="dxa" w:w="100"/>
-              <w:bottom w:type="dxa" w:w="60"/>
-              <w:right w:type="dxa" w:w="100"/>
-            </w:tcMar>
-          </w:tcPr>
-          <w:p>
-            <w:r>
-              <w:rPr>
-                <w:rFonts w:ascii="Calibri" w:cs="Calibri" w:eastAsia="Calibri" w:hAnsi="Calibri"/>
-                <w:sz w:val="18"/>
-                <w:szCs w:val="18"/>
-              </w:rPr>
-              <w:t xml:space="preserve">Console shows the flow (Information); MongoDB holds Debug + Information records of all three services for the job with one </w:t>
+              <w:t xml:space="preserve">event: status</w:t>
+            </w:r>
+            <w:r>
+              <w:rPr>
+                <w:rFonts w:ascii="Calibri" w:cs="Calibri" w:eastAsia="Calibri" w:hAnsi="Calibri"/>
+                <w:sz w:val="18"/>
+                <w:szCs w:val="18"/>
+              </w:rPr>
+              <w:t xml:space="preserve"> lines: snapshot, then Processing with progress, then Completed; stream closes</w:t>
+            </w:r>
+          </w:p>
+        </w:tc>
+        <w:tc>
+          <w:tcPr>
+            <w:tcW w:type="dxa" w:w="1847"/>
+            <w:tcBorders>
+              <w:top w:val="single" w:color="BFBFBF" w:sz="4"/>
+              <w:left w:val="single" w:color="BFBFBF" w:sz="4"/>
+              <w:bottom w:val="single" w:color="BFBFBF" w:sz="4"/>
+              <w:right w:val="single" w:color="BFBFBF" w:sz="4"/>
+            </w:tcBorders>
+            <w:tcMar>
+              <w:top w:type="dxa" w:w="60"/>
+              <w:left w:type="dxa" w:w="100"/>
+              <w:bottom w:type="dxa" w:w="60"/>
+              <w:right w:type="dxa" w:w="100"/>
+            </w:tcMar>
+          </w:tcPr>
+          <w:p>
+            <w:r>
+              <w:rPr>
+                <w:rFonts w:ascii="Calibri" w:cs="Calibri" w:eastAsia="Calibri" w:hAnsi="Calibri"/>
+                <w:sz w:val="18"/>
+                <w:szCs w:val="18"/>
+              </w:rPr>
+              <w:t xml:space="preserve">Passed (2026-10-27)</w:t>
+            </w:r>
+          </w:p>
+        </w:tc>
+      </w:tr>
+      <w:tr>
+        <w:tc>
+          <w:tcPr>
+            <w:tcW w:type="dxa" w:w="461"/>
+            <w:tcBorders>
+              <w:top w:val="single" w:color="BFBFBF" w:sz="4"/>
+              <w:left w:val="single" w:color="BFBFBF" w:sz="4"/>
+              <w:bottom w:val="single" w:color="BFBFBF" w:sz="4"/>
+              <w:right w:val="single" w:color="BFBFBF" w:sz="4"/>
+            </w:tcBorders>
+            <w:tcMar>
+              <w:top w:type="dxa" w:w="60"/>
+              <w:left w:type="dxa" w:w="100"/>
+              <w:bottom w:type="dxa" w:w="60"/>
+              <w:right w:type="dxa" w:w="100"/>
+            </w:tcMar>
+          </w:tcPr>
+          <w:p>
+            <w:r>
+              <w:rPr>
+                <w:rFonts w:ascii="Calibri" w:cs="Calibri" w:eastAsia="Calibri" w:hAnsi="Calibri"/>
+                <w:sz w:val="18"/>
+                <w:szCs w:val="18"/>
+              </w:rPr>
+              <w:t xml:space="preserve">MT-11</w:t>
+            </w:r>
+          </w:p>
+        </w:tc>
+        <w:tc>
+          <w:tcPr>
+            <w:tcW w:type="dxa" w:w="1798"/>
+            <w:tcBorders>
+              <w:top w:val="single" w:color="BFBFBF" w:sz="4"/>
+              <w:left w:val="single" w:color="BFBFBF" w:sz="4"/>
+              <w:bottom w:val="single" w:color="BFBFBF" w:sz="4"/>
+              <w:right w:val="single" w:color="BFBFBF" w:sz="4"/>
+            </w:tcBorders>
+            <w:tcMar>
+              <w:top w:type="dxa" w:w="60"/>
+              <w:left w:type="dxa" w:w="100"/>
+              <w:bottom w:type="dxa" w:w="60"/>
+              <w:right w:type="dxa" w:w="100"/>
+            </w:tcMar>
+          </w:tcPr>
+          <w:p>
+            <w:r>
+              <w:rPr>
+                <w:rFonts w:ascii="Calibri" w:cs="Calibri" w:eastAsia="Calibri" w:hAnsi="Calibri"/>
+                <w:sz w:val="18"/>
+                <w:szCs w:val="18"/>
+              </w:rPr>
+              <w:t xml:space="preserve">Logs in console and MongoDB</w:t>
+            </w:r>
+          </w:p>
+        </w:tc>
+        <w:tc>
+          <w:tcPr>
+            <w:tcW w:type="dxa" w:w="1844"/>
+            <w:tcBorders>
+              <w:top w:val="single" w:color="BFBFBF" w:sz="4"/>
+              <w:left w:val="single" w:color="BFBFBF" w:sz="4"/>
+              <w:bottom w:val="single" w:color="BFBFBF" w:sz="4"/>
+              <w:right w:val="single" w:color="BFBFBF" w:sz="4"/>
+            </w:tcBorders>
+            <w:tcMar>
+              <w:top w:type="dxa" w:w="60"/>
+              <w:left w:type="dxa" w:w="100"/>
+              <w:bottom w:type="dxa" w:w="60"/>
+              <w:right w:type="dxa" w:w="100"/>
+            </w:tcMar>
+          </w:tcPr>
+          <w:p>
+            <w:r>
+              <w:rPr>
+                <w:rFonts w:ascii="Calibri" w:cs="Calibri" w:eastAsia="Calibri" w:hAnsi="Calibri"/>
+                <w:sz w:val="18"/>
+                <w:szCs w:val="18"/>
+              </w:rPr>
+              <w:t xml:space="preserve">MT-02 passed</w:t>
+            </w:r>
+          </w:p>
+        </w:tc>
+        <w:tc>
+          <w:tcPr>
+            <w:tcW w:type="dxa" w:w="1844"/>
+            <w:tcBorders>
+              <w:top w:val="single" w:color="BFBFBF" w:sz="4"/>
+              <w:left w:val="single" w:color="BFBFBF" w:sz="4"/>
+              <w:bottom w:val="single" w:color="BFBFBF" w:sz="4"/>
+              <w:right w:val="single" w:color="BFBFBF" w:sz="4"/>
+            </w:tcBorders>
+            <w:tcMar>
+              <w:top w:type="dxa" w:w="60"/>
+              <w:left w:type="dxa" w:w="100"/>
+              <w:bottom w:type="dxa" w:w="60"/>
+              <w:right w:type="dxa" w:w="100"/>
+            </w:tcMar>
+          </w:tcPr>
+          <w:p>
+            <w:r>
+              <w:rPr>
+                <w:rFonts w:ascii="Calibri" w:cs="Calibri" w:eastAsia="Calibri" w:hAnsi="Calibri"/>
+                <w:sz w:val="18"/>
+                <w:szCs w:val="18"/>
+              </w:rPr>
+              <w:t xml:space="preserve">1) </w:t>
             </w:r>
             <w:r>
               <w:rPr>
@@ -51094,15 +51129,15 @@
                 <w:sz w:val="16"/>
                 <w:szCs w:val="16"/>
               </w:rPr>
-              <w:t xml:space="preserve">correlationId</w:t>
-            </w:r>
-            <w:r>
-              <w:rPr>
-                <w:rFonts w:ascii="Calibri" w:cs="Calibri" w:eastAsia="Calibri" w:hAnsi="Calibri"/>
-                <w:sz w:val="18"/>
-                <w:szCs w:val="18"/>
-              </w:rPr>
-              <w:t xml:space="preserve">; TTL index </w:t>
+              <w:t xml:space="preserve">docker compose logs --tail 50 job-service processor-service</w:t>
+            </w:r>
+            <w:r>
+              <w:rPr>
+                <w:rFonts w:ascii="Calibri" w:cs="Calibri" w:eastAsia="Calibri" w:hAnsi="Calibri"/>
+                <w:sz w:val="18"/>
+                <w:szCs w:val="18"/>
+              </w:rPr>
+              <w:t xml:space="preserve"> 2) </w:t>
             </w:r>
             <w:r>
               <w:rPr>
@@ -51111,125 +51146,15 @@
                 <w:sz w:val="16"/>
                 <w:szCs w:val="16"/>
               </w:rPr>
-              <w:t xml:space="preserve">ttl_timestamp</w:t>
-            </w:r>
-            <w:r>
-              <w:rPr>
-                <w:rFonts w:ascii="Calibri" w:cs="Calibri" w:eastAsia="Calibri" w:hAnsi="Calibri"/>
-                <w:sz w:val="18"/>
-                <w:szCs w:val="18"/>
-              </w:rPr>
-              <w:t xml:space="preserve"> exists</w:t>
-            </w:r>
-          </w:p>
-        </w:tc>
-        <w:tc>
-          <w:tcPr>
-            <w:tcW w:type="dxa" w:w="977"/>
-            <w:tcBorders>
-              <w:top w:val="single" w:color="BFBFBF" w:sz="4"/>
-              <w:left w:val="single" w:color="BFBFBF" w:sz="4"/>
-              <w:bottom w:val="single" w:color="BFBFBF" w:sz="4"/>
-              <w:right w:val="single" w:color="BFBFBF" w:sz="4"/>
-            </w:tcBorders>
-            <w:tcMar>
-              <w:top w:type="dxa" w:w="60"/>
-              <w:left w:type="dxa" w:w="100"/>
-              <w:bottom w:type="dxa" w:w="60"/>
-              <w:right w:type="dxa" w:w="100"/>
-            </w:tcMar>
-          </w:tcPr>
-          <w:p>
-            <w:r>
-              <w:rPr>
-                <w:rFonts w:ascii="Calibri" w:cs="Calibri" w:eastAsia="Calibri" w:hAnsi="Calibri"/>
-                <w:sz w:val="18"/>
-                <w:szCs w:val="18"/>
-              </w:rPr>
-              <w:t xml:space="preserve">Not yet executed</w:t>
-            </w:r>
-          </w:p>
-        </w:tc>
-      </w:tr>
-      <w:tr>
-        <w:tc>
-          <w:tcPr>
-            <w:tcW w:type="dxa" w:w="512"/>
-            <w:tcBorders>
-              <w:top w:val="single" w:color="BFBFBF" w:sz="4"/>
-              <w:left w:val="single" w:color="BFBFBF" w:sz="4"/>
-              <w:bottom w:val="single" w:color="BFBFBF" w:sz="4"/>
-              <w:right w:val="single" w:color="BFBFBF" w:sz="4"/>
-            </w:tcBorders>
-            <w:tcMar>
-              <w:top w:type="dxa" w:w="60"/>
-              <w:left w:type="dxa" w:w="100"/>
-              <w:bottom w:type="dxa" w:w="60"/>
-              <w:right w:type="dxa" w:w="100"/>
-            </w:tcMar>
-          </w:tcPr>
-          <w:p>
-            <w:r>
-              <w:rPr>
-                <w:rFonts w:ascii="Calibri" w:cs="Calibri" w:eastAsia="Calibri" w:hAnsi="Calibri"/>
-                <w:sz w:val="18"/>
-                <w:szCs w:val="18"/>
-              </w:rPr>
-              <w:t xml:space="preserve">MT-12</w:t>
-            </w:r>
-          </w:p>
-        </w:tc>
-        <w:tc>
-          <w:tcPr>
-            <w:tcW w:type="dxa" w:w="1999"/>
-            <w:tcBorders>
-              <w:top w:val="single" w:color="BFBFBF" w:sz="4"/>
-              <w:left w:val="single" w:color="BFBFBF" w:sz="4"/>
-              <w:bottom w:val="single" w:color="BFBFBF" w:sz="4"/>
-              <w:right w:val="single" w:color="BFBFBF" w:sz="4"/>
-            </w:tcBorders>
-            <w:tcMar>
-              <w:top w:type="dxa" w:w="60"/>
-              <w:left w:type="dxa" w:w="100"/>
-              <w:bottom w:type="dxa" w:w="60"/>
-              <w:right w:type="dxa" w:w="100"/>
-            </w:tcMar>
-          </w:tcPr>
-          <w:p>
-            <w:r>
-              <w:rPr>
-                <w:rFonts w:ascii="Calibri" w:cs="Calibri" w:eastAsia="Calibri" w:hAnsi="Calibri"/>
-                <w:sz w:val="18"/>
-                <w:szCs w:val="18"/>
-              </w:rPr>
-              <w:t xml:space="preserve">Web UI walkthrough</w:t>
-            </w:r>
-          </w:p>
-        </w:tc>
-        <w:tc>
-          <w:tcPr>
-            <w:tcW w:type="dxa" w:w="2050"/>
-            <w:tcBorders>
-              <w:top w:val="single" w:color="BFBFBF" w:sz="4"/>
-              <w:left w:val="single" w:color="BFBFBF" w:sz="4"/>
-              <w:bottom w:val="single" w:color="BFBFBF" w:sz="4"/>
-              <w:right w:val="single" w:color="BFBFBF" w:sz="4"/>
-            </w:tcBorders>
-            <w:tcMar>
-              <w:top w:type="dxa" w:w="60"/>
-              <w:left w:type="dxa" w:w="100"/>
-              <w:bottom w:type="dxa" w:w="60"/>
-              <w:right w:type="dxa" w:w="100"/>
-            </w:tcMar>
-          </w:tcPr>
-          <w:p>
-            <w:r>
-              <w:rPr>
-                <w:rFonts w:ascii="Calibri" w:cs="Calibri" w:eastAsia="Calibri" w:hAnsi="Calibri"/>
-                <w:sz w:val="18"/>
-                <w:szCs w:val="18"/>
-              </w:rPr>
-              <w:t xml:space="preserve">Stack up incl. </w:t>
+              <w:t xml:space="preserve">docker exec -it ta9-mongo-1 mongosh ta9_logs --eval "db.logs.find({jobId:'&lt;id&gt;'}).sort({timestamp:1})"</w:t>
+            </w:r>
+            <w:r>
+              <w:rPr>
+                <w:rFonts w:ascii="Calibri" w:cs="Calibri" w:eastAsia="Calibri" w:hAnsi="Calibri"/>
+                <w:sz w:val="18"/>
+                <w:szCs w:val="18"/>
+              </w:rPr>
+              <w:t xml:space="preserve"> with the job id from MT-02 3) </w:t>
             </w:r>
             <w:r>
               <w:rPr>
@@ -51238,15 +51163,34 @@
                 <w:sz w:val="16"/>
                 <w:szCs w:val="16"/>
               </w:rPr>
-              <w:t xml:space="preserve">ui</w:t>
-            </w:r>
-            <w:r>
-              <w:rPr>
-                <w:rFonts w:ascii="Calibri" w:cs="Calibri" w:eastAsia="Calibri" w:hAnsi="Calibri"/>
-                <w:sz w:val="18"/>
-                <w:szCs w:val="18"/>
-              </w:rPr>
-              <w:t xml:space="preserve"> (</w:t>
+              <w:t xml:space="preserve">db.logs.find({level:'Error'})</w:t>
+            </w:r>
+          </w:p>
+        </w:tc>
+        <w:tc>
+          <w:tcPr>
+            <w:tcW w:type="dxa" w:w="1844"/>
+            <w:tcBorders>
+              <w:top w:val="single" w:color="BFBFBF" w:sz="4"/>
+              <w:left w:val="single" w:color="BFBFBF" w:sz="4"/>
+              <w:bottom w:val="single" w:color="BFBFBF" w:sz="4"/>
+              <w:right w:val="single" w:color="BFBFBF" w:sz="4"/>
+            </w:tcBorders>
+            <w:tcMar>
+              <w:top w:type="dxa" w:w="60"/>
+              <w:left w:type="dxa" w:w="100"/>
+              <w:bottom w:type="dxa" w:w="60"/>
+              <w:right w:type="dxa" w:w="100"/>
+            </w:tcMar>
+          </w:tcPr>
+          <w:p>
+            <w:r>
+              <w:rPr>
+                <w:rFonts w:ascii="Calibri" w:cs="Calibri" w:eastAsia="Calibri" w:hAnsi="Calibri"/>
+                <w:sz w:val="18"/>
+                <w:szCs w:val="18"/>
+              </w:rPr>
+              <w:t xml:space="preserve">Console shows the flow (Information); MongoDB holds Debug + Information records of all three services for the job with one </w:t>
             </w:r>
             <w:r>
               <w:rPr>
@@ -51255,15 +51199,15 @@
                 <w:sz w:val="16"/>
                 <w:szCs w:val="16"/>
               </w:rPr>
-              <w:t xml:space="preserve">docker compose up --build -d</w:t>
-            </w:r>
-            <w:r>
-              <w:rPr>
-                <w:rFonts w:ascii="Calibri" w:cs="Calibri" w:eastAsia="Calibri" w:hAnsi="Calibri"/>
-                <w:sz w:val="18"/>
-                <w:szCs w:val="18"/>
-              </w:rPr>
-              <w:t xml:space="preserve">, or </w:t>
+              <w:t xml:space="preserve">correlationId</w:t>
+            </w:r>
+            <w:r>
+              <w:rPr>
+                <w:rFonts w:ascii="Calibri" w:cs="Calibri" w:eastAsia="Calibri" w:hAnsi="Calibri"/>
+                <w:sz w:val="18"/>
+                <w:szCs w:val="18"/>
+              </w:rPr>
+              <w:t xml:space="preserve">; TTL index </w:t>
             </w:r>
             <w:r>
               <w:rPr>
@@ -51272,6 +51216,167 @@
                 <w:sz w:val="16"/>
                 <w:szCs w:val="16"/>
               </w:rPr>
+              <w:t xml:space="preserve">ttl_timestamp</w:t>
+            </w:r>
+            <w:r>
+              <w:rPr>
+                <w:rFonts w:ascii="Calibri" w:cs="Calibri" w:eastAsia="Calibri" w:hAnsi="Calibri"/>
+                <w:sz w:val="18"/>
+                <w:szCs w:val="18"/>
+              </w:rPr>
+              <w:t xml:space="preserve"> exists</w:t>
+            </w:r>
+          </w:p>
+        </w:tc>
+        <w:tc>
+          <w:tcPr>
+            <w:tcW w:type="dxa" w:w="1847"/>
+            <w:tcBorders>
+              <w:top w:val="single" w:color="BFBFBF" w:sz="4"/>
+              <w:left w:val="single" w:color="BFBFBF" w:sz="4"/>
+              <w:bottom w:val="single" w:color="BFBFBF" w:sz="4"/>
+              <w:right w:val="single" w:color="BFBFBF" w:sz="4"/>
+            </w:tcBorders>
+            <w:tcMar>
+              <w:top w:type="dxa" w:w="60"/>
+              <w:left w:type="dxa" w:w="100"/>
+              <w:bottom w:type="dxa" w:w="60"/>
+              <w:right w:type="dxa" w:w="100"/>
+            </w:tcMar>
+          </w:tcPr>
+          <w:p>
+            <w:r>
+              <w:rPr>
+                <w:rFonts w:ascii="Calibri" w:cs="Calibri" w:eastAsia="Calibri" w:hAnsi="Calibri"/>
+                <w:sz w:val="18"/>
+                <w:szCs w:val="18"/>
+              </w:rPr>
+              <w:t xml:space="preserve">Not yet executed</w:t>
+            </w:r>
+          </w:p>
+        </w:tc>
+      </w:tr>
+      <w:tr>
+        <w:tc>
+          <w:tcPr>
+            <w:tcW w:type="dxa" w:w="461"/>
+            <w:tcBorders>
+              <w:top w:val="single" w:color="BFBFBF" w:sz="4"/>
+              <w:left w:val="single" w:color="BFBFBF" w:sz="4"/>
+              <w:bottom w:val="single" w:color="BFBFBF" w:sz="4"/>
+              <w:right w:val="single" w:color="BFBFBF" w:sz="4"/>
+            </w:tcBorders>
+            <w:tcMar>
+              <w:top w:type="dxa" w:w="60"/>
+              <w:left w:type="dxa" w:w="100"/>
+              <w:bottom w:type="dxa" w:w="60"/>
+              <w:right w:type="dxa" w:w="100"/>
+            </w:tcMar>
+          </w:tcPr>
+          <w:p>
+            <w:r>
+              <w:rPr>
+                <w:rFonts w:ascii="Calibri" w:cs="Calibri" w:eastAsia="Calibri" w:hAnsi="Calibri"/>
+                <w:sz w:val="18"/>
+                <w:szCs w:val="18"/>
+              </w:rPr>
+              <w:t xml:space="preserve">MT-12</w:t>
+            </w:r>
+          </w:p>
+        </w:tc>
+        <w:tc>
+          <w:tcPr>
+            <w:tcW w:type="dxa" w:w="1798"/>
+            <w:tcBorders>
+              <w:top w:val="single" w:color="BFBFBF" w:sz="4"/>
+              <w:left w:val="single" w:color="BFBFBF" w:sz="4"/>
+              <w:bottom w:val="single" w:color="BFBFBF" w:sz="4"/>
+              <w:right w:val="single" w:color="BFBFBF" w:sz="4"/>
+            </w:tcBorders>
+            <w:tcMar>
+              <w:top w:type="dxa" w:w="60"/>
+              <w:left w:type="dxa" w:w="100"/>
+              <w:bottom w:type="dxa" w:w="60"/>
+              <w:right w:type="dxa" w:w="100"/>
+            </w:tcMar>
+          </w:tcPr>
+          <w:p>
+            <w:r>
+              <w:rPr>
+                <w:rFonts w:ascii="Calibri" w:cs="Calibri" w:eastAsia="Calibri" w:hAnsi="Calibri"/>
+                <w:sz w:val="18"/>
+                <w:szCs w:val="18"/>
+              </w:rPr>
+              <w:t xml:space="preserve">Web UI walkthrough</w:t>
+            </w:r>
+          </w:p>
+        </w:tc>
+        <w:tc>
+          <w:tcPr>
+            <w:tcW w:type="dxa" w:w="1844"/>
+            <w:tcBorders>
+              <w:top w:val="single" w:color="BFBFBF" w:sz="4"/>
+              <w:left w:val="single" w:color="BFBFBF" w:sz="4"/>
+              <w:bottom w:val="single" w:color="BFBFBF" w:sz="4"/>
+              <w:right w:val="single" w:color="BFBFBF" w:sz="4"/>
+            </w:tcBorders>
+            <w:tcMar>
+              <w:top w:type="dxa" w:w="60"/>
+              <w:left w:type="dxa" w:w="100"/>
+              <w:bottom w:type="dxa" w:w="60"/>
+              <w:right w:type="dxa" w:w="100"/>
+            </w:tcMar>
+          </w:tcPr>
+          <w:p>
+            <w:r>
+              <w:rPr>
+                <w:rFonts w:ascii="Calibri" w:cs="Calibri" w:eastAsia="Calibri" w:hAnsi="Calibri"/>
+                <w:sz w:val="18"/>
+                <w:szCs w:val="18"/>
+              </w:rPr>
+              <w:t xml:space="preserve">Stack up incl. </w:t>
+            </w:r>
+            <w:r>
+              <w:rPr>
+                <w:rFonts w:ascii="Consolas" w:cs="Consolas" w:eastAsia="Consolas" w:hAnsi="Consolas"/>
+                <w:color w:val="5B2C6F"/>
+                <w:sz w:val="16"/>
+                <w:szCs w:val="16"/>
+              </w:rPr>
+              <w:t xml:space="preserve">ui</w:t>
+            </w:r>
+            <w:r>
+              <w:rPr>
+                <w:rFonts w:ascii="Calibri" w:cs="Calibri" w:eastAsia="Calibri" w:hAnsi="Calibri"/>
+                <w:sz w:val="18"/>
+                <w:szCs w:val="18"/>
+              </w:rPr>
+              <w:t xml:space="preserve"> (</w:t>
+            </w:r>
+            <w:r>
+              <w:rPr>
+                <w:rFonts w:ascii="Consolas" w:cs="Consolas" w:eastAsia="Consolas" w:hAnsi="Consolas"/>
+                <w:color w:val="5B2C6F"/>
+                <w:sz w:val="16"/>
+                <w:szCs w:val="16"/>
+              </w:rPr>
+              <w:t xml:space="preserve">docker compose up --build -d</w:t>
+            </w:r>
+            <w:r>
+              <w:rPr>
+                <w:rFonts w:ascii="Calibri" w:cs="Calibri" w:eastAsia="Calibri" w:hAnsi="Calibri"/>
+                <w:sz w:val="18"/>
+                <w:szCs w:val="18"/>
+              </w:rPr>
+              <w:t xml:space="preserve">, or </w:t>
+            </w:r>
+            <w:r>
+              <w:rPr>
+                <w:rFonts w:ascii="Consolas" w:cs="Consolas" w:eastAsia="Consolas" w:hAnsi="Consolas"/>
+                <w:color w:val="5B2C6F"/>
+                <w:sz w:val="16"/>
+                <w:szCs w:val="16"/>
+              </w:rPr>
               <w:t xml:space="preserve">scripts/docker-up-prebuilt.ps1</w:t>
             </w:r>
             <w:r>
@@ -51286,7 +51391,7 @@
         </w:tc>
         <w:tc>
           <w:tcPr>
-            <w:tcW w:type="dxa" w:w="2050"/>
+            <w:tcW w:type="dxa" w:w="1844"/>
             <w:tcBorders>
               <w:top w:val="single" w:color="BFBFBF" w:sz="4"/>
               <w:left w:val="single" w:color="BFBFBF" w:sz="4"/>
@@ -51395,7 +51500,7 @@
         </w:tc>
         <w:tc>
           <w:tcPr>
-            <w:tcW w:type="dxa" w:w="2050"/>
+            <w:tcW w:type="dxa" w:w="1844"/>
             <w:tcBorders>
               <w:top w:val="single" w:color="BFBFBF" w:sz="4"/>
               <w:left w:val="single" w:color="BFBFBF" w:sz="4"/>
@@ -51440,7 +51545,7 @@
         </w:tc>
         <w:tc>
           <w:tcPr>
-            <w:tcW w:type="dxa" w:w="977"/>
+            <w:tcW w:type="dxa" w:w="1847"/>
             <w:tcBorders>
               <w:top w:val="single" w:color="BFBFBF" w:sz="4"/>
               <w:left w:val="single" w:color="BFBFBF" w:sz="4"/>

</xml_diff>

<commit_message>
test: manual MT-07 and MT-11 passed; MT-08 executed (scenario not reached, covered by E2E-004)
Co-Authored-By: Claude Opus 5.5 <noreply@anthropic.com>
</commit_message>
<xml_diff>
--- a/docs/testing/TA9-STD.docx
+++ b/docs/testing/TA9-STD.docx
@@ -50396,117 +50396,7 @@
                 <w:sz w:val="18"/>
                 <w:szCs w:val="18"/>
               </w:rPr>
-              <w:t xml:space="preserve">Not yet executed</w:t>
-            </w:r>
-          </w:p>
-        </w:tc>
-      </w:tr>
-      <w:tr>
-        <w:tc>
-          <w:tcPr>
-            <w:tcW w:type="dxa" w:w="461"/>
-            <w:tcBorders>
-              <w:top w:val="single" w:color="BFBFBF" w:sz="4"/>
-              <w:left w:val="single" w:color="BFBFBF" w:sz="4"/>
-              <w:bottom w:val="single" w:color="BFBFBF" w:sz="4"/>
-              <w:right w:val="single" w:color="BFBFBF" w:sz="4"/>
-            </w:tcBorders>
-            <w:tcMar>
-              <w:top w:type="dxa" w:w="60"/>
-              <w:left w:type="dxa" w:w="100"/>
-              <w:bottom w:type="dxa" w:w="60"/>
-              <w:right w:type="dxa" w:w="100"/>
-            </w:tcMar>
-          </w:tcPr>
-          <w:p>
-            <w:r>
-              <w:rPr>
-                <w:rFonts w:ascii="Calibri" w:cs="Calibri" w:eastAsia="Calibri" w:hAnsi="Calibri"/>
-                <w:sz w:val="18"/>
-                <w:szCs w:val="18"/>
-              </w:rPr>
-              <w:t xml:space="preserve">MT-08</w:t>
-            </w:r>
-          </w:p>
-        </w:tc>
-        <w:tc>
-          <w:tcPr>
-            <w:tcW w:type="dxa" w:w="1798"/>
-            <w:tcBorders>
-              <w:top w:val="single" w:color="BFBFBF" w:sz="4"/>
-              <w:left w:val="single" w:color="BFBFBF" w:sz="4"/>
-              <w:bottom w:val="single" w:color="BFBFBF" w:sz="4"/>
-              <w:right w:val="single" w:color="BFBFBF" w:sz="4"/>
-            </w:tcBorders>
-            <w:tcMar>
-              <w:top w:type="dxa" w:w="60"/>
-              <w:left w:type="dxa" w:w="100"/>
-              <w:bottom w:type="dxa" w:w="60"/>
-              <w:right w:type="dxa" w:w="100"/>
-            </w:tcMar>
-          </w:tcPr>
-          <w:p>
-            <w:r>
-              <w:rPr>
-                <w:rFonts w:ascii="Calibri" w:cs="Calibri" w:eastAsia="Calibri" w:hAnsi="Calibri"/>
-                <w:sz w:val="18"/>
-                <w:szCs w:val="18"/>
-              </w:rPr>
-              <w:t xml:space="preserve">Processor restart mid-job</w:t>
-            </w:r>
-          </w:p>
-        </w:tc>
-        <w:tc>
-          <w:tcPr>
-            <w:tcW w:type="dxa" w:w="1844"/>
-            <w:tcBorders>
-              <w:top w:val="single" w:color="BFBFBF" w:sz="4"/>
-              <w:left w:val="single" w:color="BFBFBF" w:sz="4"/>
-              <w:bottom w:val="single" w:color="BFBFBF" w:sz="4"/>
-              <w:right w:val="single" w:color="BFBFBF" w:sz="4"/>
-            </w:tcBorders>
-            <w:tcMar>
-              <w:top w:type="dxa" w:w="60"/>
-              <w:left w:type="dxa" w:w="100"/>
-              <w:bottom w:type="dxa" w:w="60"/>
-              <w:right w:type="dxa" w:w="100"/>
-            </w:tcMar>
-          </w:tcPr>
-          <w:p>
-            <w:r>
-              <w:rPr>
-                <w:rFonts w:ascii="Calibri" w:cs="Calibri" w:eastAsia="Calibri" w:hAnsi="Calibri"/>
-                <w:sz w:val="18"/>
-                <w:szCs w:val="18"/>
-              </w:rPr>
-              <w:t xml:space="preserve">MT-01 passed</w:t>
-            </w:r>
-          </w:p>
-        </w:tc>
-        <w:tc>
-          <w:tcPr>
-            <w:tcW w:type="dxa" w:w="1844"/>
-            <w:tcBorders>
-              <w:top w:val="single" w:color="BFBFBF" w:sz="4"/>
-              <w:left w:val="single" w:color="BFBFBF" w:sz="4"/>
-              <w:bottom w:val="single" w:color="BFBFBF" w:sz="4"/>
-              <w:right w:val="single" w:color="BFBFBF" w:sz="4"/>
-            </w:tcBorders>
-            <w:tcMar>
-              <w:top w:type="dxa" w:w="60"/>
-              <w:left w:type="dxa" w:w="100"/>
-              <w:bottom w:type="dxa" w:w="60"/>
-              <w:right w:type="dxa" w:w="100"/>
-            </w:tcMar>
-          </w:tcPr>
-          <w:p>
-            <w:r>
-              <w:rPr>
-                <w:rFonts w:ascii="Calibri" w:cs="Calibri" w:eastAsia="Calibri" w:hAnsi="Calibri"/>
-                <w:sz w:val="18"/>
-                <w:szCs w:val="18"/>
-              </w:rPr>
-              <w:t xml:space="preserve">1) Start the 10 × 1,000 load 2) </w:t>
+              <w:t xml:space="preserve">Passed (2026-10-27): </w:t>
             </w:r>
             <w:r>
               <w:rPr>
@@ -50515,15 +50405,15 @@
                 <w:sz w:val="16"/>
                 <w:szCs w:val="16"/>
               </w:rPr>
-              <w:t xml:space="preserve">docker compose restart processor-service</w:t>
-            </w:r>
-            <w:r>
-              <w:rPr>
-                <w:rFonts w:ascii="Calibri" w:cs="Calibri" w:eastAsia="Calibri" w:hAnsi="Calibri"/>
-                <w:sz w:val="18"/>
-                <w:szCs w:val="18"/>
-              </w:rPr>
-              <w:t xml:space="preserve"> while jobs are Processing 3) Watch </w:t>
+              <w:t xml:space="preserve">docker stop</w:t>
+            </w:r>
+            <w:r>
+              <w:rPr>
+                <w:rFonts w:ascii="Calibri" w:cs="Calibri" w:eastAsia="Calibri" w:hAnsi="Calibri"/>
+                <w:sz w:val="18"/>
+                <w:szCs w:val="18"/>
+              </w:rPr>
+              <w:t xml:space="preserve"> of the Job Service → processor logged </w:t>
             </w:r>
             <w:r>
               <w:rPr>
@@ -50532,171 +50422,15 @@
                 <w:sz w:val="16"/>
                 <w:szCs w:val="16"/>
               </w:rPr>
-              <w:t xml:space="preserve">GET /api/jobs?status=Processing</w:t>
-            </w:r>
-          </w:p>
-        </w:tc>
-        <w:tc>
-          <w:tcPr>
-            <w:tcW w:type="dxa" w:w="1844"/>
-            <w:tcBorders>
-              <w:top w:val="single" w:color="BFBFBF" w:sz="4"/>
-              <w:left w:val="single" w:color="BFBFBF" w:sz="4"/>
-              <w:bottom w:val="single" w:color="BFBFBF" w:sz="4"/>
-              <w:right w:val="single" w:color="BFBFBF" w:sz="4"/>
-            </w:tcBorders>
-            <w:tcMar>
-              <w:top w:type="dxa" w:w="60"/>
-              <w:left w:type="dxa" w:w="100"/>
-              <w:bottom w:type="dxa" w:w="60"/>
-              <w:right w:type="dxa" w:w="100"/>
-            </w:tcMar>
-          </w:tcPr>
-          <w:p>
-            <w:r>
-              <w:rPr>
-                <w:rFonts w:ascii="Calibri" w:cs="Calibri" w:eastAsia="Calibri" w:hAnsi="Calibri"/>
-                <w:sz w:val="18"/>
-                <w:szCs w:val="18"/>
-              </w:rPr>
-              <w:t xml:space="preserve">Within ~60–90 s the reconciler redispatches lost jobs; all jobs end Completed</w:t>
-            </w:r>
-          </w:p>
-        </w:tc>
-        <w:tc>
-          <w:tcPr>
-            <w:tcW w:type="dxa" w:w="1847"/>
-            <w:tcBorders>
-              <w:top w:val="single" w:color="BFBFBF" w:sz="4"/>
-              <w:left w:val="single" w:color="BFBFBF" w:sz="4"/>
-              <w:bottom w:val="single" w:color="BFBFBF" w:sz="4"/>
-              <w:right w:val="single" w:color="BFBFBF" w:sz="4"/>
-            </w:tcBorders>
-            <w:tcMar>
-              <w:top w:type="dxa" w:w="60"/>
-              <w:left w:type="dxa" w:w="100"/>
-              <w:bottom w:type="dxa" w:w="60"/>
-              <w:right w:type="dxa" w:w="100"/>
-            </w:tcMar>
-          </w:tcPr>
-          <w:p>
-            <w:r>
-              <w:rPr>
-                <w:rFonts w:ascii="Calibri" w:cs="Calibri" w:eastAsia="Calibri" w:hAnsi="Calibri"/>
-                <w:sz w:val="18"/>
-                <w:szCs w:val="18"/>
-              </w:rPr>
-              <w:t xml:space="preserve">Not yet executed</w:t>
-            </w:r>
-          </w:p>
-        </w:tc>
-      </w:tr>
-      <w:tr>
-        <w:tc>
-          <w:tcPr>
-            <w:tcW w:type="dxa" w:w="461"/>
-            <w:tcBorders>
-              <w:top w:val="single" w:color="BFBFBF" w:sz="4"/>
-              <w:left w:val="single" w:color="BFBFBF" w:sz="4"/>
-              <w:bottom w:val="single" w:color="BFBFBF" w:sz="4"/>
-              <w:right w:val="single" w:color="BFBFBF" w:sz="4"/>
-            </w:tcBorders>
-            <w:tcMar>
-              <w:top w:type="dxa" w:w="60"/>
-              <w:left w:type="dxa" w:w="100"/>
-              <w:bottom w:type="dxa" w:w="60"/>
-              <w:right w:type="dxa" w:w="100"/>
-            </w:tcMar>
-          </w:tcPr>
-          <w:p>
-            <w:r>
-              <w:rPr>
-                <w:rFonts w:ascii="Calibri" w:cs="Calibri" w:eastAsia="Calibri" w:hAnsi="Calibri"/>
-                <w:sz w:val="18"/>
-                <w:szCs w:val="18"/>
-              </w:rPr>
-              <w:t xml:space="preserve">MT-09</w:t>
-            </w:r>
-          </w:p>
-        </w:tc>
-        <w:tc>
-          <w:tcPr>
-            <w:tcW w:type="dxa" w:w="1798"/>
-            <w:tcBorders>
-              <w:top w:val="single" w:color="BFBFBF" w:sz="4"/>
-              <w:left w:val="single" w:color="BFBFBF" w:sz="4"/>
-              <w:bottom w:val="single" w:color="BFBFBF" w:sz="4"/>
-              <w:right w:val="single" w:color="BFBFBF" w:sz="4"/>
-            </w:tcBorders>
-            <w:tcMar>
-              <w:top w:type="dxa" w:w="60"/>
-              <w:left w:type="dxa" w:w="100"/>
-              <w:bottom w:type="dxa" w:w="60"/>
-              <w:right w:type="dxa" w:w="100"/>
-            </w:tcMar>
-          </w:tcPr>
-          <w:p>
-            <w:r>
-              <w:rPr>
-                <w:rFonts w:ascii="Calibri" w:cs="Calibri" w:eastAsia="Calibri" w:hAnsi="Calibri"/>
-                <w:sz w:val="18"/>
-                <w:szCs w:val="18"/>
-              </w:rPr>
-              <w:t xml:space="preserve">Storage outage</w:t>
-            </w:r>
-          </w:p>
-        </w:tc>
-        <w:tc>
-          <w:tcPr>
-            <w:tcW w:type="dxa" w:w="1844"/>
-            <w:tcBorders>
-              <w:top w:val="single" w:color="BFBFBF" w:sz="4"/>
-              <w:left w:val="single" w:color="BFBFBF" w:sz="4"/>
-              <w:bottom w:val="single" w:color="BFBFBF" w:sz="4"/>
-              <w:right w:val="single" w:color="BFBFBF" w:sz="4"/>
-            </w:tcBorders>
-            <w:tcMar>
-              <w:top w:type="dxa" w:w="60"/>
-              <w:left w:type="dxa" w:w="100"/>
-              <w:bottom w:type="dxa" w:w="60"/>
-              <w:right w:type="dxa" w:w="100"/>
-            </w:tcMar>
-          </w:tcPr>
-          <w:p>
-            <w:r>
-              <w:rPr>
-                <w:rFonts w:ascii="Calibri" w:cs="Calibri" w:eastAsia="Calibri" w:hAnsi="Calibri"/>
-                <w:sz w:val="18"/>
-                <w:szCs w:val="18"/>
-              </w:rPr>
-              <w:t xml:space="preserve">MT-01 passed</w:t>
-            </w:r>
-          </w:p>
-        </w:tc>
-        <w:tc>
-          <w:tcPr>
-            <w:tcW w:type="dxa" w:w="1844"/>
-            <w:tcBorders>
-              <w:top w:val="single" w:color="BFBFBF" w:sz="4"/>
-              <w:left w:val="single" w:color="BFBFBF" w:sz="4"/>
-              <w:bottom w:val="single" w:color="BFBFBF" w:sz="4"/>
-              <w:right w:val="single" w:color="BFBFBF" w:sz="4"/>
-            </w:tcBorders>
-            <w:tcMar>
-              <w:top w:type="dxa" w:w="60"/>
-              <w:left w:type="dxa" w:w="100"/>
-              <w:bottom w:type="dxa" w:w="60"/>
-              <w:right w:type="dxa" w:w="100"/>
-            </w:tcMar>
-          </w:tcPr>
-          <w:p>
-            <w:r>
-              <w:rPr>
-                <w:rFonts w:ascii="Calibri" w:cs="Calibri" w:eastAsia="Calibri" w:hAnsi="Calibri"/>
-                <w:sz w:val="18"/>
-                <w:szCs w:val="18"/>
-              </w:rPr>
-              <w:t xml:space="preserve">1) </w:t>
+              <w:t xml:space="preserve">connection failed (attempt 1…4)</w:t>
+            </w:r>
+            <w:r>
+              <w:rPr>
+                <w:rFonts w:ascii="Calibri" w:cs="Calibri" w:eastAsia="Calibri" w:hAnsi="Calibri"/>
+                <w:sz w:val="18"/>
+                <w:szCs w:val="18"/>
+              </w:rPr>
+              <w:t xml:space="preserve"> with growing delays, readiness </w:t>
             </w:r>
             <w:r>
               <w:rPr>
@@ -50705,15 +50439,15 @@
                 <w:sz w:val="16"/>
                 <w:szCs w:val="16"/>
               </w:rPr>
-              <w:t xml:space="preserve">docker compose stop mongo</w:t>
-            </w:r>
-            <w:r>
-              <w:rPr>
-                <w:rFonts w:ascii="Calibri" w:cs="Calibri" w:eastAsia="Calibri" w:hAnsi="Calibri"/>
-                <w:sz w:val="18"/>
-                <w:szCs w:val="18"/>
-              </w:rPr>
-              <w:t xml:space="preserve"> 2) </w:t>
+              <w:t xml:space="preserve">Degraded</w:t>
+            </w:r>
+            <w:r>
+              <w:rPr>
+                <w:rFonts w:ascii="Calibri" w:cs="Calibri" w:eastAsia="Calibri" w:hAnsi="Calibri"/>
+                <w:sz w:val="18"/>
+                <w:szCs w:val="18"/>
+              </w:rPr>
+              <w:t xml:space="preserve">; after </w:t>
             </w:r>
             <w:r>
               <w:rPr>
@@ -50722,15 +50456,15 @@
                 <w:sz w:val="16"/>
                 <w:szCs w:val="16"/>
               </w:rPr>
-              <w:t xml:space="preserve">GET /api/jobs</w:t>
-            </w:r>
-            <w:r>
-              <w:rPr>
-                <w:rFonts w:ascii="Calibri" w:cs="Calibri" w:eastAsia="Calibri" w:hAnsi="Calibri"/>
-                <w:sz w:val="18"/>
-                <w:szCs w:val="18"/>
-              </w:rPr>
-              <w:t xml:space="preserve"> and </w:t>
+              <w:t xml:space="preserve">docker start</w:t>
+            </w:r>
+            <w:r>
+              <w:rPr>
+                <w:rFonts w:ascii="Calibri" w:cs="Calibri" w:eastAsia="Calibri" w:hAnsi="Calibri"/>
+                <w:sz w:val="18"/>
+                <w:szCs w:val="18"/>
+              </w:rPr>
+              <w:t xml:space="preserve"> → </w:t>
             </w:r>
             <w:r>
               <w:rPr>
@@ -50739,15 +50473,15 @@
                 <w:sz w:val="16"/>
                 <w:szCs w:val="16"/>
               </w:rPr>
-              <w:t xml:space="preserve">/health/ready</w:t>
-            </w:r>
-            <w:r>
-              <w:rPr>
-                <w:rFonts w:ascii="Calibri" w:cs="Calibri" w:eastAsia="Calibri" w:hAnsi="Calibri"/>
-                <w:sz w:val="18"/>
-                <w:szCs w:val="18"/>
-              </w:rPr>
-              <w:t xml:space="preserve"> on :5001 3) </w:t>
+              <w:t xml:space="preserve">Connected … 0 events pending</w:t>
+            </w:r>
+            <w:r>
+              <w:rPr>
+                <w:rFonts w:ascii="Calibri" w:cs="Calibri" w:eastAsia="Calibri" w:hAnsi="Calibri"/>
+                <w:sz w:val="18"/>
+                <w:szCs w:val="18"/>
+              </w:rPr>
+              <w:t xml:space="preserve">; all 10 jobs Completed. The work had finished before the outage, so no event needed replay; buffering and replay are verified by </w:t>
             </w:r>
             <w:r>
               <w:rPr>
@@ -50756,79 +50490,15 @@
                 <w:sz w:val="16"/>
                 <w:szCs w:val="16"/>
               </w:rPr>
-              <w:t xml:space="preserve">docker compose start mongo</w:t>
-            </w:r>
-          </w:p>
-        </w:tc>
-        <w:tc>
-          <w:tcPr>
-            <w:tcW w:type="dxa" w:w="1844"/>
-            <w:tcBorders>
-              <w:top w:val="single" w:color="BFBFBF" w:sz="4"/>
-              <w:left w:val="single" w:color="BFBFBF" w:sz="4"/>
-              <w:bottom w:val="single" w:color="BFBFBF" w:sz="4"/>
-              <w:right w:val="single" w:color="BFBFBF" w:sz="4"/>
-            </w:tcBorders>
-            <w:tcMar>
-              <w:top w:type="dxa" w:w="60"/>
-              <w:left w:type="dxa" w:w="100"/>
-              <w:bottom w:type="dxa" w:w="60"/>
-              <w:right w:type="dxa" w:w="100"/>
-            </w:tcMar>
-          </w:tcPr>
-          <w:p>
-            <w:r>
-              <w:rPr>
-                <w:rFonts w:ascii="Calibri" w:cs="Calibri" w:eastAsia="Calibri" w:hAnsi="Calibri"/>
-                <w:sz w:val="18"/>
-                <w:szCs w:val="18"/>
-              </w:rPr>
-              <w:t xml:space="preserve">503 </w:t>
-            </w:r>
-            <w:r>
-              <w:rPr>
-                <w:rFonts w:ascii="Calibri" w:cs="Calibri" w:eastAsia="Calibri" w:hAnsi="Calibri"/>
-                <w:i/>
-                <w:iCs/>
-                <w:sz w:val="18"/>
-                <w:szCs w:val="18"/>
-              </w:rPr>
-              <w:t xml:space="preserve">Storage unavailable</w:t>
-            </w:r>
-            <w:r>
-              <w:rPr>
-                <w:rFonts w:ascii="Calibri" w:cs="Calibri" w:eastAsia="Calibri" w:hAnsi="Calibri"/>
-                <w:sz w:val="18"/>
-                <w:szCs w:val="18"/>
-              </w:rPr>
-              <w:t xml:space="preserve"> ProblemDetails within ~5 s; readiness Unhealthy; service recovers after Mongo starts</w:t>
-            </w:r>
-          </w:p>
-        </w:tc>
-        <w:tc>
-          <w:tcPr>
-            <w:tcW w:type="dxa" w:w="1847"/>
-            <w:tcBorders>
-              <w:top w:val="single" w:color="BFBFBF" w:sz="4"/>
-              <w:left w:val="single" w:color="BFBFBF" w:sz="4"/>
-              <w:bottom w:val="single" w:color="BFBFBF" w:sz="4"/>
-              <w:right w:val="single" w:color="BFBFBF" w:sz="4"/>
-            </w:tcBorders>
-            <w:tcMar>
-              <w:top w:type="dxa" w:w="60"/>
-              <w:left w:type="dxa" w:w="100"/>
-              <w:bottom w:type="dxa" w:w="60"/>
-              <w:right w:type="dxa" w:w="100"/>
-            </w:tcMar>
-          </w:tcPr>
-          <w:p>
-            <w:r>
-              <w:rPr>
-                <w:rFonts w:ascii="Calibri" w:cs="Calibri" w:eastAsia="Calibri" w:hAnsi="Calibri"/>
-                <w:sz w:val="18"/>
-                <w:szCs w:val="18"/>
-              </w:rPr>
-              <w:t xml:space="preserve">Not yet executed</w:t>
+              <w:t xml:space="preserve">JobServiceEventsClientTests</w:t>
+            </w:r>
+            <w:r>
+              <w:rPr>
+                <w:rFonts w:ascii="Calibri" w:cs="Calibri" w:eastAsia="Calibri" w:hAnsi="Calibri"/>
+                <w:sz w:val="18"/>
+                <w:szCs w:val="18"/>
+              </w:rPr>
+              <w:t xml:space="preserve"> and E2E-001</w:t>
             </w:r>
           </w:p>
         </w:tc>
@@ -50857,7 +50527,7 @@
                 <w:sz w:val="18"/>
                 <w:szCs w:val="18"/>
               </w:rPr>
-              <w:t xml:space="preserve">MT-10</w:t>
+              <w:t xml:space="preserve">MT-08</w:t>
             </w:r>
           </w:p>
         </w:tc>
@@ -50884,7 +50554,7 @@
                 <w:sz w:val="18"/>
                 <w:szCs w:val="18"/>
               </w:rPr>
-              <w:t xml:space="preserve">Live status stream (SSE)</w:t>
+              <w:t xml:space="preserve">Processor restart mid-job</w:t>
             </w:r>
           </w:p>
         </w:tc>
@@ -50938,7 +50608,7 @@
                 <w:sz w:val="18"/>
                 <w:szCs w:val="18"/>
               </w:rPr>
-              <w:t xml:space="preserve">1) Create a job 2) </w:t>
+              <w:t xml:space="preserve">1) Start the 10 × 1,000 load 2) </w:t>
             </w:r>
             <w:r>
               <w:rPr>
@@ -50947,27 +50617,16 @@
                 <w:sz w:val="16"/>
                 <w:szCs w:val="16"/>
               </w:rPr>
-              <w:t xml:space="preserve">curl.exe -N http://localhost:5001/api/jobs/&lt;id&gt;/events</w:t>
-            </w:r>
-          </w:p>
-        </w:tc>
-        <w:tc>
-          <w:tcPr>
-            <w:tcW w:type="dxa" w:w="1844"/>
-            <w:tcBorders>
-              <w:top w:val="single" w:color="BFBFBF" w:sz="4"/>
-              <w:left w:val="single" w:color="BFBFBF" w:sz="4"/>
-              <w:bottom w:val="single" w:color="BFBFBF" w:sz="4"/>
-              <w:right w:val="single" w:color="BFBFBF" w:sz="4"/>
-            </w:tcBorders>
-            <w:tcMar>
-              <w:top w:type="dxa" w:w="60"/>
-              <w:left w:type="dxa" w:w="100"/>
-              <w:bottom w:type="dxa" w:w="60"/>
-              <w:right w:type="dxa" w:w="100"/>
-            </w:tcMar>
-          </w:tcPr>
-          <w:p>
+              <w:t xml:space="preserve">docker compose restart processor-service</w:t>
+            </w:r>
+            <w:r>
+              <w:rPr>
+                <w:rFonts w:ascii="Calibri" w:cs="Calibri" w:eastAsia="Calibri" w:hAnsi="Calibri"/>
+                <w:sz w:val="18"/>
+                <w:szCs w:val="18"/>
+              </w:rPr>
+              <w:t xml:space="preserve"> while jobs are Processing 3) Watch </w:t>
+            </w:r>
             <w:r>
               <w:rPr>
                 <w:rFonts w:ascii="Consolas" w:cs="Consolas" w:eastAsia="Consolas" w:hAnsi="Consolas"/>
@@ -50975,15 +50634,34 @@
                 <w:sz w:val="16"/>
                 <w:szCs w:val="16"/>
               </w:rPr>
-              <w:t xml:space="preserve">event: status</w:t>
-            </w:r>
-            <w:r>
-              <w:rPr>
-                <w:rFonts w:ascii="Calibri" w:cs="Calibri" w:eastAsia="Calibri" w:hAnsi="Calibri"/>
-                <w:sz w:val="18"/>
-                <w:szCs w:val="18"/>
-              </w:rPr>
-              <w:t xml:space="preserve"> lines: snapshot, then Processing with progress, then Completed; stream closes</w:t>
+              <w:t xml:space="preserve">GET /api/jobs?status=Processing</w:t>
+            </w:r>
+          </w:p>
+        </w:tc>
+        <w:tc>
+          <w:tcPr>
+            <w:tcW w:type="dxa" w:w="1844"/>
+            <w:tcBorders>
+              <w:top w:val="single" w:color="BFBFBF" w:sz="4"/>
+              <w:left w:val="single" w:color="BFBFBF" w:sz="4"/>
+              <w:bottom w:val="single" w:color="BFBFBF" w:sz="4"/>
+              <w:right w:val="single" w:color="BFBFBF" w:sz="4"/>
+            </w:tcBorders>
+            <w:tcMar>
+              <w:top w:type="dxa" w:w="60"/>
+              <w:left w:type="dxa" w:w="100"/>
+              <w:bottom w:type="dxa" w:w="60"/>
+              <w:right w:type="dxa" w:w="100"/>
+            </w:tcMar>
+          </w:tcPr>
+          <w:p>
+            <w:r>
+              <w:rPr>
+                <w:rFonts w:ascii="Calibri" w:cs="Calibri" w:eastAsia="Calibri" w:hAnsi="Calibri"/>
+                <w:sz w:val="18"/>
+                <w:szCs w:val="18"/>
+              </w:rPr>
+              <w:t xml:space="preserve">Within ~60–90 s the reconciler redispatches lost jobs; all jobs end Completed</w:t>
             </w:r>
           </w:p>
         </w:tc>
@@ -51010,117 +50688,7 @@
                 <w:sz w:val="18"/>
                 <w:szCs w:val="18"/>
               </w:rPr>
-              <w:t xml:space="preserve">Passed (2026-10-27)</w:t>
-            </w:r>
-          </w:p>
-        </w:tc>
-      </w:tr>
-      <w:tr>
-        <w:tc>
-          <w:tcPr>
-            <w:tcW w:type="dxa" w:w="461"/>
-            <w:tcBorders>
-              <w:top w:val="single" w:color="BFBFBF" w:sz="4"/>
-              <w:left w:val="single" w:color="BFBFBF" w:sz="4"/>
-              <w:bottom w:val="single" w:color="BFBFBF" w:sz="4"/>
-              <w:right w:val="single" w:color="BFBFBF" w:sz="4"/>
-            </w:tcBorders>
-            <w:tcMar>
-              <w:top w:type="dxa" w:w="60"/>
-              <w:left w:type="dxa" w:w="100"/>
-              <w:bottom w:type="dxa" w:w="60"/>
-              <w:right w:type="dxa" w:w="100"/>
-            </w:tcMar>
-          </w:tcPr>
-          <w:p>
-            <w:r>
-              <w:rPr>
-                <w:rFonts w:ascii="Calibri" w:cs="Calibri" w:eastAsia="Calibri" w:hAnsi="Calibri"/>
-                <w:sz w:val="18"/>
-                <w:szCs w:val="18"/>
-              </w:rPr>
-              <w:t xml:space="preserve">MT-11</w:t>
-            </w:r>
-          </w:p>
-        </w:tc>
-        <w:tc>
-          <w:tcPr>
-            <w:tcW w:type="dxa" w:w="1798"/>
-            <w:tcBorders>
-              <w:top w:val="single" w:color="BFBFBF" w:sz="4"/>
-              <w:left w:val="single" w:color="BFBFBF" w:sz="4"/>
-              <w:bottom w:val="single" w:color="BFBFBF" w:sz="4"/>
-              <w:right w:val="single" w:color="BFBFBF" w:sz="4"/>
-            </w:tcBorders>
-            <w:tcMar>
-              <w:top w:type="dxa" w:w="60"/>
-              <w:left w:type="dxa" w:w="100"/>
-              <w:bottom w:type="dxa" w:w="60"/>
-              <w:right w:type="dxa" w:w="100"/>
-            </w:tcMar>
-          </w:tcPr>
-          <w:p>
-            <w:r>
-              <w:rPr>
-                <w:rFonts w:ascii="Calibri" w:cs="Calibri" w:eastAsia="Calibri" w:hAnsi="Calibri"/>
-                <w:sz w:val="18"/>
-                <w:szCs w:val="18"/>
-              </w:rPr>
-              <w:t xml:space="preserve">Logs in console and MongoDB</w:t>
-            </w:r>
-          </w:p>
-        </w:tc>
-        <w:tc>
-          <w:tcPr>
-            <w:tcW w:type="dxa" w:w="1844"/>
-            <w:tcBorders>
-              <w:top w:val="single" w:color="BFBFBF" w:sz="4"/>
-              <w:left w:val="single" w:color="BFBFBF" w:sz="4"/>
-              <w:bottom w:val="single" w:color="BFBFBF" w:sz="4"/>
-              <w:right w:val="single" w:color="BFBFBF" w:sz="4"/>
-            </w:tcBorders>
-            <w:tcMar>
-              <w:top w:type="dxa" w:w="60"/>
-              <w:left w:type="dxa" w:w="100"/>
-              <w:bottom w:type="dxa" w:w="60"/>
-              <w:right w:type="dxa" w:w="100"/>
-            </w:tcMar>
-          </w:tcPr>
-          <w:p>
-            <w:r>
-              <w:rPr>
-                <w:rFonts w:ascii="Calibri" w:cs="Calibri" w:eastAsia="Calibri" w:hAnsi="Calibri"/>
-                <w:sz w:val="18"/>
-                <w:szCs w:val="18"/>
-              </w:rPr>
-              <w:t xml:space="preserve">MT-02 passed</w:t>
-            </w:r>
-          </w:p>
-        </w:tc>
-        <w:tc>
-          <w:tcPr>
-            <w:tcW w:type="dxa" w:w="1844"/>
-            <w:tcBorders>
-              <w:top w:val="single" w:color="BFBFBF" w:sz="4"/>
-              <w:left w:val="single" w:color="BFBFBF" w:sz="4"/>
-              <w:bottom w:val="single" w:color="BFBFBF" w:sz="4"/>
-              <w:right w:val="single" w:color="BFBFBF" w:sz="4"/>
-            </w:tcBorders>
-            <w:tcMar>
-              <w:top w:type="dxa" w:w="60"/>
-              <w:left w:type="dxa" w:w="100"/>
-              <w:bottom w:type="dxa" w:w="60"/>
-              <w:right w:type="dxa" w:w="100"/>
-            </w:tcMar>
-          </w:tcPr>
-          <w:p>
-            <w:r>
-              <w:rPr>
-                <w:rFonts w:ascii="Calibri" w:cs="Calibri" w:eastAsia="Calibri" w:hAnsi="Calibri"/>
-                <w:sz w:val="18"/>
-                <w:szCs w:val="18"/>
-              </w:rPr>
-              <w:t xml:space="preserve">1) </w:t>
+              <w:t xml:space="preserve">Executed (2026-10-27), scenario not reached: the restart came after all 10 jobs had completed (each job takes &lt; 100 ms), so nothing was in flight; all jobs Completed. The mid-job restart and its recovery are verified by E2E-004 (gated analyzer holds a job in Processing) and </w:t>
             </w:r>
             <w:r>
               <w:rPr>
@@ -51129,15 +50697,117 @@
                 <w:sz w:val="16"/>
                 <w:szCs w:val="16"/>
               </w:rPr>
-              <w:t xml:space="preserve">docker compose logs --tail 50 job-service processor-service</w:t>
-            </w:r>
-            <w:r>
-              <w:rPr>
-                <w:rFonts w:ascii="Calibri" w:cs="Calibri" w:eastAsia="Calibri" w:hAnsi="Calibri"/>
-                <w:sz w:val="18"/>
-                <w:szCs w:val="18"/>
-              </w:rPr>
-              <w:t xml:space="preserve"> 2) </w:t>
+              <w:t xml:space="preserve">JobReconcilerTests</w:t>
+            </w:r>
+          </w:p>
+        </w:tc>
+      </w:tr>
+      <w:tr>
+        <w:tc>
+          <w:tcPr>
+            <w:tcW w:type="dxa" w:w="461"/>
+            <w:tcBorders>
+              <w:top w:val="single" w:color="BFBFBF" w:sz="4"/>
+              <w:left w:val="single" w:color="BFBFBF" w:sz="4"/>
+              <w:bottom w:val="single" w:color="BFBFBF" w:sz="4"/>
+              <w:right w:val="single" w:color="BFBFBF" w:sz="4"/>
+            </w:tcBorders>
+            <w:tcMar>
+              <w:top w:type="dxa" w:w="60"/>
+              <w:left w:type="dxa" w:w="100"/>
+              <w:bottom w:type="dxa" w:w="60"/>
+              <w:right w:type="dxa" w:w="100"/>
+            </w:tcMar>
+          </w:tcPr>
+          <w:p>
+            <w:r>
+              <w:rPr>
+                <w:rFonts w:ascii="Calibri" w:cs="Calibri" w:eastAsia="Calibri" w:hAnsi="Calibri"/>
+                <w:sz w:val="18"/>
+                <w:szCs w:val="18"/>
+              </w:rPr>
+              <w:t xml:space="preserve">MT-09</w:t>
+            </w:r>
+          </w:p>
+        </w:tc>
+        <w:tc>
+          <w:tcPr>
+            <w:tcW w:type="dxa" w:w="1798"/>
+            <w:tcBorders>
+              <w:top w:val="single" w:color="BFBFBF" w:sz="4"/>
+              <w:left w:val="single" w:color="BFBFBF" w:sz="4"/>
+              <w:bottom w:val="single" w:color="BFBFBF" w:sz="4"/>
+              <w:right w:val="single" w:color="BFBFBF" w:sz="4"/>
+            </w:tcBorders>
+            <w:tcMar>
+              <w:top w:type="dxa" w:w="60"/>
+              <w:left w:type="dxa" w:w="100"/>
+              <w:bottom w:type="dxa" w:w="60"/>
+              <w:right w:type="dxa" w:w="100"/>
+            </w:tcMar>
+          </w:tcPr>
+          <w:p>
+            <w:r>
+              <w:rPr>
+                <w:rFonts w:ascii="Calibri" w:cs="Calibri" w:eastAsia="Calibri" w:hAnsi="Calibri"/>
+                <w:sz w:val="18"/>
+                <w:szCs w:val="18"/>
+              </w:rPr>
+              <w:t xml:space="preserve">Storage outage</w:t>
+            </w:r>
+          </w:p>
+        </w:tc>
+        <w:tc>
+          <w:tcPr>
+            <w:tcW w:type="dxa" w:w="1844"/>
+            <w:tcBorders>
+              <w:top w:val="single" w:color="BFBFBF" w:sz="4"/>
+              <w:left w:val="single" w:color="BFBFBF" w:sz="4"/>
+              <w:bottom w:val="single" w:color="BFBFBF" w:sz="4"/>
+              <w:right w:val="single" w:color="BFBFBF" w:sz="4"/>
+            </w:tcBorders>
+            <w:tcMar>
+              <w:top w:type="dxa" w:w="60"/>
+              <w:left w:type="dxa" w:w="100"/>
+              <w:bottom w:type="dxa" w:w="60"/>
+              <w:right w:type="dxa" w:w="100"/>
+            </w:tcMar>
+          </w:tcPr>
+          <w:p>
+            <w:r>
+              <w:rPr>
+                <w:rFonts w:ascii="Calibri" w:cs="Calibri" w:eastAsia="Calibri" w:hAnsi="Calibri"/>
+                <w:sz w:val="18"/>
+                <w:szCs w:val="18"/>
+              </w:rPr>
+              <w:t xml:space="preserve">MT-01 passed</w:t>
+            </w:r>
+          </w:p>
+        </w:tc>
+        <w:tc>
+          <w:tcPr>
+            <w:tcW w:type="dxa" w:w="1844"/>
+            <w:tcBorders>
+              <w:top w:val="single" w:color="BFBFBF" w:sz="4"/>
+              <w:left w:val="single" w:color="BFBFBF" w:sz="4"/>
+              <w:bottom w:val="single" w:color="BFBFBF" w:sz="4"/>
+              <w:right w:val="single" w:color="BFBFBF" w:sz="4"/>
+            </w:tcBorders>
+            <w:tcMar>
+              <w:top w:type="dxa" w:w="60"/>
+              <w:left w:type="dxa" w:w="100"/>
+              <w:bottom w:type="dxa" w:w="60"/>
+              <w:right w:type="dxa" w:w="100"/>
+            </w:tcMar>
+          </w:tcPr>
+          <w:p>
+            <w:r>
+              <w:rPr>
+                <w:rFonts w:ascii="Calibri" w:cs="Calibri" w:eastAsia="Calibri" w:hAnsi="Calibri"/>
+                <w:sz w:val="18"/>
+                <w:szCs w:val="18"/>
+              </w:rPr>
+              <w:t xml:space="preserve">1) </w:t>
             </w:r>
             <w:r>
               <w:rPr>
@@ -51146,15 +50816,15 @@
                 <w:sz w:val="16"/>
                 <w:szCs w:val="16"/>
               </w:rPr>
-              <w:t xml:space="preserve">docker exec -it ta9-mongo-1 mongosh ta9_logs --eval "db.logs.find({jobId:'&lt;id&gt;'}).sort({timestamp:1})"</w:t>
-            </w:r>
-            <w:r>
-              <w:rPr>
-                <w:rFonts w:ascii="Calibri" w:cs="Calibri" w:eastAsia="Calibri" w:hAnsi="Calibri"/>
-                <w:sz w:val="18"/>
-                <w:szCs w:val="18"/>
-              </w:rPr>
-              <w:t xml:space="preserve"> with the job id from MT-02 3) </w:t>
+              <w:t xml:space="preserve">docker compose stop mongo</w:t>
+            </w:r>
+            <w:r>
+              <w:rPr>
+                <w:rFonts w:ascii="Calibri" w:cs="Calibri" w:eastAsia="Calibri" w:hAnsi="Calibri"/>
+                <w:sz w:val="18"/>
+                <w:szCs w:val="18"/>
+              </w:rPr>
+              <w:t xml:space="preserve"> 2) </w:t>
             </w:r>
             <w:r>
               <w:rPr>
@@ -51163,34 +50833,15 @@
                 <w:sz w:val="16"/>
                 <w:szCs w:val="16"/>
               </w:rPr>
-              <w:t xml:space="preserve">db.logs.find({level:'Error'})</w:t>
-            </w:r>
-          </w:p>
-        </w:tc>
-        <w:tc>
-          <w:tcPr>
-            <w:tcW w:type="dxa" w:w="1844"/>
-            <w:tcBorders>
-              <w:top w:val="single" w:color="BFBFBF" w:sz="4"/>
-              <w:left w:val="single" w:color="BFBFBF" w:sz="4"/>
-              <w:bottom w:val="single" w:color="BFBFBF" w:sz="4"/>
-              <w:right w:val="single" w:color="BFBFBF" w:sz="4"/>
-            </w:tcBorders>
-            <w:tcMar>
-              <w:top w:type="dxa" w:w="60"/>
-              <w:left w:type="dxa" w:w="100"/>
-              <w:bottom w:type="dxa" w:w="60"/>
-              <w:right w:type="dxa" w:w="100"/>
-            </w:tcMar>
-          </w:tcPr>
-          <w:p>
-            <w:r>
-              <w:rPr>
-                <w:rFonts w:ascii="Calibri" w:cs="Calibri" w:eastAsia="Calibri" w:hAnsi="Calibri"/>
-                <w:sz w:val="18"/>
-                <w:szCs w:val="18"/>
-              </w:rPr>
-              <w:t xml:space="preserve">Console shows the flow (Information); MongoDB holds Debug + Information records of all three services for the job with one </w:t>
+              <w:t xml:space="preserve">GET /api/jobs</w:t>
+            </w:r>
+            <w:r>
+              <w:rPr>
+                <w:rFonts w:ascii="Calibri" w:cs="Calibri" w:eastAsia="Calibri" w:hAnsi="Calibri"/>
+                <w:sz w:val="18"/>
+                <w:szCs w:val="18"/>
+              </w:rPr>
+              <w:t xml:space="preserve"> and </w:t>
             </w:r>
             <w:r>
               <w:rPr>
@@ -51199,15 +50850,15 @@
                 <w:sz w:val="16"/>
                 <w:szCs w:val="16"/>
               </w:rPr>
-              <w:t xml:space="preserve">correlationId</w:t>
-            </w:r>
-            <w:r>
-              <w:rPr>
-                <w:rFonts w:ascii="Calibri" w:cs="Calibri" w:eastAsia="Calibri" w:hAnsi="Calibri"/>
-                <w:sz w:val="18"/>
-                <w:szCs w:val="18"/>
-              </w:rPr>
-              <w:t xml:space="preserve">; TTL index </w:t>
+              <w:t xml:space="preserve">/health/ready</w:t>
+            </w:r>
+            <w:r>
+              <w:rPr>
+                <w:rFonts w:ascii="Calibri" w:cs="Calibri" w:eastAsia="Calibri" w:hAnsi="Calibri"/>
+                <w:sz w:val="18"/>
+                <w:szCs w:val="18"/>
+              </w:rPr>
+              <w:t xml:space="preserve"> on :5001 3) </w:t>
             </w:r>
             <w:r>
               <w:rPr>
@@ -51216,6 +50867,466 @@
                 <w:sz w:val="16"/>
                 <w:szCs w:val="16"/>
               </w:rPr>
+              <w:t xml:space="preserve">docker compose start mongo</w:t>
+            </w:r>
+          </w:p>
+        </w:tc>
+        <w:tc>
+          <w:tcPr>
+            <w:tcW w:type="dxa" w:w="1844"/>
+            <w:tcBorders>
+              <w:top w:val="single" w:color="BFBFBF" w:sz="4"/>
+              <w:left w:val="single" w:color="BFBFBF" w:sz="4"/>
+              <w:bottom w:val="single" w:color="BFBFBF" w:sz="4"/>
+              <w:right w:val="single" w:color="BFBFBF" w:sz="4"/>
+            </w:tcBorders>
+            <w:tcMar>
+              <w:top w:type="dxa" w:w="60"/>
+              <w:left w:type="dxa" w:w="100"/>
+              <w:bottom w:type="dxa" w:w="60"/>
+              <w:right w:type="dxa" w:w="100"/>
+            </w:tcMar>
+          </w:tcPr>
+          <w:p>
+            <w:r>
+              <w:rPr>
+                <w:rFonts w:ascii="Calibri" w:cs="Calibri" w:eastAsia="Calibri" w:hAnsi="Calibri"/>
+                <w:sz w:val="18"/>
+                <w:szCs w:val="18"/>
+              </w:rPr>
+              <w:t xml:space="preserve">503 </w:t>
+            </w:r>
+            <w:r>
+              <w:rPr>
+                <w:rFonts w:ascii="Calibri" w:cs="Calibri" w:eastAsia="Calibri" w:hAnsi="Calibri"/>
+                <w:i/>
+                <w:iCs/>
+                <w:sz w:val="18"/>
+                <w:szCs w:val="18"/>
+              </w:rPr>
+              <w:t xml:space="preserve">Storage unavailable</w:t>
+            </w:r>
+            <w:r>
+              <w:rPr>
+                <w:rFonts w:ascii="Calibri" w:cs="Calibri" w:eastAsia="Calibri" w:hAnsi="Calibri"/>
+                <w:sz w:val="18"/>
+                <w:szCs w:val="18"/>
+              </w:rPr>
+              <w:t xml:space="preserve"> ProblemDetails within ~5 s; readiness Unhealthy; service recovers after Mongo starts</w:t>
+            </w:r>
+          </w:p>
+        </w:tc>
+        <w:tc>
+          <w:tcPr>
+            <w:tcW w:type="dxa" w:w="1847"/>
+            <w:tcBorders>
+              <w:top w:val="single" w:color="BFBFBF" w:sz="4"/>
+              <w:left w:val="single" w:color="BFBFBF" w:sz="4"/>
+              <w:bottom w:val="single" w:color="BFBFBF" w:sz="4"/>
+              <w:right w:val="single" w:color="BFBFBF" w:sz="4"/>
+            </w:tcBorders>
+            <w:tcMar>
+              <w:top w:type="dxa" w:w="60"/>
+              <w:left w:type="dxa" w:w="100"/>
+              <w:bottom w:type="dxa" w:w="60"/>
+              <w:right w:type="dxa" w:w="100"/>
+            </w:tcMar>
+          </w:tcPr>
+          <w:p>
+            <w:r>
+              <w:rPr>
+                <w:rFonts w:ascii="Calibri" w:cs="Calibri" w:eastAsia="Calibri" w:hAnsi="Calibri"/>
+                <w:sz w:val="18"/>
+                <w:szCs w:val="18"/>
+              </w:rPr>
+              <w:t xml:space="preserve">Not yet executed</w:t>
+            </w:r>
+          </w:p>
+        </w:tc>
+      </w:tr>
+      <w:tr>
+        <w:tc>
+          <w:tcPr>
+            <w:tcW w:type="dxa" w:w="461"/>
+            <w:tcBorders>
+              <w:top w:val="single" w:color="BFBFBF" w:sz="4"/>
+              <w:left w:val="single" w:color="BFBFBF" w:sz="4"/>
+              <w:bottom w:val="single" w:color="BFBFBF" w:sz="4"/>
+              <w:right w:val="single" w:color="BFBFBF" w:sz="4"/>
+            </w:tcBorders>
+            <w:tcMar>
+              <w:top w:type="dxa" w:w="60"/>
+              <w:left w:type="dxa" w:w="100"/>
+              <w:bottom w:type="dxa" w:w="60"/>
+              <w:right w:type="dxa" w:w="100"/>
+            </w:tcMar>
+          </w:tcPr>
+          <w:p>
+            <w:r>
+              <w:rPr>
+                <w:rFonts w:ascii="Calibri" w:cs="Calibri" w:eastAsia="Calibri" w:hAnsi="Calibri"/>
+                <w:sz w:val="18"/>
+                <w:szCs w:val="18"/>
+              </w:rPr>
+              <w:t xml:space="preserve">MT-10</w:t>
+            </w:r>
+          </w:p>
+        </w:tc>
+        <w:tc>
+          <w:tcPr>
+            <w:tcW w:type="dxa" w:w="1798"/>
+            <w:tcBorders>
+              <w:top w:val="single" w:color="BFBFBF" w:sz="4"/>
+              <w:left w:val="single" w:color="BFBFBF" w:sz="4"/>
+              <w:bottom w:val="single" w:color="BFBFBF" w:sz="4"/>
+              <w:right w:val="single" w:color="BFBFBF" w:sz="4"/>
+            </w:tcBorders>
+            <w:tcMar>
+              <w:top w:type="dxa" w:w="60"/>
+              <w:left w:type="dxa" w:w="100"/>
+              <w:bottom w:type="dxa" w:w="60"/>
+              <w:right w:type="dxa" w:w="100"/>
+            </w:tcMar>
+          </w:tcPr>
+          <w:p>
+            <w:r>
+              <w:rPr>
+                <w:rFonts w:ascii="Calibri" w:cs="Calibri" w:eastAsia="Calibri" w:hAnsi="Calibri"/>
+                <w:sz w:val="18"/>
+                <w:szCs w:val="18"/>
+              </w:rPr>
+              <w:t xml:space="preserve">Live status stream (SSE)</w:t>
+            </w:r>
+          </w:p>
+        </w:tc>
+        <w:tc>
+          <w:tcPr>
+            <w:tcW w:type="dxa" w:w="1844"/>
+            <w:tcBorders>
+              <w:top w:val="single" w:color="BFBFBF" w:sz="4"/>
+              <w:left w:val="single" w:color="BFBFBF" w:sz="4"/>
+              <w:bottom w:val="single" w:color="BFBFBF" w:sz="4"/>
+              <w:right w:val="single" w:color="BFBFBF" w:sz="4"/>
+            </w:tcBorders>
+            <w:tcMar>
+              <w:top w:type="dxa" w:w="60"/>
+              <w:left w:type="dxa" w:w="100"/>
+              <w:bottom w:type="dxa" w:w="60"/>
+              <w:right w:type="dxa" w:w="100"/>
+            </w:tcMar>
+          </w:tcPr>
+          <w:p>
+            <w:r>
+              <w:rPr>
+                <w:rFonts w:ascii="Calibri" w:cs="Calibri" w:eastAsia="Calibri" w:hAnsi="Calibri"/>
+                <w:sz w:val="18"/>
+                <w:szCs w:val="18"/>
+              </w:rPr>
+              <w:t xml:space="preserve">MT-01 passed</w:t>
+            </w:r>
+          </w:p>
+        </w:tc>
+        <w:tc>
+          <w:tcPr>
+            <w:tcW w:type="dxa" w:w="1844"/>
+            <w:tcBorders>
+              <w:top w:val="single" w:color="BFBFBF" w:sz="4"/>
+              <w:left w:val="single" w:color="BFBFBF" w:sz="4"/>
+              <w:bottom w:val="single" w:color="BFBFBF" w:sz="4"/>
+              <w:right w:val="single" w:color="BFBFBF" w:sz="4"/>
+            </w:tcBorders>
+            <w:tcMar>
+              <w:top w:type="dxa" w:w="60"/>
+              <w:left w:type="dxa" w:w="100"/>
+              <w:bottom w:type="dxa" w:w="60"/>
+              <w:right w:type="dxa" w:w="100"/>
+            </w:tcMar>
+          </w:tcPr>
+          <w:p>
+            <w:r>
+              <w:rPr>
+                <w:rFonts w:ascii="Calibri" w:cs="Calibri" w:eastAsia="Calibri" w:hAnsi="Calibri"/>
+                <w:sz w:val="18"/>
+                <w:szCs w:val="18"/>
+              </w:rPr>
+              <w:t xml:space="preserve">1) Create a job 2) </w:t>
+            </w:r>
+            <w:r>
+              <w:rPr>
+                <w:rFonts w:ascii="Consolas" w:cs="Consolas" w:eastAsia="Consolas" w:hAnsi="Consolas"/>
+                <w:color w:val="5B2C6F"/>
+                <w:sz w:val="16"/>
+                <w:szCs w:val="16"/>
+              </w:rPr>
+              <w:t xml:space="preserve">curl.exe -N http://localhost:5001/api/jobs/&lt;id&gt;/events</w:t>
+            </w:r>
+          </w:p>
+        </w:tc>
+        <w:tc>
+          <w:tcPr>
+            <w:tcW w:type="dxa" w:w="1844"/>
+            <w:tcBorders>
+              <w:top w:val="single" w:color="BFBFBF" w:sz="4"/>
+              <w:left w:val="single" w:color="BFBFBF" w:sz="4"/>
+              <w:bottom w:val="single" w:color="BFBFBF" w:sz="4"/>
+              <w:right w:val="single" w:color="BFBFBF" w:sz="4"/>
+            </w:tcBorders>
+            <w:tcMar>
+              <w:top w:type="dxa" w:w="60"/>
+              <w:left w:type="dxa" w:w="100"/>
+              <w:bottom w:type="dxa" w:w="60"/>
+              <w:right w:type="dxa" w:w="100"/>
+            </w:tcMar>
+          </w:tcPr>
+          <w:p>
+            <w:r>
+              <w:rPr>
+                <w:rFonts w:ascii="Consolas" w:cs="Consolas" w:eastAsia="Consolas" w:hAnsi="Consolas"/>
+                <w:color w:val="5B2C6F"/>
+                <w:sz w:val="16"/>
+                <w:szCs w:val="16"/>
+              </w:rPr>
+              <w:t xml:space="preserve">event: status</w:t>
+            </w:r>
+            <w:r>
+              <w:rPr>
+                <w:rFonts w:ascii="Calibri" w:cs="Calibri" w:eastAsia="Calibri" w:hAnsi="Calibri"/>
+                <w:sz w:val="18"/>
+                <w:szCs w:val="18"/>
+              </w:rPr>
+              <w:t xml:space="preserve"> lines: snapshot, then Processing with progress, then Completed; stream closes</w:t>
+            </w:r>
+          </w:p>
+        </w:tc>
+        <w:tc>
+          <w:tcPr>
+            <w:tcW w:type="dxa" w:w="1847"/>
+            <w:tcBorders>
+              <w:top w:val="single" w:color="BFBFBF" w:sz="4"/>
+              <w:left w:val="single" w:color="BFBFBF" w:sz="4"/>
+              <w:bottom w:val="single" w:color="BFBFBF" w:sz="4"/>
+              <w:right w:val="single" w:color="BFBFBF" w:sz="4"/>
+            </w:tcBorders>
+            <w:tcMar>
+              <w:top w:type="dxa" w:w="60"/>
+              <w:left w:type="dxa" w:w="100"/>
+              <w:bottom w:type="dxa" w:w="60"/>
+              <w:right w:type="dxa" w:w="100"/>
+            </w:tcMar>
+          </w:tcPr>
+          <w:p>
+            <w:r>
+              <w:rPr>
+                <w:rFonts w:ascii="Calibri" w:cs="Calibri" w:eastAsia="Calibri" w:hAnsi="Calibri"/>
+                <w:sz w:val="18"/>
+                <w:szCs w:val="18"/>
+              </w:rPr>
+              <w:t xml:space="preserve">Passed (2026-10-27)</w:t>
+            </w:r>
+          </w:p>
+        </w:tc>
+      </w:tr>
+      <w:tr>
+        <w:tc>
+          <w:tcPr>
+            <w:tcW w:type="dxa" w:w="461"/>
+            <w:tcBorders>
+              <w:top w:val="single" w:color="BFBFBF" w:sz="4"/>
+              <w:left w:val="single" w:color="BFBFBF" w:sz="4"/>
+              <w:bottom w:val="single" w:color="BFBFBF" w:sz="4"/>
+              <w:right w:val="single" w:color="BFBFBF" w:sz="4"/>
+            </w:tcBorders>
+            <w:tcMar>
+              <w:top w:type="dxa" w:w="60"/>
+              <w:left w:type="dxa" w:w="100"/>
+              <w:bottom w:type="dxa" w:w="60"/>
+              <w:right w:type="dxa" w:w="100"/>
+            </w:tcMar>
+          </w:tcPr>
+          <w:p>
+            <w:r>
+              <w:rPr>
+                <w:rFonts w:ascii="Calibri" w:cs="Calibri" w:eastAsia="Calibri" w:hAnsi="Calibri"/>
+                <w:sz w:val="18"/>
+                <w:szCs w:val="18"/>
+              </w:rPr>
+              <w:t xml:space="preserve">MT-11</w:t>
+            </w:r>
+          </w:p>
+        </w:tc>
+        <w:tc>
+          <w:tcPr>
+            <w:tcW w:type="dxa" w:w="1798"/>
+            <w:tcBorders>
+              <w:top w:val="single" w:color="BFBFBF" w:sz="4"/>
+              <w:left w:val="single" w:color="BFBFBF" w:sz="4"/>
+              <w:bottom w:val="single" w:color="BFBFBF" w:sz="4"/>
+              <w:right w:val="single" w:color="BFBFBF" w:sz="4"/>
+            </w:tcBorders>
+            <w:tcMar>
+              <w:top w:type="dxa" w:w="60"/>
+              <w:left w:type="dxa" w:w="100"/>
+              <w:bottom w:type="dxa" w:w="60"/>
+              <w:right w:type="dxa" w:w="100"/>
+            </w:tcMar>
+          </w:tcPr>
+          <w:p>
+            <w:r>
+              <w:rPr>
+                <w:rFonts w:ascii="Calibri" w:cs="Calibri" w:eastAsia="Calibri" w:hAnsi="Calibri"/>
+                <w:sz w:val="18"/>
+                <w:szCs w:val="18"/>
+              </w:rPr>
+              <w:t xml:space="preserve">Logs in console and MongoDB</w:t>
+            </w:r>
+          </w:p>
+        </w:tc>
+        <w:tc>
+          <w:tcPr>
+            <w:tcW w:type="dxa" w:w="1844"/>
+            <w:tcBorders>
+              <w:top w:val="single" w:color="BFBFBF" w:sz="4"/>
+              <w:left w:val="single" w:color="BFBFBF" w:sz="4"/>
+              <w:bottom w:val="single" w:color="BFBFBF" w:sz="4"/>
+              <w:right w:val="single" w:color="BFBFBF" w:sz="4"/>
+            </w:tcBorders>
+            <w:tcMar>
+              <w:top w:type="dxa" w:w="60"/>
+              <w:left w:type="dxa" w:w="100"/>
+              <w:bottom w:type="dxa" w:w="60"/>
+              <w:right w:type="dxa" w:w="100"/>
+            </w:tcMar>
+          </w:tcPr>
+          <w:p>
+            <w:r>
+              <w:rPr>
+                <w:rFonts w:ascii="Calibri" w:cs="Calibri" w:eastAsia="Calibri" w:hAnsi="Calibri"/>
+                <w:sz w:val="18"/>
+                <w:szCs w:val="18"/>
+              </w:rPr>
+              <w:t xml:space="preserve">MT-02 passed</w:t>
+            </w:r>
+          </w:p>
+        </w:tc>
+        <w:tc>
+          <w:tcPr>
+            <w:tcW w:type="dxa" w:w="1844"/>
+            <w:tcBorders>
+              <w:top w:val="single" w:color="BFBFBF" w:sz="4"/>
+              <w:left w:val="single" w:color="BFBFBF" w:sz="4"/>
+              <w:bottom w:val="single" w:color="BFBFBF" w:sz="4"/>
+              <w:right w:val="single" w:color="BFBFBF" w:sz="4"/>
+            </w:tcBorders>
+            <w:tcMar>
+              <w:top w:type="dxa" w:w="60"/>
+              <w:left w:type="dxa" w:w="100"/>
+              <w:bottom w:type="dxa" w:w="60"/>
+              <w:right w:type="dxa" w:w="100"/>
+            </w:tcMar>
+          </w:tcPr>
+          <w:p>
+            <w:r>
+              <w:rPr>
+                <w:rFonts w:ascii="Calibri" w:cs="Calibri" w:eastAsia="Calibri" w:hAnsi="Calibri"/>
+                <w:sz w:val="18"/>
+                <w:szCs w:val="18"/>
+              </w:rPr>
+              <w:t xml:space="preserve">1) </w:t>
+            </w:r>
+            <w:r>
+              <w:rPr>
+                <w:rFonts w:ascii="Consolas" w:cs="Consolas" w:eastAsia="Consolas" w:hAnsi="Consolas"/>
+                <w:color w:val="5B2C6F"/>
+                <w:sz w:val="16"/>
+                <w:szCs w:val="16"/>
+              </w:rPr>
+              <w:t xml:space="preserve">docker compose logs --tail 50 job-service processor-service</w:t>
+            </w:r>
+            <w:r>
+              <w:rPr>
+                <w:rFonts w:ascii="Calibri" w:cs="Calibri" w:eastAsia="Calibri" w:hAnsi="Calibri"/>
+                <w:sz w:val="18"/>
+                <w:szCs w:val="18"/>
+              </w:rPr>
+              <w:t xml:space="preserve"> 2) </w:t>
+            </w:r>
+            <w:r>
+              <w:rPr>
+                <w:rFonts w:ascii="Consolas" w:cs="Consolas" w:eastAsia="Consolas" w:hAnsi="Consolas"/>
+                <w:color w:val="5B2C6F"/>
+                <w:sz w:val="16"/>
+                <w:szCs w:val="16"/>
+              </w:rPr>
+              <w:t xml:space="preserve">docker exec -it ta9-mongo-1 mongosh ta9_logs --eval "db.logs.find({jobId:'&lt;id&gt;'}).sort({timestamp:1})"</w:t>
+            </w:r>
+            <w:r>
+              <w:rPr>
+                <w:rFonts w:ascii="Calibri" w:cs="Calibri" w:eastAsia="Calibri" w:hAnsi="Calibri"/>
+                <w:sz w:val="18"/>
+                <w:szCs w:val="18"/>
+              </w:rPr>
+              <w:t xml:space="preserve"> with the job id from MT-02 3) </w:t>
+            </w:r>
+            <w:r>
+              <w:rPr>
+                <w:rFonts w:ascii="Consolas" w:cs="Consolas" w:eastAsia="Consolas" w:hAnsi="Consolas"/>
+                <w:color w:val="5B2C6F"/>
+                <w:sz w:val="16"/>
+                <w:szCs w:val="16"/>
+              </w:rPr>
+              <w:t xml:space="preserve">db.logs.find({level:'Error'})</w:t>
+            </w:r>
+          </w:p>
+        </w:tc>
+        <w:tc>
+          <w:tcPr>
+            <w:tcW w:type="dxa" w:w="1844"/>
+            <w:tcBorders>
+              <w:top w:val="single" w:color="BFBFBF" w:sz="4"/>
+              <w:left w:val="single" w:color="BFBFBF" w:sz="4"/>
+              <w:bottom w:val="single" w:color="BFBFBF" w:sz="4"/>
+              <w:right w:val="single" w:color="BFBFBF" w:sz="4"/>
+            </w:tcBorders>
+            <w:tcMar>
+              <w:top w:type="dxa" w:w="60"/>
+              <w:left w:type="dxa" w:w="100"/>
+              <w:bottom w:type="dxa" w:w="60"/>
+              <w:right w:type="dxa" w:w="100"/>
+            </w:tcMar>
+          </w:tcPr>
+          <w:p>
+            <w:r>
+              <w:rPr>
+                <w:rFonts w:ascii="Calibri" w:cs="Calibri" w:eastAsia="Calibri" w:hAnsi="Calibri"/>
+                <w:sz w:val="18"/>
+                <w:szCs w:val="18"/>
+              </w:rPr>
+              <w:t xml:space="preserve">Console shows the flow (Information); MongoDB holds Debug + Information records of all three services for the job with one </w:t>
+            </w:r>
+            <w:r>
+              <w:rPr>
+                <w:rFonts w:ascii="Consolas" w:cs="Consolas" w:eastAsia="Consolas" w:hAnsi="Consolas"/>
+                <w:color w:val="5B2C6F"/>
+                <w:sz w:val="16"/>
+                <w:szCs w:val="16"/>
+              </w:rPr>
+              <w:t xml:space="preserve">correlationId</w:t>
+            </w:r>
+            <w:r>
+              <w:rPr>
+                <w:rFonts w:ascii="Calibri" w:cs="Calibri" w:eastAsia="Calibri" w:hAnsi="Calibri"/>
+                <w:sz w:val="18"/>
+                <w:szCs w:val="18"/>
+              </w:rPr>
+              <w:t xml:space="preserve">; TTL index </w:t>
+            </w:r>
+            <w:r>
+              <w:rPr>
+                <w:rFonts w:ascii="Consolas" w:cs="Consolas" w:eastAsia="Consolas" w:hAnsi="Consolas"/>
+                <w:color w:val="5B2C6F"/>
+                <w:sz w:val="16"/>
+                <w:szCs w:val="16"/>
+              </w:rPr>
               <w:t xml:space="preserve">ttl_timestamp</w:t>
             </w:r>
             <w:r>
@@ -51251,7 +51362,101 @@
                 <w:sz w:val="18"/>
                 <w:szCs w:val="18"/>
               </w:rPr>
-              <w:t xml:space="preserve">Not yet executed</w:t>
+              <w:t xml:space="preserve">Passed (2026-10-27): console shows the Information flow; </w:t>
+            </w:r>
+            <w:r>
+              <w:rPr>
+                <w:rFonts w:ascii="Consolas" w:cs="Consolas" w:eastAsia="Consolas" w:hAnsi="Consolas"/>
+                <w:color w:val="5B2C6F"/>
+                <w:sz w:val="16"/>
+                <w:szCs w:val="16"/>
+              </w:rPr>
+              <w:t xml:space="preserve">ta9_logs.logs</w:t>
+            </w:r>
+            <w:r>
+              <w:rPr>
+                <w:rFonts w:ascii="Calibri" w:cs="Calibri" w:eastAsia="Calibri" w:hAnsi="Calibri"/>
+                <w:sz w:val="18"/>
+                <w:szCs w:val="18"/>
+              </w:rPr>
+              <w:t xml:space="preserve"> holds Debug + Information lines of job-service and processor-service for the job under one correlation id; indexes </w:t>
+            </w:r>
+            <w:r>
+              <w:rPr>
+                <w:rFonts w:ascii="Consolas" w:cs="Consolas" w:eastAsia="Consolas" w:hAnsi="Consolas"/>
+                <w:color w:val="5B2C6F"/>
+                <w:sz w:val="16"/>
+                <w:szCs w:val="16"/>
+              </w:rPr>
+              <w:t xml:space="preserve">ttl_timestamp</w:t>
+            </w:r>
+            <w:r>
+              <w:rPr>
+                <w:rFonts w:ascii="Calibri" w:cs="Calibri" w:eastAsia="Calibri" w:hAnsi="Calibri"/>
+                <w:sz w:val="18"/>
+                <w:szCs w:val="18"/>
+              </w:rPr>
+              <w:t xml:space="preserve">, </w:t>
+            </w:r>
+            <w:r>
+              <w:rPr>
+                <w:rFonts w:ascii="Consolas" w:cs="Consolas" w:eastAsia="Consolas" w:hAnsi="Consolas"/>
+                <w:color w:val="5B2C6F"/>
+                <w:sz w:val="16"/>
+                <w:szCs w:val="16"/>
+              </w:rPr>
+              <w:t xml:space="preserve">jobId_1_timestamp_1</w:t>
+            </w:r>
+            <w:r>
+              <w:rPr>
+                <w:rFonts w:ascii="Calibri" w:cs="Calibri" w:eastAsia="Calibri" w:hAnsi="Calibri"/>
+                <w:sz w:val="18"/>
+                <w:szCs w:val="18"/>
+              </w:rPr>
+              <w:t xml:space="preserve">, </w:t>
+            </w:r>
+            <w:r>
+              <w:rPr>
+                <w:rFonts w:ascii="Consolas" w:cs="Consolas" w:eastAsia="Consolas" w:hAnsi="Consolas"/>
+                <w:color w:val="5B2C6F"/>
+                <w:sz w:val="16"/>
+                <w:szCs w:val="16"/>
+              </w:rPr>
+              <w:t xml:space="preserve">correlationId_1_timestamp_1</w:t>
+            </w:r>
+            <w:r>
+              <w:rPr>
+                <w:rFonts w:ascii="Calibri" w:cs="Calibri" w:eastAsia="Calibri" w:hAnsi="Calibri"/>
+                <w:sz w:val="18"/>
+                <w:szCs w:val="18"/>
+              </w:rPr>
+              <w:t xml:space="preserve">, </w:t>
+            </w:r>
+            <w:r>
+              <w:rPr>
+                <w:rFonts w:ascii="Consolas" w:cs="Consolas" w:eastAsia="Consolas" w:hAnsi="Consolas"/>
+                <w:color w:val="5B2C6F"/>
+                <w:sz w:val="16"/>
+                <w:szCs w:val="16"/>
+              </w:rPr>
+              <w:t xml:space="preserve">level_1_timestamp_-1</w:t>
+            </w:r>
+            <w:r>
+              <w:rPr>
+                <w:rFonts w:ascii="Calibri" w:cs="Calibri" w:eastAsia="Calibri" w:hAnsi="Calibri"/>
+                <w:sz w:val="18"/>
+                <w:szCs w:val="18"/>
+              </w:rPr>
+              <w:t xml:space="preserve">, </w:t>
+            </w:r>
+            <w:r>
+              <w:rPr>
+                <w:rFonts w:ascii="Consolas" w:cs="Consolas" w:eastAsia="Consolas" w:hAnsi="Consolas"/>
+                <w:color w:val="5B2C6F"/>
+                <w:sz w:val="16"/>
+                <w:szCs w:val="16"/>
+              </w:rPr>
+              <w:t xml:space="preserve">service_1_timestamp_-1</w:t>
             </w:r>
           </w:p>
         </w:tc>

</xml_diff>

<commit_message>
test: manual MT-09 (MongoDB outage) passed
Co-Authored-By: Claude Opus 5.5 <noreply@anthropic.com>
</commit_message>
<xml_diff>
--- a/docs/testing/TA9-STD.docx
+++ b/docs/testing/TA9-STD.docx
@@ -50939,7 +50939,136 @@
                 <w:sz w:val="18"/>
                 <w:szCs w:val="18"/>
               </w:rPr>
-              <w:t xml:space="preserve">Not yet executed</w:t>
+              <w:t xml:space="preserve">Passed (2026-10-27): </w:t>
+            </w:r>
+            <w:r>
+              <w:rPr>
+                <w:rFonts w:ascii="Consolas" w:cs="Consolas" w:eastAsia="Consolas" w:hAnsi="Consolas"/>
+                <w:color w:val="5B2C6F"/>
+                <w:sz w:val="16"/>
+                <w:szCs w:val="16"/>
+              </w:rPr>
+              <w:t xml:space="preserve">docker stop</w:t>
+            </w:r>
+            <w:r>
+              <w:rPr>
+                <w:rFonts w:ascii="Calibri" w:cs="Calibri" w:eastAsia="Calibri" w:hAnsi="Calibri"/>
+                <w:sz w:val="18"/>
+                <w:szCs w:val="18"/>
+              </w:rPr>
+              <w:t xml:space="preserve"> of MongoDB → </w:t>
+            </w:r>
+            <w:r>
+              <w:rPr>
+                <w:rFonts w:ascii="Consolas" w:cs="Consolas" w:eastAsia="Consolas" w:hAnsi="Consolas"/>
+                <w:color w:val="5B2C6F"/>
+                <w:sz w:val="16"/>
+                <w:szCs w:val="16"/>
+              </w:rPr>
+              <w:t xml:space="preserve">GET /api/jobs</w:t>
+            </w:r>
+            <w:r>
+              <w:rPr>
+                <w:rFonts w:ascii="Calibri" w:cs="Calibri" w:eastAsia="Calibri" w:hAnsi="Calibri"/>
+                <w:sz w:val="18"/>
+                <w:szCs w:val="18"/>
+              </w:rPr>
+              <w:t xml:space="preserve"> 503 </w:t>
+            </w:r>
+            <w:r>
+              <w:rPr>
+                <w:rFonts w:ascii="Calibri" w:cs="Calibri" w:eastAsia="Calibri" w:hAnsi="Calibri"/>
+                <w:i/>
+                <w:iCs/>
+                <w:sz w:val="18"/>
+                <w:szCs w:val="18"/>
+              </w:rPr>
+              <w:t xml:space="preserve">Storage unavailable</w:t>
+            </w:r>
+            <w:r>
+              <w:rPr>
+                <w:rFonts w:ascii="Calibri" w:cs="Calibri" w:eastAsia="Calibri" w:hAnsi="Calibri"/>
+                <w:sz w:val="18"/>
+                <w:szCs w:val="18"/>
+              </w:rPr>
+              <w:t xml:space="preserve"> (problem+json) after 5.0–5.2 s; </w:t>
+            </w:r>
+            <w:r>
+              <w:rPr>
+                <w:rFonts w:ascii="Consolas" w:cs="Consolas" w:eastAsia="Consolas" w:hAnsi="Consolas"/>
+                <w:color w:val="5B2C6F"/>
+                <w:sz w:val="16"/>
+                <w:szCs w:val="16"/>
+              </w:rPr>
+              <w:t xml:space="preserve">/health/ready</w:t>
+            </w:r>
+            <w:r>
+              <w:rPr>
+                <w:rFonts w:ascii="Calibri" w:cs="Calibri" w:eastAsia="Calibri" w:hAnsi="Calibri"/>
+                <w:sz w:val="18"/>
+                <w:szCs w:val="18"/>
+              </w:rPr>
+              <w:t xml:space="preserve"> 503 Unhealthy; Error </w:t>
+            </w:r>
+            <w:r>
+              <w:rPr>
+                <w:rFonts w:ascii="Consolas" w:cs="Consolas" w:eastAsia="Consolas" w:hAnsi="Consolas"/>
+                <w:color w:val="5B2C6F"/>
+                <w:sz w:val="16"/>
+                <w:szCs w:val="16"/>
+              </w:rPr>
+              <w:t xml:space="preserve">Request failed: Storage unavailable</w:t>
+            </w:r>
+            <w:r>
+              <w:rPr>
+                <w:rFonts w:ascii="Calibri" w:cs="Calibri" w:eastAsia="Calibri" w:hAnsi="Calibri"/>
+                <w:sz w:val="18"/>
+                <w:szCs w:val="18"/>
+              </w:rPr>
+              <w:t xml:space="preserve"> with correlation id and </w:t>
+            </w:r>
+            <w:r>
+              <w:rPr>
+                <w:rFonts w:ascii="Consolas" w:cs="Consolas" w:eastAsia="Consolas" w:hAnsi="Consolas"/>
+                <w:color w:val="5B2C6F"/>
+                <w:sz w:val="16"/>
+                <w:szCs w:val="16"/>
+              </w:rPr>
+              <w:t xml:space="preserve">[ta9-log-sink] could not store</w:t>
+            </w:r>
+            <w:r>
+              <w:rPr>
+                <w:rFonts w:ascii="Calibri" w:cs="Calibri" w:eastAsia="Calibri" w:hAnsi="Calibri"/>
+                <w:sz w:val="18"/>
+                <w:szCs w:val="18"/>
+              </w:rPr>
+              <w:t xml:space="preserve"> on the console; after </w:t>
+            </w:r>
+            <w:r>
+              <w:rPr>
+                <w:rFonts w:ascii="Consolas" w:cs="Consolas" w:eastAsia="Consolas" w:hAnsi="Consolas"/>
+                <w:color w:val="5B2C6F"/>
+                <w:sz w:val="16"/>
+                <w:szCs w:val="16"/>
+              </w:rPr>
+              <w:t xml:space="preserve">docker start</w:t>
+            </w:r>
+            <w:r>
+              <w:rPr>
+                <w:rFonts w:ascii="Calibri" w:cs="Calibri" w:eastAsia="Calibri" w:hAnsi="Calibri"/>
+                <w:sz w:val="18"/>
+                <w:szCs w:val="18"/>
+              </w:rPr>
+              <w:t xml:space="preserve"> → 200 and Healthy; each service stored a Warning </w:t>
+            </w:r>
+            <w:r>
+              <w:rPr>
+                <w:rFonts w:ascii="Consolas" w:cs="Consolas" w:eastAsia="Consolas" w:hAnsi="Consolas"/>
+                <w:color w:val="5B2C6F"/>
+                <w:sz w:val="16"/>
+                <w:szCs w:val="16"/>
+              </w:rPr>
+              <w:t xml:space="preserve">N log events were not stored</w:t>
             </w:r>
           </w:p>
         </w:tc>

</xml_diff>